<commit_message>
Update BRD: Video KYC moves to Phase 2 with EZY Apply; add relationship follow-up
Co-Authored-By: Claude Opus 5.5 <noreply@anthropic.com>
Claude-Session: https://claude.ai/code/session_01EfL1wo9mb9p9oy7CCemWVN
</commit_message>
<xml_diff>
--- a/docs/Pan-Asia-EZY-Meet-BRD.docx
+++ b/docs/Pan-Asia-EZY-Meet-BRD.docx
@@ -33,7 +33,7 @@
     <w:p>
       <w:pPr/>
       <w:r>
-        <w:t xml:space="preserve">EZY Meet adds appointment banking to the Pan Asia EZY app. Customers book a branch visit or a video call in four taps. Branch staff manage the bookings in a branch portal. The aim is to turn unplanned walk-ins into planned visits, cut queue time, and move suitable services to video.</w:t>
+        <w:t xml:space="preserve">EZY Meet adds appointment banking to the Pan Asia EZY app. Customers book a branch visit or a video call in four taps, and branch staff manage the bookings in a branch portal. Every visit arrives with its purpose known, so staff can prepare, serve on time and use the conversation to offer the next right product. Phase 2 connects EZY Meet to EZY Apply, the digital onboarding portal, through Video KYC.</w:t>
       </w:r>
     </w:p>
     <w:tbl>
@@ -420,7 +420,7 @@
     <w:p>
       <w:pPr/>
       <w:r>
-        <w:t xml:space="preserve">EZY Meet serves the four goals in the concept deck. Each is tracked by one measure, read from booking and portal data. Numeric targets are still to be agreed with the business (see open questions).</w:t>
+        <w:t xml:space="preserve">EZY Meet serves six goals, each tracked by one measure from booking and portal data. Numeric targets are still to be agreed with the business (see open questions).</w:t>
       </w:r>
     </w:p>
     <w:tbl>
@@ -431,9 +431,9 @@
         <w:tblLook w:val="04A0" w:firstRow="1" w:lastRow="0" w:firstColumn="0" w:lastColumn="0" w:noHBand="0" w:noVBand="1"/>
       </w:tblPr>
       <w:tblGrid>
-        <w:gridCol w:w="3090"/>
-        <w:gridCol w:w="2890"/>
-        <w:gridCol w:w="3380"/>
+        <w:gridCol w:w="3022"/>
+        <w:gridCol w:w="3048"/>
+        <w:gridCol w:w="3290"/>
       </w:tblGrid>
       <w:tr>
         <w:trPr>
@@ -441,7 +441,7 @@
         </w:trPr>
         <w:tc>
           <w:tcPr>
-            <w:tcW w:w="3090" w:type="dxa"/>
+            <w:tcW w:w="3022" w:type="dxa"/>
             <w:shd w:val="clear" w:color="auto" w:fill="F2F2F2"/>
           </w:tcPr>
           <w:p>
@@ -453,7 +453,7 @@
         </w:tc>
         <w:tc>
           <w:tcPr>
-            <w:tcW w:w="2890" w:type="dxa"/>
+            <w:tcW w:w="3048" w:type="dxa"/>
             <w:shd w:val="clear" w:color="auto" w:fill="F2F2F2"/>
           </w:tcPr>
           <w:p>
@@ -465,7 +465,7 @@
         </w:tc>
         <w:tc>
           <w:tcPr>
-            <w:tcW w:w="3380" w:type="dxa"/>
+            <w:tcW w:w="3290" w:type="dxa"/>
             <w:shd w:val="clear" w:color="auto" w:fill="F2F2F2"/>
           </w:tcPr>
           <w:p>
@@ -479,7 +479,7 @@
       <w:tr>
         <w:tc>
           <w:tcPr>
-            <w:tcW w:w="3090" w:type="dxa"/>
+            <w:tcW w:w="3022" w:type="dxa"/>
           </w:tcPr>
           <w:p>
             <w:pPr/>
@@ -490,7 +490,7 @@
         </w:tc>
         <w:tc>
           <w:tcPr>
-            <w:tcW w:w="2890" w:type="dxa"/>
+            <w:tcW w:w="3048" w:type="dxa"/>
           </w:tcPr>
           <w:p>
             <w:pPr/>
@@ -501,7 +501,7 @@
         </w:tc>
         <w:tc>
           <w:tcPr>
-            <w:tcW w:w="3380" w:type="dxa"/>
+            <w:tcW w:w="3290" w:type="dxa"/>
           </w:tcPr>
           <w:p>
             <w:pPr/>
@@ -514,7 +514,77 @@
       <w:tr>
         <w:tc>
           <w:tcPr>
-            <w:tcW w:w="3090" w:type="dxa"/>
+            <w:tcW w:w="3022" w:type="dxa"/>
+          </w:tcPr>
+          <w:p>
+            <w:pPr/>
+            <w:r>
+              <w:t xml:space="preserve">Turn every visit into a relationship conversation</w:t>
+            </w:r>
+          </w:p>
+        </w:tc>
+        <w:tc>
+          <w:tcPr>
+            <w:tcW w:w="3048" w:type="dxa"/>
+          </w:tcPr>
+          <w:p>
+            <w:pPr/>
+            <w:r>
+              <w:t xml:space="preserve">Follow-up leads per 100 visits; products per customer 90 days after a visit</w:t>
+            </w:r>
+          </w:p>
+        </w:tc>
+        <w:tc>
+          <w:tcPr>
+            <w:tcW w:w="3290" w:type="dxa"/>
+          </w:tcPr>
+          <w:p>
+            <w:pPr/>
+            <w:r>
+              <w:t xml:space="preserve">Leads recorded in the portal; core banking product count</w:t>
+            </w:r>
+          </w:p>
+        </w:tc>
+      </w:tr>
+      <w:tr>
+        <w:tc>
+          <w:tcPr>
+            <w:tcW w:w="3022" w:type="dxa"/>
+          </w:tcPr>
+          <w:p>
+            <w:pPr/>
+            <w:r>
+              <w:t xml:space="preserve">Make it easy to open new accounts and facilities</w:t>
+            </w:r>
+          </w:p>
+        </w:tc>
+        <w:tc>
+          <w:tcPr>
+            <w:tcW w:w="3048" w:type="dxa"/>
+          </w:tcPr>
+          <w:p>
+            <w:pPr/>
+            <w:r>
+              <w:t xml:space="preserve">Accounts and facilities opened from appointments</w:t>
+            </w:r>
+          </w:p>
+        </w:tc>
+        <w:tc>
+          <w:tcPr>
+            <w:tcW w:w="3290" w:type="dxa"/>
+          </w:tcPr>
+          <w:p>
+            <w:pPr/>
+            <w:r>
+              <w:t xml:space="preserve">Account-opening and credit bookings that end in a new account or facility</w:t>
+            </w:r>
+          </w:p>
+        </w:tc>
+      </w:tr>
+      <w:tr>
+        <w:tc>
+          <w:tcPr>
+            <w:tcW w:w="3022" w:type="dxa"/>
           </w:tcPr>
           <w:p>
             <w:pPr/>
@@ -525,7 +595,7 @@
         </w:tc>
         <w:tc>
           <w:tcPr>
-            <w:tcW w:w="2890" w:type="dxa"/>
+            <w:tcW w:w="3048" w:type="dxa"/>
           </w:tcPr>
           <w:p>
             <w:pPr/>
@@ -536,7 +606,7 @@
         </w:tc>
         <w:tc>
           <w:tcPr>
-            <w:tcW w:w="3380" w:type="dxa"/>
+            <w:tcW w:w="3290" w:type="dxa"/>
           </w:tcPr>
           <w:p>
             <w:pPr/>
@@ -549,7 +619,7 @@
       <w:tr>
         <w:tc>
           <w:tcPr>
-            <w:tcW w:w="3090" w:type="dxa"/>
+            <w:tcW w:w="3022" w:type="dxa"/>
           </w:tcPr>
           <w:p>
             <w:pPr/>
@@ -560,7 +630,7 @@
         </w:tc>
         <w:tc>
           <w:tcPr>
-            <w:tcW w:w="2890" w:type="dxa"/>
+            <w:tcW w:w="3048" w:type="dxa"/>
           </w:tcPr>
           <w:p>
             <w:pPr/>
@@ -571,7 +641,7 @@
         </w:tc>
         <w:tc>
           <w:tcPr>
-            <w:tcW w:w="3380" w:type="dxa"/>
+            <w:tcW w:w="3290" w:type="dxa"/>
           </w:tcPr>
           <w:p>
             <w:pPr/>
@@ -584,7 +654,7 @@
       <w:tr>
         <w:tc>
           <w:tcPr>
-            <w:tcW w:w="3090" w:type="dxa"/>
+            <w:tcW w:w="3022" w:type="dxa"/>
           </w:tcPr>
           <w:p>
             <w:pPr/>
@@ -595,7 +665,7 @@
         </w:tc>
         <w:tc>
           <w:tcPr>
-            <w:tcW w:w="2890" w:type="dxa"/>
+            <w:tcW w:w="3048" w:type="dxa"/>
           </w:tcPr>
           <w:p>
             <w:pPr/>
@@ -606,47 +676,12 @@
         </w:tc>
         <w:tc>
           <w:tcPr>
-            <w:tcW w:w="3380" w:type="dxa"/>
+            <w:tcW w:w="3290" w:type="dxa"/>
           </w:tcPr>
           <w:p>
             <w:pPr/>
             <w:r>
               <w:t xml:space="preserve">Booked ÷ offered slots; No-show ÷ booked</w:t>
-            </w:r>
-          </w:p>
-        </w:tc>
-      </w:tr>
-      <w:tr>
-        <w:tc>
-          <w:tcPr>
-            <w:tcW w:w="3090" w:type="dxa"/>
-          </w:tcPr>
-          <w:p>
-            <w:pPr/>
-            <w:r>
-              <w:t xml:space="preserve">Move suitable work to video</w:t>
-            </w:r>
-          </w:p>
-        </w:tc>
-        <w:tc>
-          <w:tcPr>
-            <w:tcW w:w="2890" w:type="dxa"/>
-          </w:tcPr>
-          <w:p>
-            <w:pPr/>
-            <w:r>
-              <w:t xml:space="preserve">Share of eligible services done by video</w:t>
-            </w:r>
-          </w:p>
-        </w:tc>
-        <w:tc>
-          <w:tcPr>
-            <w:tcW w:w="3380" w:type="dxa"/>
-          </w:tcPr>
-          <w:p>
-            <w:pPr/>
-            <w:r>
-              <w:t xml:space="preserve">Video bookings ÷ bookings for branch-or-video services</w:t>
             </w:r>
           </w:p>
         </w:tc>
@@ -696,7 +731,7 @@
         </w:numPr>
       </w:pPr>
       <w:r>
-        <w:t xml:space="preserve">Branch-visit booking with smart branch recommendation, for 41 services (42 including Video KYC).</w:t>
+        <w:t xml:space="preserve">Branch-visit booking with smart branch recommendation, for 41 services.</w:t>
       </w:r>
     </w:p>
     <w:p>
@@ -708,7 +743,7 @@
         </w:numPr>
       </w:pPr>
       <w:r>
-        <w:t xml:space="preserve">Video-call booking, instant "talk to an advisor now", and Video KYC with document upload.</w:t>
+        <w:t xml:space="preserve">Video-call booking and instant "talk to an advisor now" for advisory services.</w:t>
       </w:r>
     </w:p>
     <w:p>
@@ -744,7 +779,7 @@
         </w:numPr>
       </w:pPr>
       <w:r>
-        <w:t xml:space="preserve">Branch portal: today's queue, check-in, schedule, video desk, slots and capacity.</w:t>
+        <w:t xml:space="preserve">Branch portal: today's queue, check-in, schedule, video desk, slots and capacity, and follow-up leads after each visit.</w:t>
       </w:r>
     </w:p>
     <w:p>
@@ -790,6 +825,111 @@
       </w:pPr>
       <w:r>
         <w:t xml:space="preserve">Head-office analytics dashboards (later release).</w:t>
+      </w:r>
+    </w:p>
+    <w:p>
+      <w:pPr/>
+      <w:r>
+        <w:rPr>
+          <w:b/>
+        </w:rPr>
+        <w:t xml:space="preserve">Phase 2 — Video KYC with EZY Apply</w:t>
+      </w:r>
+    </w:p>
+    <w:p>
+      <w:pPr>
+        <w:pStyle w:val="ListParagraph"/>
+        <w:numPr>
+          <w:ilvl w:val="0"/>
+          <w:numId w:val="4"/>
+        </w:numPr>
+      </w:pPr>
+      <w:r>
+        <w:t xml:space="preserve">Video KYC is delivered with EZY Apply, the bank's digital onboarding portal, not as a stand-alone EZY Meet service.</w:t>
+      </w:r>
+    </w:p>
+    <w:p>
+      <w:pPr>
+        <w:pStyle w:val="ListParagraph"/>
+        <w:numPr>
+          <w:ilvl w:val="0"/>
+          <w:numId w:val="4"/>
+        </w:numPr>
+      </w:pPr>
+      <w:r>
+        <w:t xml:space="preserve">An EZY Apply applicant who reaches the identity step books a Video KYC slot, or joins a live advisor, using the EZY Meet slot engine and video desk.</w:t>
+      </w:r>
+    </w:p>
+    <w:p>
+      <w:pPr>
+        <w:pStyle w:val="ListParagraph"/>
+        <w:numPr>
+          <w:ilvl w:val="0"/>
+          <w:numId w:val="4"/>
+        </w:numPr>
+      </w:pPr>
+      <w:r>
+        <w:t xml:space="preserve">If Video KYC cannot be completed, the applicant books a branch visit through EZY Meet with the application reference attached.</w:t>
+      </w:r>
+    </w:p>
+    <w:p>
+      <w:pPr>
+        <w:pStyle w:val="ListParagraph"/>
+        <w:numPr>
+          <w:ilvl w:val="0"/>
+          <w:numId w:val="4"/>
+        </w:numPr>
+      </w:pPr>
+      <w:r>
+        <w:t xml:space="preserve">Once the account is opened, the new customer is invited to the EZY app, where EZY Meet is ready for their next visit.</w:t>
+      </w:r>
+    </w:p>
+    <w:p>
+      <w:pPr/>
+      <w:r>
+        <w:drawing>
+          <wp:inline distT="0" distB="0" distL="0" distR="0">
+            <wp:extent cx="5486400" cy="1983921"/>
+            <wp:docPr id="1" name="image1" descr="Phase 2 flow · EZY Apply to account, by video or at a branch"/>
+            <a:graphic xmlns:a="http://schemas.openxmlformats.org/drawingml/2006/main">
+              <a:graphicData uri="http://schemas.openxmlformats.org/drawingml/2006/picture">
+                <pic:pic xmlns:pic="http://schemas.openxmlformats.org/drawingml/2006/picture">
+                  <pic:nvPicPr>
+                    <pic:cNvPr id="1" name="image1" descr="Phase 2 flow · EZY Apply to account, by video or at a branch"/>
+                    <pic:cNvPicPr/>
+                  </pic:nvPicPr>
+                  <pic:blipFill>
+                    <a:blip r:embed="rId5"/>
+                    <a:stretch>
+                      <a:fillRect/>
+                    </a:stretch>
+                  </pic:blipFill>
+                  <pic:spPr>
+                    <a:xfrm>
+                      <a:off x="0" y="0"/>
+                      <a:ext cx="5486400" cy="1983921"/>
+                    </a:xfrm>
+                    <a:prstGeom prst="rect">
+                      <a:avLst/>
+                    </a:prstGeom>
+                  </pic:spPr>
+                </pic:pic>
+              </a:graphicData>
+            </a:graphic>
+          </wp:inline>
+        </w:drawing>
+      </w:r>
+    </w:p>
+    <w:p>
+      <w:pPr/>
+      <w:r>
+        <w:t xml:space="preserve">Phase 2 flow · EZY Apply to account, by video or at a branch</w:t>
+      </w:r>
+    </w:p>
+    <w:p>
+      <w:pPr/>
+      <w:r>
+        <w:t xml:space="preserve">A failed Video KYC never ends the application: the applicant is booked into a branch, and every new account lands in the EZY app with EZY Meet ready.</w:t>
       </w:r>
     </w:p>
     <w:p>
@@ -1093,7 +1233,7 @@
           <w:p>
             <w:pPr/>
             <w:r>
-              <w:t xml:space="preserve">CBSL KYC/CDD rules, consent, record keeping</w:t>
+              <w:t xml:space="preserve">Consent for follow-up, record keeping; Phase 2 Video KYC under CBSL KYC/CDD rules</w:t>
             </w:r>
           </w:p>
         </w:tc>
@@ -1153,7 +1293,7 @@
         <w:pStyle w:val="ListParagraph"/>
         <w:numPr>
           <w:ilvl w:val="0"/>
-          <w:numId w:val="4"/>
+          <w:numId w:val="5"/>
         </w:numPr>
       </w:pPr>
       <w:r>
@@ -1171,7 +1311,7 @@
         <w:pStyle w:val="ListParagraph"/>
         <w:numPr>
           <w:ilvl w:val="0"/>
-          <w:numId w:val="4"/>
+          <w:numId w:val="5"/>
         </w:numPr>
       </w:pPr>
       <w:r>
@@ -1189,7 +1329,7 @@
         <w:pStyle w:val="ListParagraph"/>
         <w:numPr>
           <w:ilvl w:val="0"/>
-          <w:numId w:val="4"/>
+          <w:numId w:val="5"/>
         </w:numPr>
       </w:pPr>
       <w:r>
@@ -1207,7 +1347,7 @@
         <w:pStyle w:val="ListParagraph"/>
         <w:numPr>
           <w:ilvl w:val="0"/>
-          <w:numId w:val="4"/>
+          <w:numId w:val="5"/>
         </w:numPr>
       </w:pPr>
       <w:r>
@@ -1225,7 +1365,7 @@
         <w:pStyle w:val="ListParagraph"/>
         <w:numPr>
           <w:ilvl w:val="0"/>
-          <w:numId w:val="4"/>
+          <w:numId w:val="5"/>
         </w:numPr>
       </w:pPr>
       <w:r>
@@ -1243,7 +1383,7 @@
         <w:pStyle w:val="ListParagraph"/>
         <w:numPr>
           <w:ilvl w:val="0"/>
-          <w:numId w:val="4"/>
+          <w:numId w:val="5"/>
         </w:numPr>
       </w:pPr>
       <w:r>
@@ -1262,57 +1402,12 @@
         <w:drawing>
           <wp:inline distT="0" distB="0" distL="0" distR="0">
             <wp:extent cx="5486400" cy="3866307"/>
-            <wp:docPr id="1" name="image1" descr="Home, service list, recommended branch"/>
+            <wp:docPr id="2" name="image2" descr="Home, service list, recommended branch"/>
             <a:graphic xmlns:a="http://schemas.openxmlformats.org/drawingml/2006/main">
               <a:graphicData uri="http://schemas.openxmlformats.org/drawingml/2006/picture">
                 <pic:pic xmlns:pic="http://schemas.openxmlformats.org/drawingml/2006/picture">
                   <pic:nvPicPr>
-                    <pic:cNvPr id="1" name="image1" descr="Home, service list, recommended branch"/>
-                    <pic:cNvPicPr/>
-                  </pic:nvPicPr>
-                  <pic:blipFill>
-                    <a:blip r:embed="rId5"/>
-                    <a:stretch>
-                      <a:fillRect/>
-                    </a:stretch>
-                  </pic:blipFill>
-                  <pic:spPr>
-                    <a:xfrm>
-                      <a:off x="0" y="0"/>
-                      <a:ext cx="5486400" cy="3866307"/>
-                    </a:xfrm>
-                    <a:prstGeom prst="rect">
-                      <a:avLst/>
-                    </a:prstGeom>
-                  </pic:spPr>
-                </pic:pic>
-              </a:graphicData>
-            </a:graphic>
-          </wp:inline>
-        </w:drawing>
-      </w:r>
-    </w:p>
-    <w:p>
-      <w:pPr/>
-      <w:r>
-        <w:rPr>
-          <w:i/>
-        </w:rPr>
-        <w:t xml:space="preserve">Home with the EZY Meet widget · service list · smart recommendation</w:t>
-      </w:r>
-    </w:p>
-    <w:p>
-      <w:pPr/>
-      <w:r>
-        <w:drawing>
-          <wp:inline distT="0" distB="0" distL="0" distR="0">
-            <wp:extent cx="5486400" cy="3866307"/>
-            <wp:docPr id="2" name="image2" descr="Time, confirm, confirmation"/>
-            <a:graphic xmlns:a="http://schemas.openxmlformats.org/drawingml/2006/main">
-              <a:graphicData uri="http://schemas.openxmlformats.org/drawingml/2006/picture">
-                <pic:pic xmlns:pic="http://schemas.openxmlformats.org/drawingml/2006/picture">
-                  <pic:nvPicPr>
-                    <pic:cNvPr id="2" name="image2" descr="Time, confirm, confirmation"/>
+                    <pic:cNvPr id="2" name="image2" descr="Home, service list, recommended branch"/>
                     <pic:cNvPicPr/>
                   </pic:nvPicPr>
                   <pic:blipFill>
@@ -1343,6 +1438,51 @@
         <w:rPr>
           <w:i/>
         </w:rPr>
+        <w:t xml:space="preserve">Home with the EZY Meet widget · service list · smart recommendation</w:t>
+      </w:r>
+    </w:p>
+    <w:p>
+      <w:pPr/>
+      <w:r>
+        <w:drawing>
+          <wp:inline distT="0" distB="0" distL="0" distR="0">
+            <wp:extent cx="5486400" cy="3866307"/>
+            <wp:docPr id="3" name="image3" descr="Time, confirm, confirmation"/>
+            <a:graphic xmlns:a="http://schemas.openxmlformats.org/drawingml/2006/main">
+              <a:graphicData uri="http://schemas.openxmlformats.org/drawingml/2006/picture">
+                <pic:pic xmlns:pic="http://schemas.openxmlformats.org/drawingml/2006/picture">
+                  <pic:nvPicPr>
+                    <pic:cNvPr id="3" name="image3" descr="Time, confirm, confirmation"/>
+                    <pic:cNvPicPr/>
+                  </pic:nvPicPr>
+                  <pic:blipFill>
+                    <a:blip r:embed="rId7"/>
+                    <a:stretch>
+                      <a:fillRect/>
+                    </a:stretch>
+                  </pic:blipFill>
+                  <pic:spPr>
+                    <a:xfrm>
+                      <a:off x="0" y="0"/>
+                      <a:ext cx="5486400" cy="3866307"/>
+                    </a:xfrm>
+                    <a:prstGeom prst="rect">
+                      <a:avLst/>
+                    </a:prstGeom>
+                  </pic:spPr>
+                </pic:pic>
+              </a:graphicData>
+            </a:graphic>
+          </wp:inline>
+        </w:drawing>
+      </w:r>
+    </w:p>
+    <w:p>
+      <w:pPr/>
+      <w:r>
+        <w:rPr>
+          <w:i/>
+        </w:rPr>
         <w:t xml:space="preserve">Optional time picker · confirm sheet · confirmation with QR code</w:t>
       </w:r>
     </w:p>
@@ -1364,16 +1504,16 @@
         <w:drawing>
           <wp:inline distT="0" distB="0" distL="0" distR="0">
             <wp:extent cx="5486400" cy="5742122"/>
-            <wp:docPr id="3" name="image3" descr="Upcoming appointment and its actions"/>
+            <wp:docPr id="4" name="image4" descr="Upcoming appointment and its actions"/>
             <a:graphic xmlns:a="http://schemas.openxmlformats.org/drawingml/2006/main">
               <a:graphicData uri="http://schemas.openxmlformats.org/drawingml/2006/picture">
                 <pic:pic xmlns:pic="http://schemas.openxmlformats.org/drawingml/2006/picture">
                   <pic:nvPicPr>
-                    <pic:cNvPr id="3" name="image3" descr="Upcoming appointment and its actions"/>
+                    <pic:cNvPr id="4" name="image4" descr="Upcoming appointment and its actions"/>
                     <pic:cNvPicPr/>
                   </pic:nvPicPr>
                   <pic:blipFill>
-                    <a:blip r:embed="rId7"/>
+                    <a:blip r:embed="rId8"/>
                     <a:stretch>
                       <a:fillRect/>
                     </a:stretch>
@@ -1403,7 +1543,7 @@
         <w:t xml:space="preserve">Video calls.</w:t>
       </w:r>
       <w:r>
-        <w:t xml:space="preserve"> The Video Call tab offers "talk to an advisor now", Video KYC, and every service that can be done by video. A video booking is date, time and Confirm. Video KYC adds optional document uploads before the call.</w:t>
+        <w:t xml:space="preserve"> The Video Call tab offers "talk to an advisor now" and every service that can be done by video. A video booking is date, time and Confirm. The prototype also shows the Phase 2 Video KYC booking with document upload, which will be reached from EZY Apply.</w:t>
       </w:r>
     </w:p>
     <w:p>
@@ -1412,16 +1552,16 @@
         <w:drawing>
           <wp:inline distT="0" distB="0" distL="0" distR="0">
             <wp:extent cx="5486400" cy="3866307"/>
-            <wp:docPr id="4" name="image4" descr="Video tab, Video KYC booking, video call"/>
+            <wp:docPr id="5" name="image5" descr="Video tab, Video KYC booking, video call"/>
             <a:graphic xmlns:a="http://schemas.openxmlformats.org/drawingml/2006/main">
               <a:graphicData uri="http://schemas.openxmlformats.org/drawingml/2006/picture">
                 <pic:pic xmlns:pic="http://schemas.openxmlformats.org/drawingml/2006/picture">
                   <pic:nvPicPr>
-                    <pic:cNvPr id="4" name="image4" descr="Video tab, Video KYC booking, video call"/>
+                    <pic:cNvPr id="5" name="image5" descr="Video tab, Video KYC booking, video call"/>
                     <pic:cNvPicPr/>
                   </pic:nvPicPr>
                   <pic:blipFill>
-                    <a:blip r:embed="rId8"/>
+                    <a:blip r:embed="rId9"/>
                     <a:stretch>
                       <a:fillRect/>
                     </a:stretch>
@@ -1443,6 +1583,15 @@
       </w:r>
     </w:p>
     <w:p>
+      <w:pPr/>
+      <w:r>
+        <w:rPr>
+          <w:i/>
+        </w:rPr>
+        <w:t xml:space="preserve">Video Call tab · Video KYC booking (Phase 2, via EZY Apply) · video call</w:t>
+      </w:r>
+    </w:p>
+    <w:p>
       <w:pPr>
         <w:pStyle w:val="Heading2"/>
       </w:pPr>
@@ -1464,9 +1613,9 @@
         <w:tblLook w:val="04A0" w:firstRow="1" w:lastRow="0" w:firstColumn="0" w:lastColumn="0" w:noHBand="0" w:noVBand="1"/>
       </w:tblPr>
       <w:tblGrid>
-        <w:gridCol w:w="2795"/>
-        <w:gridCol w:w="3357"/>
-        <w:gridCol w:w="1859"/>
+        <w:gridCol w:w="2874"/>
+        <w:gridCol w:w="3453"/>
+        <w:gridCol w:w="1684"/>
         <w:gridCol w:w="1349"/>
       </w:tblGrid>
       <w:tr>
@@ -1475,7 +1624,7 @@
         </w:trPr>
         <w:tc>
           <w:tcPr>
-            <w:tcW w:w="2795" w:type="dxa"/>
+            <w:tcW w:w="2874" w:type="dxa"/>
             <w:shd w:val="clear" w:color="auto" w:fill="F2F2F2"/>
           </w:tcPr>
           <w:p>
@@ -1487,7 +1636,7 @@
         </w:tc>
         <w:tc>
           <w:tcPr>
-            <w:tcW w:w="3357" w:type="dxa"/>
+            <w:tcW w:w="3453" w:type="dxa"/>
             <w:shd w:val="clear" w:color="auto" w:fill="F2F2F2"/>
           </w:tcPr>
           <w:p>
@@ -1499,7 +1648,7 @@
         </w:tc>
         <w:tc>
           <w:tcPr>
-            <w:tcW w:w="1859" w:type="dxa"/>
+            <w:tcW w:w="1684" w:type="dxa"/>
             <w:shd w:val="clear" w:color="auto" w:fill="F2F2F2"/>
           </w:tcPr>
           <w:p>
@@ -1525,7 +1674,7 @@
       <w:tr>
         <w:tc>
           <w:tcPr>
-            <w:tcW w:w="2795" w:type="dxa"/>
+            <w:tcW w:w="2874" w:type="dxa"/>
           </w:tcPr>
           <w:p>
             <w:pPr/>
@@ -1536,7 +1685,7 @@
         </w:tc>
         <w:tc>
           <w:tcPr>
-            <w:tcW w:w="3357" w:type="dxa"/>
+            <w:tcW w:w="3453" w:type="dxa"/>
           </w:tcPr>
           <w:p>
             <w:pPr/>
@@ -1547,7 +1696,7 @@
         </w:tc>
         <w:tc>
           <w:tcPr>
-            <w:tcW w:w="1859" w:type="dxa"/>
+            <w:tcW w:w="1684" w:type="dxa"/>
           </w:tcPr>
           <w:p>
             <w:pPr/>
@@ -1571,7 +1720,7 @@
       <w:tr>
         <w:tc>
           <w:tcPr>
-            <w:tcW w:w="2795" w:type="dxa"/>
+            <w:tcW w:w="2874" w:type="dxa"/>
           </w:tcPr>
           <w:p>
             <w:pPr/>
@@ -1582,7 +1731,7 @@
         </w:tc>
         <w:tc>
           <w:tcPr>
-            <w:tcW w:w="3357" w:type="dxa"/>
+            <w:tcW w:w="3453" w:type="dxa"/>
           </w:tcPr>
           <w:p>
             <w:pPr/>
@@ -1593,7 +1742,7 @@
         </w:tc>
         <w:tc>
           <w:tcPr>
-            <w:tcW w:w="1859" w:type="dxa"/>
+            <w:tcW w:w="1684" w:type="dxa"/>
           </w:tcPr>
           <w:p>
             <w:pPr/>
@@ -1617,7 +1766,7 @@
       <w:tr>
         <w:tc>
           <w:tcPr>
-            <w:tcW w:w="2795" w:type="dxa"/>
+            <w:tcW w:w="2874" w:type="dxa"/>
           </w:tcPr>
           <w:p>
             <w:pPr/>
@@ -1628,7 +1777,7 @@
         </w:tc>
         <w:tc>
           <w:tcPr>
-            <w:tcW w:w="3357" w:type="dxa"/>
+            <w:tcW w:w="3453" w:type="dxa"/>
           </w:tcPr>
           <w:p>
             <w:pPr/>
@@ -1639,7 +1788,7 @@
         </w:tc>
         <w:tc>
           <w:tcPr>
-            <w:tcW w:w="1859" w:type="dxa"/>
+            <w:tcW w:w="1684" w:type="dxa"/>
           </w:tcPr>
           <w:p>
             <w:pPr/>
@@ -1663,7 +1812,7 @@
       <w:tr>
         <w:tc>
           <w:tcPr>
-            <w:tcW w:w="2795" w:type="dxa"/>
+            <w:tcW w:w="2874" w:type="dxa"/>
           </w:tcPr>
           <w:p>
             <w:pPr/>
@@ -1674,7 +1823,7 @@
         </w:tc>
         <w:tc>
           <w:tcPr>
-            <w:tcW w:w="3357" w:type="dxa"/>
+            <w:tcW w:w="3453" w:type="dxa"/>
           </w:tcPr>
           <w:p>
             <w:pPr/>
@@ -1685,7 +1834,7 @@
         </w:tc>
         <w:tc>
           <w:tcPr>
-            <w:tcW w:w="1859" w:type="dxa"/>
+            <w:tcW w:w="1684" w:type="dxa"/>
           </w:tcPr>
           <w:p>
             <w:pPr/>
@@ -1709,7 +1858,7 @@
       <w:tr>
         <w:tc>
           <w:tcPr>
-            <w:tcW w:w="2795" w:type="dxa"/>
+            <w:tcW w:w="2874" w:type="dxa"/>
           </w:tcPr>
           <w:p>
             <w:pPr/>
@@ -1720,7 +1869,7 @@
         </w:tc>
         <w:tc>
           <w:tcPr>
-            <w:tcW w:w="3357" w:type="dxa"/>
+            <w:tcW w:w="3453" w:type="dxa"/>
           </w:tcPr>
           <w:p>
             <w:pPr/>
@@ -1731,7 +1880,7 @@
         </w:tc>
         <w:tc>
           <w:tcPr>
-            <w:tcW w:w="1859" w:type="dxa"/>
+            <w:tcW w:w="1684" w:type="dxa"/>
           </w:tcPr>
           <w:p>
             <w:pPr/>
@@ -1755,7 +1904,7 @@
       <w:tr>
         <w:tc>
           <w:tcPr>
-            <w:tcW w:w="2795" w:type="dxa"/>
+            <w:tcW w:w="2874" w:type="dxa"/>
           </w:tcPr>
           <w:p>
             <w:pPr/>
@@ -1766,7 +1915,7 @@
         </w:tc>
         <w:tc>
           <w:tcPr>
-            <w:tcW w:w="3357" w:type="dxa"/>
+            <w:tcW w:w="3453" w:type="dxa"/>
           </w:tcPr>
           <w:p>
             <w:pPr/>
@@ -1777,7 +1926,7 @@
         </w:tc>
         <w:tc>
           <w:tcPr>
-            <w:tcW w:w="1859" w:type="dxa"/>
+            <w:tcW w:w="1684" w:type="dxa"/>
           </w:tcPr>
           <w:p>
             <w:pPr/>
@@ -1801,7 +1950,7 @@
       <w:tr>
         <w:tc>
           <w:tcPr>
-            <w:tcW w:w="2795" w:type="dxa"/>
+            <w:tcW w:w="2874" w:type="dxa"/>
           </w:tcPr>
           <w:p>
             <w:pPr/>
@@ -1812,7 +1961,7 @@
         </w:tc>
         <w:tc>
           <w:tcPr>
-            <w:tcW w:w="3357" w:type="dxa"/>
+            <w:tcW w:w="3453" w:type="dxa"/>
           </w:tcPr>
           <w:p>
             <w:pPr/>
@@ -1823,7 +1972,7 @@
         </w:tc>
         <w:tc>
           <w:tcPr>
-            <w:tcW w:w="1859" w:type="dxa"/>
+            <w:tcW w:w="1684" w:type="dxa"/>
           </w:tcPr>
           <w:p>
             <w:pPr/>
@@ -1847,7 +1996,7 @@
       <w:tr>
         <w:tc>
           <w:tcPr>
-            <w:tcW w:w="2795" w:type="dxa"/>
+            <w:tcW w:w="2874" w:type="dxa"/>
           </w:tcPr>
           <w:p>
             <w:pPr/>
@@ -1858,7 +2007,7 @@
         </w:tc>
         <w:tc>
           <w:tcPr>
-            <w:tcW w:w="3357" w:type="dxa"/>
+            <w:tcW w:w="3453" w:type="dxa"/>
           </w:tcPr>
           <w:p>
             <w:pPr/>
@@ -1869,7 +2018,7 @@
         </w:tc>
         <w:tc>
           <w:tcPr>
-            <w:tcW w:w="1859" w:type="dxa"/>
+            <w:tcW w:w="1684" w:type="dxa"/>
           </w:tcPr>
           <w:p>
             <w:pPr/>
@@ -1893,7 +2042,7 @@
       <w:tr>
         <w:tc>
           <w:tcPr>
-            <w:tcW w:w="2795" w:type="dxa"/>
+            <w:tcW w:w="2874" w:type="dxa"/>
           </w:tcPr>
           <w:p>
             <w:pPr/>
@@ -1904,7 +2053,7 @@
         </w:tc>
         <w:tc>
           <w:tcPr>
-            <w:tcW w:w="3357" w:type="dxa"/>
+            <w:tcW w:w="3453" w:type="dxa"/>
           </w:tcPr>
           <w:p>
             <w:pPr/>
@@ -1915,7 +2064,7 @@
         </w:tc>
         <w:tc>
           <w:tcPr>
-            <w:tcW w:w="1859" w:type="dxa"/>
+            <w:tcW w:w="1684" w:type="dxa"/>
           </w:tcPr>
           <w:p>
             <w:pPr/>
@@ -1939,7 +2088,7 @@
       <w:tr>
         <w:tc>
           <w:tcPr>
-            <w:tcW w:w="2795" w:type="dxa"/>
+            <w:tcW w:w="2874" w:type="dxa"/>
           </w:tcPr>
           <w:p>
             <w:pPr/>
@@ -1950,7 +2099,7 @@
         </w:tc>
         <w:tc>
           <w:tcPr>
-            <w:tcW w:w="3357" w:type="dxa"/>
+            <w:tcW w:w="3453" w:type="dxa"/>
           </w:tcPr>
           <w:p>
             <w:pPr/>
@@ -1961,7 +2110,7 @@
         </w:tc>
         <w:tc>
           <w:tcPr>
-            <w:tcW w:w="1859" w:type="dxa"/>
+            <w:tcW w:w="1684" w:type="dxa"/>
           </w:tcPr>
           <w:p>
             <w:pPr/>
@@ -1985,7 +2134,7 @@
       <w:tr>
         <w:tc>
           <w:tcPr>
-            <w:tcW w:w="2795" w:type="dxa"/>
+            <w:tcW w:w="2874" w:type="dxa"/>
           </w:tcPr>
           <w:p>
             <w:pPr/>
@@ -1996,7 +2145,7 @@
         </w:tc>
         <w:tc>
           <w:tcPr>
-            <w:tcW w:w="3357" w:type="dxa"/>
+            <w:tcW w:w="3453" w:type="dxa"/>
           </w:tcPr>
           <w:p>
             <w:pPr/>
@@ -2007,7 +2156,7 @@
         </w:tc>
         <w:tc>
           <w:tcPr>
-            <w:tcW w:w="1859" w:type="dxa"/>
+            <w:tcW w:w="1684" w:type="dxa"/>
           </w:tcPr>
           <w:p>
             <w:pPr/>
@@ -2031,7 +2180,7 @@
       <w:tr>
         <w:tc>
           <w:tcPr>
-            <w:tcW w:w="2795" w:type="dxa"/>
+            <w:tcW w:w="2874" w:type="dxa"/>
           </w:tcPr>
           <w:p>
             <w:pPr/>
@@ -2042,7 +2191,7 @@
         </w:tc>
         <w:tc>
           <w:tcPr>
-            <w:tcW w:w="3357" w:type="dxa"/>
+            <w:tcW w:w="3453" w:type="dxa"/>
           </w:tcPr>
           <w:p>
             <w:pPr/>
@@ -2053,7 +2202,7 @@
         </w:tc>
         <w:tc>
           <w:tcPr>
-            <w:tcW w:w="1859" w:type="dxa"/>
+            <w:tcW w:w="1684" w:type="dxa"/>
           </w:tcPr>
           <w:p>
             <w:pPr/>
@@ -2077,7 +2226,7 @@
       <w:tr>
         <w:tc>
           <w:tcPr>
-            <w:tcW w:w="2795" w:type="dxa"/>
+            <w:tcW w:w="2874" w:type="dxa"/>
           </w:tcPr>
           <w:p>
             <w:pPr/>
@@ -2088,7 +2237,7 @@
         </w:tc>
         <w:tc>
           <w:tcPr>
-            <w:tcW w:w="3357" w:type="dxa"/>
+            <w:tcW w:w="3453" w:type="dxa"/>
           </w:tcPr>
           <w:p>
             <w:pPr/>
@@ -2099,7 +2248,7 @@
         </w:tc>
         <w:tc>
           <w:tcPr>
-            <w:tcW w:w="1859" w:type="dxa"/>
+            <w:tcW w:w="1684" w:type="dxa"/>
           </w:tcPr>
           <w:p>
             <w:pPr/>
@@ -2123,7 +2272,7 @@
       <w:tr>
         <w:tc>
           <w:tcPr>
-            <w:tcW w:w="2795" w:type="dxa"/>
+            <w:tcW w:w="2874" w:type="dxa"/>
           </w:tcPr>
           <w:p>
             <w:pPr/>
@@ -2134,7 +2283,7 @@
         </w:tc>
         <w:tc>
           <w:tcPr>
-            <w:tcW w:w="3357" w:type="dxa"/>
+            <w:tcW w:w="3453" w:type="dxa"/>
           </w:tcPr>
           <w:p>
             <w:pPr/>
@@ -2145,7 +2294,7 @@
         </w:tc>
         <w:tc>
           <w:tcPr>
-            <w:tcW w:w="1859" w:type="dxa"/>
+            <w:tcW w:w="1684" w:type="dxa"/>
           </w:tcPr>
           <w:p>
             <w:pPr/>
@@ -2169,7 +2318,7 @@
       <w:tr>
         <w:tc>
           <w:tcPr>
-            <w:tcW w:w="2795" w:type="dxa"/>
+            <w:tcW w:w="2874" w:type="dxa"/>
           </w:tcPr>
           <w:p>
             <w:pPr/>
@@ -2180,7 +2329,7 @@
         </w:tc>
         <w:tc>
           <w:tcPr>
-            <w:tcW w:w="3357" w:type="dxa"/>
+            <w:tcW w:w="3453" w:type="dxa"/>
           </w:tcPr>
           <w:p>
             <w:pPr/>
@@ -2191,7 +2340,7 @@
         </w:tc>
         <w:tc>
           <w:tcPr>
-            <w:tcW w:w="1859" w:type="dxa"/>
+            <w:tcW w:w="1684" w:type="dxa"/>
           </w:tcPr>
           <w:p>
             <w:pPr/>
@@ -2215,7 +2364,7 @@
       <w:tr>
         <w:tc>
           <w:tcPr>
-            <w:tcW w:w="2795" w:type="dxa"/>
+            <w:tcW w:w="2874" w:type="dxa"/>
           </w:tcPr>
           <w:p>
             <w:pPr/>
@@ -2226,7 +2375,7 @@
         </w:tc>
         <w:tc>
           <w:tcPr>
-            <w:tcW w:w="3357" w:type="dxa"/>
+            <w:tcW w:w="3453" w:type="dxa"/>
           </w:tcPr>
           <w:p>
             <w:pPr/>
@@ -2237,7 +2386,7 @@
         </w:tc>
         <w:tc>
           <w:tcPr>
-            <w:tcW w:w="1859" w:type="dxa"/>
+            <w:tcW w:w="1684" w:type="dxa"/>
           </w:tcPr>
           <w:p>
             <w:pPr/>
@@ -2261,7 +2410,7 @@
       <w:tr>
         <w:tc>
           <w:tcPr>
-            <w:tcW w:w="2795" w:type="dxa"/>
+            <w:tcW w:w="2874" w:type="dxa"/>
           </w:tcPr>
           <w:p>
             <w:pPr/>
@@ -2272,7 +2421,7 @@
         </w:tc>
         <w:tc>
           <w:tcPr>
-            <w:tcW w:w="3357" w:type="dxa"/>
+            <w:tcW w:w="3453" w:type="dxa"/>
           </w:tcPr>
           <w:p>
             <w:pPr/>
@@ -2283,7 +2432,7 @@
         </w:tc>
         <w:tc>
           <w:tcPr>
-            <w:tcW w:w="1859" w:type="dxa"/>
+            <w:tcW w:w="1684" w:type="dxa"/>
           </w:tcPr>
           <w:p>
             <w:pPr/>
@@ -2307,7 +2456,7 @@
       <w:tr>
         <w:tc>
           <w:tcPr>
-            <w:tcW w:w="2795" w:type="dxa"/>
+            <w:tcW w:w="2874" w:type="dxa"/>
           </w:tcPr>
           <w:p>
             <w:pPr/>
@@ -2318,7 +2467,7 @@
         </w:tc>
         <w:tc>
           <w:tcPr>
-            <w:tcW w:w="3357" w:type="dxa"/>
+            <w:tcW w:w="3453" w:type="dxa"/>
           </w:tcPr>
           <w:p>
             <w:pPr/>
@@ -2329,7 +2478,7 @@
         </w:tc>
         <w:tc>
           <w:tcPr>
-            <w:tcW w:w="1859" w:type="dxa"/>
+            <w:tcW w:w="1684" w:type="dxa"/>
           </w:tcPr>
           <w:p>
             <w:pPr/>
@@ -2353,7 +2502,7 @@
       <w:tr>
         <w:tc>
           <w:tcPr>
-            <w:tcW w:w="2795" w:type="dxa"/>
+            <w:tcW w:w="2874" w:type="dxa"/>
           </w:tcPr>
           <w:p>
             <w:pPr/>
@@ -2364,7 +2513,7 @@
         </w:tc>
         <w:tc>
           <w:tcPr>
-            <w:tcW w:w="3357" w:type="dxa"/>
+            <w:tcW w:w="3453" w:type="dxa"/>
           </w:tcPr>
           <w:p>
             <w:pPr/>
@@ -2375,7 +2524,7 @@
         </w:tc>
         <w:tc>
           <w:tcPr>
-            <w:tcW w:w="1859" w:type="dxa"/>
+            <w:tcW w:w="1684" w:type="dxa"/>
           </w:tcPr>
           <w:p>
             <w:pPr/>
@@ -2399,7 +2548,7 @@
       <w:tr>
         <w:tc>
           <w:tcPr>
-            <w:tcW w:w="2795" w:type="dxa"/>
+            <w:tcW w:w="2874" w:type="dxa"/>
           </w:tcPr>
           <w:p>
             <w:pPr/>
@@ -2410,7 +2559,7 @@
         </w:tc>
         <w:tc>
           <w:tcPr>
-            <w:tcW w:w="3357" w:type="dxa"/>
+            <w:tcW w:w="3453" w:type="dxa"/>
           </w:tcPr>
           <w:p>
             <w:pPr/>
@@ -2421,7 +2570,7 @@
         </w:tc>
         <w:tc>
           <w:tcPr>
-            <w:tcW w:w="1859" w:type="dxa"/>
+            <w:tcW w:w="1684" w:type="dxa"/>
           </w:tcPr>
           <w:p>
             <w:pPr/>
@@ -2445,7 +2594,7 @@
       <w:tr>
         <w:tc>
           <w:tcPr>
-            <w:tcW w:w="2795" w:type="dxa"/>
+            <w:tcW w:w="2874" w:type="dxa"/>
           </w:tcPr>
           <w:p>
             <w:pPr/>
@@ -2456,7 +2605,7 @@
         </w:tc>
         <w:tc>
           <w:tcPr>
-            <w:tcW w:w="3357" w:type="dxa"/>
+            <w:tcW w:w="3453" w:type="dxa"/>
           </w:tcPr>
           <w:p>
             <w:pPr/>
@@ -2467,7 +2616,7 @@
         </w:tc>
         <w:tc>
           <w:tcPr>
-            <w:tcW w:w="1859" w:type="dxa"/>
+            <w:tcW w:w="1684" w:type="dxa"/>
           </w:tcPr>
           <w:p>
             <w:pPr/>
@@ -2491,7 +2640,7 @@
       <w:tr>
         <w:tc>
           <w:tcPr>
-            <w:tcW w:w="2795" w:type="dxa"/>
+            <w:tcW w:w="2874" w:type="dxa"/>
           </w:tcPr>
           <w:p>
             <w:pPr/>
@@ -2502,7 +2651,7 @@
         </w:tc>
         <w:tc>
           <w:tcPr>
-            <w:tcW w:w="3357" w:type="dxa"/>
+            <w:tcW w:w="3453" w:type="dxa"/>
           </w:tcPr>
           <w:p>
             <w:pPr/>
@@ -2513,7 +2662,7 @@
         </w:tc>
         <w:tc>
           <w:tcPr>
-            <w:tcW w:w="1859" w:type="dxa"/>
+            <w:tcW w:w="1684" w:type="dxa"/>
           </w:tcPr>
           <w:p>
             <w:pPr/>
@@ -2537,7 +2686,7 @@
       <w:tr>
         <w:tc>
           <w:tcPr>
-            <w:tcW w:w="2795" w:type="dxa"/>
+            <w:tcW w:w="2874" w:type="dxa"/>
           </w:tcPr>
           <w:p>
             <w:pPr/>
@@ -2548,7 +2697,7 @@
         </w:tc>
         <w:tc>
           <w:tcPr>
-            <w:tcW w:w="3357" w:type="dxa"/>
+            <w:tcW w:w="3453" w:type="dxa"/>
           </w:tcPr>
           <w:p>
             <w:pPr/>
@@ -2559,7 +2708,7 @@
         </w:tc>
         <w:tc>
           <w:tcPr>
-            <w:tcW w:w="1859" w:type="dxa"/>
+            <w:tcW w:w="1684" w:type="dxa"/>
           </w:tcPr>
           <w:p>
             <w:pPr/>
@@ -2583,7 +2732,7 @@
       <w:tr>
         <w:tc>
           <w:tcPr>
-            <w:tcW w:w="2795" w:type="dxa"/>
+            <w:tcW w:w="2874" w:type="dxa"/>
           </w:tcPr>
           <w:p>
             <w:pPr/>
@@ -2594,7 +2743,7 @@
         </w:tc>
         <w:tc>
           <w:tcPr>
-            <w:tcW w:w="3357" w:type="dxa"/>
+            <w:tcW w:w="3453" w:type="dxa"/>
           </w:tcPr>
           <w:p>
             <w:pPr/>
@@ -2605,7 +2754,7 @@
         </w:tc>
         <w:tc>
           <w:tcPr>
-            <w:tcW w:w="1859" w:type="dxa"/>
+            <w:tcW w:w="1684" w:type="dxa"/>
           </w:tcPr>
           <w:p>
             <w:pPr/>
@@ -2629,7 +2778,7 @@
       <w:tr>
         <w:tc>
           <w:tcPr>
-            <w:tcW w:w="2795" w:type="dxa"/>
+            <w:tcW w:w="2874" w:type="dxa"/>
           </w:tcPr>
           <w:p>
             <w:pPr/>
@@ -2640,7 +2789,7 @@
         </w:tc>
         <w:tc>
           <w:tcPr>
-            <w:tcW w:w="3357" w:type="dxa"/>
+            <w:tcW w:w="3453" w:type="dxa"/>
           </w:tcPr>
           <w:p>
             <w:pPr/>
@@ -2651,7 +2800,7 @@
         </w:tc>
         <w:tc>
           <w:tcPr>
-            <w:tcW w:w="1859" w:type="dxa"/>
+            <w:tcW w:w="1684" w:type="dxa"/>
           </w:tcPr>
           <w:p>
             <w:pPr/>
@@ -2675,7 +2824,7 @@
       <w:tr>
         <w:tc>
           <w:tcPr>
-            <w:tcW w:w="2795" w:type="dxa"/>
+            <w:tcW w:w="2874" w:type="dxa"/>
           </w:tcPr>
           <w:p>
             <w:pPr/>
@@ -2686,7 +2835,7 @@
         </w:tc>
         <w:tc>
           <w:tcPr>
-            <w:tcW w:w="3357" w:type="dxa"/>
+            <w:tcW w:w="3453" w:type="dxa"/>
           </w:tcPr>
           <w:p>
             <w:pPr/>
@@ -2697,7 +2846,7 @@
         </w:tc>
         <w:tc>
           <w:tcPr>
-            <w:tcW w:w="1859" w:type="dxa"/>
+            <w:tcW w:w="1684" w:type="dxa"/>
           </w:tcPr>
           <w:p>
             <w:pPr/>
@@ -2721,7 +2870,7 @@
       <w:tr>
         <w:tc>
           <w:tcPr>
-            <w:tcW w:w="2795" w:type="dxa"/>
+            <w:tcW w:w="2874" w:type="dxa"/>
           </w:tcPr>
           <w:p>
             <w:pPr/>
@@ -2732,7 +2881,7 @@
         </w:tc>
         <w:tc>
           <w:tcPr>
-            <w:tcW w:w="3357" w:type="dxa"/>
+            <w:tcW w:w="3453" w:type="dxa"/>
           </w:tcPr>
           <w:p>
             <w:pPr/>
@@ -2743,12 +2892,12 @@
         </w:tc>
         <w:tc>
           <w:tcPr>
-            <w:tcW w:w="1859" w:type="dxa"/>
-          </w:tcPr>
-          <w:p>
-            <w:pPr/>
-            <w:r>
-              <w:t xml:space="preserve">Video</w:t>
+            <w:tcW w:w="1684" w:type="dxa"/>
+          </w:tcPr>
+          <w:p>
+            <w:pPr/>
+            <w:r>
+              <w:t xml:space="preserve">Video — Phase 2, via EZY Apply</w:t>
             </w:r>
           </w:p>
         </w:tc>
@@ -2767,7 +2916,7 @@
       <w:tr>
         <w:tc>
           <w:tcPr>
-            <w:tcW w:w="2795" w:type="dxa"/>
+            <w:tcW w:w="2874" w:type="dxa"/>
           </w:tcPr>
           <w:p>
             <w:pPr/>
@@ -2778,7 +2927,7 @@
         </w:tc>
         <w:tc>
           <w:tcPr>
-            <w:tcW w:w="3357" w:type="dxa"/>
+            <w:tcW w:w="3453" w:type="dxa"/>
           </w:tcPr>
           <w:p>
             <w:pPr/>
@@ -2789,7 +2938,7 @@
         </w:tc>
         <w:tc>
           <w:tcPr>
-            <w:tcW w:w="1859" w:type="dxa"/>
+            <w:tcW w:w="1684" w:type="dxa"/>
           </w:tcPr>
           <w:p>
             <w:pPr/>
@@ -2813,7 +2962,7 @@
       <w:tr>
         <w:tc>
           <w:tcPr>
-            <w:tcW w:w="2795" w:type="dxa"/>
+            <w:tcW w:w="2874" w:type="dxa"/>
           </w:tcPr>
           <w:p>
             <w:pPr/>
@@ -2824,7 +2973,7 @@
         </w:tc>
         <w:tc>
           <w:tcPr>
-            <w:tcW w:w="3357" w:type="dxa"/>
+            <w:tcW w:w="3453" w:type="dxa"/>
           </w:tcPr>
           <w:p>
             <w:pPr/>
@@ -2835,7 +2984,7 @@
         </w:tc>
         <w:tc>
           <w:tcPr>
-            <w:tcW w:w="1859" w:type="dxa"/>
+            <w:tcW w:w="1684" w:type="dxa"/>
           </w:tcPr>
           <w:p>
             <w:pPr/>
@@ -2859,7 +3008,7 @@
       <w:tr>
         <w:tc>
           <w:tcPr>
-            <w:tcW w:w="2795" w:type="dxa"/>
+            <w:tcW w:w="2874" w:type="dxa"/>
           </w:tcPr>
           <w:p>
             <w:pPr/>
@@ -2870,7 +3019,7 @@
         </w:tc>
         <w:tc>
           <w:tcPr>
-            <w:tcW w:w="3357" w:type="dxa"/>
+            <w:tcW w:w="3453" w:type="dxa"/>
           </w:tcPr>
           <w:p>
             <w:pPr/>
@@ -2881,7 +3030,7 @@
         </w:tc>
         <w:tc>
           <w:tcPr>
-            <w:tcW w:w="1859" w:type="dxa"/>
+            <w:tcW w:w="1684" w:type="dxa"/>
           </w:tcPr>
           <w:p>
             <w:pPr/>
@@ -2905,7 +3054,7 @@
       <w:tr>
         <w:tc>
           <w:tcPr>
-            <w:tcW w:w="2795" w:type="dxa"/>
+            <w:tcW w:w="2874" w:type="dxa"/>
           </w:tcPr>
           <w:p>
             <w:pPr/>
@@ -2916,7 +3065,7 @@
         </w:tc>
         <w:tc>
           <w:tcPr>
-            <w:tcW w:w="3357" w:type="dxa"/>
+            <w:tcW w:w="3453" w:type="dxa"/>
           </w:tcPr>
           <w:p>
             <w:pPr/>
@@ -2927,7 +3076,7 @@
         </w:tc>
         <w:tc>
           <w:tcPr>
-            <w:tcW w:w="1859" w:type="dxa"/>
+            <w:tcW w:w="1684" w:type="dxa"/>
           </w:tcPr>
           <w:p>
             <w:pPr/>
@@ -2951,7 +3100,7 @@
       <w:tr>
         <w:tc>
           <w:tcPr>
-            <w:tcW w:w="2795" w:type="dxa"/>
+            <w:tcW w:w="2874" w:type="dxa"/>
           </w:tcPr>
           <w:p>
             <w:pPr/>
@@ -2962,7 +3111,7 @@
         </w:tc>
         <w:tc>
           <w:tcPr>
-            <w:tcW w:w="3357" w:type="dxa"/>
+            <w:tcW w:w="3453" w:type="dxa"/>
           </w:tcPr>
           <w:p>
             <w:pPr/>
@@ -2973,7 +3122,7 @@
         </w:tc>
         <w:tc>
           <w:tcPr>
-            <w:tcW w:w="1859" w:type="dxa"/>
+            <w:tcW w:w="1684" w:type="dxa"/>
           </w:tcPr>
           <w:p>
             <w:pPr/>
@@ -2997,7 +3146,7 @@
       <w:tr>
         <w:tc>
           <w:tcPr>
-            <w:tcW w:w="2795" w:type="dxa"/>
+            <w:tcW w:w="2874" w:type="dxa"/>
           </w:tcPr>
           <w:p>
             <w:pPr/>
@@ -3008,7 +3157,7 @@
         </w:tc>
         <w:tc>
           <w:tcPr>
-            <w:tcW w:w="3357" w:type="dxa"/>
+            <w:tcW w:w="3453" w:type="dxa"/>
           </w:tcPr>
           <w:p>
             <w:pPr/>
@@ -3019,7 +3168,7 @@
         </w:tc>
         <w:tc>
           <w:tcPr>
-            <w:tcW w:w="1859" w:type="dxa"/>
+            <w:tcW w:w="1684" w:type="dxa"/>
           </w:tcPr>
           <w:p>
             <w:pPr/>
@@ -3043,7 +3192,7 @@
       <w:tr>
         <w:tc>
           <w:tcPr>
-            <w:tcW w:w="2795" w:type="dxa"/>
+            <w:tcW w:w="2874" w:type="dxa"/>
           </w:tcPr>
           <w:p>
             <w:pPr/>
@@ -3054,7 +3203,7 @@
         </w:tc>
         <w:tc>
           <w:tcPr>
-            <w:tcW w:w="3357" w:type="dxa"/>
+            <w:tcW w:w="3453" w:type="dxa"/>
           </w:tcPr>
           <w:p>
             <w:pPr/>
@@ -3065,7 +3214,7 @@
         </w:tc>
         <w:tc>
           <w:tcPr>
-            <w:tcW w:w="1859" w:type="dxa"/>
+            <w:tcW w:w="1684" w:type="dxa"/>
           </w:tcPr>
           <w:p>
             <w:pPr/>
@@ -3089,7 +3238,7 @@
       <w:tr>
         <w:tc>
           <w:tcPr>
-            <w:tcW w:w="2795" w:type="dxa"/>
+            <w:tcW w:w="2874" w:type="dxa"/>
           </w:tcPr>
           <w:p>
             <w:pPr/>
@@ -3100,7 +3249,7 @@
         </w:tc>
         <w:tc>
           <w:tcPr>
-            <w:tcW w:w="3357" w:type="dxa"/>
+            <w:tcW w:w="3453" w:type="dxa"/>
           </w:tcPr>
           <w:p>
             <w:pPr/>
@@ -3111,7 +3260,7 @@
         </w:tc>
         <w:tc>
           <w:tcPr>
-            <w:tcW w:w="1859" w:type="dxa"/>
+            <w:tcW w:w="1684" w:type="dxa"/>
           </w:tcPr>
           <w:p>
             <w:pPr/>
@@ -3135,7 +3284,7 @@
       <w:tr>
         <w:tc>
           <w:tcPr>
-            <w:tcW w:w="2795" w:type="dxa"/>
+            <w:tcW w:w="2874" w:type="dxa"/>
           </w:tcPr>
           <w:p>
             <w:pPr/>
@@ -3146,7 +3295,7 @@
         </w:tc>
         <w:tc>
           <w:tcPr>
-            <w:tcW w:w="3357" w:type="dxa"/>
+            <w:tcW w:w="3453" w:type="dxa"/>
           </w:tcPr>
           <w:p>
             <w:pPr/>
@@ -3157,7 +3306,7 @@
         </w:tc>
         <w:tc>
           <w:tcPr>
-            <w:tcW w:w="1859" w:type="dxa"/>
+            <w:tcW w:w="1684" w:type="dxa"/>
           </w:tcPr>
           <w:p>
             <w:pPr/>
@@ -3181,7 +3330,7 @@
       <w:tr>
         <w:tc>
           <w:tcPr>
-            <w:tcW w:w="2795" w:type="dxa"/>
+            <w:tcW w:w="2874" w:type="dxa"/>
           </w:tcPr>
           <w:p>
             <w:pPr/>
@@ -3192,7 +3341,7 @@
         </w:tc>
         <w:tc>
           <w:tcPr>
-            <w:tcW w:w="3357" w:type="dxa"/>
+            <w:tcW w:w="3453" w:type="dxa"/>
           </w:tcPr>
           <w:p>
             <w:pPr/>
@@ -3203,7 +3352,7 @@
         </w:tc>
         <w:tc>
           <w:tcPr>
-            <w:tcW w:w="1859" w:type="dxa"/>
+            <w:tcW w:w="1684" w:type="dxa"/>
           </w:tcPr>
           <w:p>
             <w:pPr/>
@@ -3227,7 +3376,7 @@
       <w:tr>
         <w:tc>
           <w:tcPr>
-            <w:tcW w:w="2795" w:type="dxa"/>
+            <w:tcW w:w="2874" w:type="dxa"/>
           </w:tcPr>
           <w:p>
             <w:pPr/>
@@ -3238,7 +3387,7 @@
         </w:tc>
         <w:tc>
           <w:tcPr>
-            <w:tcW w:w="3357" w:type="dxa"/>
+            <w:tcW w:w="3453" w:type="dxa"/>
           </w:tcPr>
           <w:p>
             <w:pPr/>
@@ -3249,7 +3398,7 @@
         </w:tc>
         <w:tc>
           <w:tcPr>
-            <w:tcW w:w="1859" w:type="dxa"/>
+            <w:tcW w:w="1684" w:type="dxa"/>
           </w:tcPr>
           <w:p>
             <w:pPr/>
@@ -3273,7 +3422,7 @@
       <w:tr>
         <w:tc>
           <w:tcPr>
-            <w:tcW w:w="2795" w:type="dxa"/>
+            <w:tcW w:w="2874" w:type="dxa"/>
           </w:tcPr>
           <w:p>
             <w:pPr/>
@@ -3284,7 +3433,7 @@
         </w:tc>
         <w:tc>
           <w:tcPr>
-            <w:tcW w:w="3357" w:type="dxa"/>
+            <w:tcW w:w="3453" w:type="dxa"/>
           </w:tcPr>
           <w:p>
             <w:pPr/>
@@ -3295,7 +3444,7 @@
         </w:tc>
         <w:tc>
           <w:tcPr>
-            <w:tcW w:w="1859" w:type="dxa"/>
+            <w:tcW w:w="1684" w:type="dxa"/>
           </w:tcPr>
           <w:p>
             <w:pPr/>
@@ -3319,7 +3468,7 @@
       <w:tr>
         <w:tc>
           <w:tcPr>
-            <w:tcW w:w="2795" w:type="dxa"/>
+            <w:tcW w:w="2874" w:type="dxa"/>
           </w:tcPr>
           <w:p>
             <w:pPr/>
@@ -3330,7 +3479,7 @@
         </w:tc>
         <w:tc>
           <w:tcPr>
-            <w:tcW w:w="3357" w:type="dxa"/>
+            <w:tcW w:w="3453" w:type="dxa"/>
           </w:tcPr>
           <w:p>
             <w:pPr/>
@@ -3341,7 +3490,7 @@
         </w:tc>
         <w:tc>
           <w:tcPr>
-            <w:tcW w:w="1859" w:type="dxa"/>
+            <w:tcW w:w="1684" w:type="dxa"/>
           </w:tcPr>
           <w:p>
             <w:pPr/>
@@ -3365,7 +3514,7 @@
       <w:tr>
         <w:tc>
           <w:tcPr>
-            <w:tcW w:w="2795" w:type="dxa"/>
+            <w:tcW w:w="2874" w:type="dxa"/>
           </w:tcPr>
           <w:p>
             <w:pPr/>
@@ -3376,7 +3525,7 @@
         </w:tc>
         <w:tc>
           <w:tcPr>
-            <w:tcW w:w="3357" w:type="dxa"/>
+            <w:tcW w:w="3453" w:type="dxa"/>
           </w:tcPr>
           <w:p>
             <w:pPr/>
@@ -3387,7 +3536,7 @@
         </w:tc>
         <w:tc>
           <w:tcPr>
-            <w:tcW w:w="1859" w:type="dxa"/>
+            <w:tcW w:w="1684" w:type="dxa"/>
           </w:tcPr>
           <w:p>
             <w:pPr/>
@@ -3411,7 +3560,7 @@
       <w:tr>
         <w:tc>
           <w:tcPr>
-            <w:tcW w:w="2795" w:type="dxa"/>
+            <w:tcW w:w="2874" w:type="dxa"/>
           </w:tcPr>
           <w:p>
             <w:pPr/>
@@ -3422,7 +3571,7 @@
         </w:tc>
         <w:tc>
           <w:tcPr>
-            <w:tcW w:w="3357" w:type="dxa"/>
+            <w:tcW w:w="3453" w:type="dxa"/>
           </w:tcPr>
           <w:p>
             <w:pPr/>
@@ -3433,7 +3582,7 @@
         </w:tc>
         <w:tc>
           <w:tcPr>
-            <w:tcW w:w="1859" w:type="dxa"/>
+            <w:tcW w:w="1684" w:type="dxa"/>
           </w:tcPr>
           <w:p>
             <w:pPr/>
@@ -4107,7 +4256,7 @@
           <w:p>
             <w:pPr/>
             <w:r>
-              <w:t xml:space="preserve">Video KYC and identity-based requests accept optional uploads: NIC front and back, selfie, proof of address.</w:t>
+              <w:t xml:space="preserve">Identity-based video requests (personal details, dormant release, EZY activation) accept optional uploads: NIC front and back, selfie, proof of address.</w:t>
             </w:r>
           </w:p>
         </w:tc>
@@ -4118,6 +4267,41 @@
           <w:p>
             <w:pPr/>
             <w:r>
+              <w:t xml:space="preserve">Should</w:t>
+            </w:r>
+          </w:p>
+        </w:tc>
+      </w:tr>
+      <w:tr>
+        <w:tc>
+          <w:tcPr>
+            <w:tcW w:w="1192" w:type="dxa"/>
+          </w:tcPr>
+          <w:p>
+            <w:pPr/>
+            <w:r>
+              <w:t xml:space="preserve">FR-18</w:t>
+            </w:r>
+          </w:p>
+        </w:tc>
+        <w:tc>
+          <w:tcPr>
+            <w:tcW w:w="6757" w:type="dxa"/>
+          </w:tcPr>
+          <w:p>
+            <w:pPr/>
+            <w:r>
+              <w:t xml:space="preserve">Join a scheduled call from the app at the booked time over a secure video room.</w:t>
+            </w:r>
+          </w:p>
+        </w:tc>
+        <w:tc>
+          <w:tcPr>
+            <w:tcW w:w="1410" w:type="dxa"/>
+          </w:tcPr>
+          <w:p>
+            <w:pPr/>
+            <w:r>
               <w:t xml:space="preserve">Must</w:t>
             </w:r>
           </w:p>
@@ -4131,7 +4315,7 @@
           <w:p>
             <w:pPr/>
             <w:r>
-              <w:t xml:space="preserve">FR-18</w:t>
+              <w:t xml:space="preserve">FR-19</w:t>
             </w:r>
           </w:p>
         </w:tc>
@@ -4142,7 +4326,7 @@
           <w:p>
             <w:pPr/>
             <w:r>
-              <w:t xml:space="preserve">Join a scheduled call from the app at the booked time over a secure video room.</w:t>
+              <w:t xml:space="preserve">Remind the customer 30 minutes before (push), and the day before for branch visits (SMS).</w:t>
             </w:r>
           </w:p>
         </w:tc>
@@ -4153,7 +4337,7 @@
           <w:p>
             <w:pPr/>
             <w:r>
-              <w:t xml:space="preserve">Must</w:t>
+              <w:t xml:space="preserve">Should</w:t>
             </w:r>
           </w:p>
         </w:tc>
@@ -4166,7 +4350,7 @@
           <w:p>
             <w:pPr/>
             <w:r>
-              <w:t xml:space="preserve">FR-19</w:t>
+              <w:t xml:space="preserve">FR-20</w:t>
             </w:r>
           </w:p>
         </w:tc>
@@ -4177,7 +4361,7 @@
           <w:p>
             <w:pPr/>
             <w:r>
-              <w:t xml:space="preserve">Remind the customer 30 minutes before (push), and the day before for branch visits (SMS).</w:t>
+              <w:t xml:space="preserve">Limit each customer to a set number of open bookings, to stop slot hoarding.</w:t>
             </w:r>
           </w:p>
         </w:tc>
@@ -4201,7 +4385,7 @@
           <w:p>
             <w:pPr/>
             <w:r>
-              <w:t xml:space="preserve">FR-20</w:t>
+              <w:t xml:space="preserve">FR-21</w:t>
             </w:r>
           </w:p>
         </w:tc>
@@ -4212,7 +4396,7 @@
           <w:p>
             <w:pPr/>
             <w:r>
-              <w:t xml:space="preserve">Limit each customer to a set number of open bookings, to stop slot hoarding.</w:t>
+              <w:t xml:space="preserve">After a visit, ask for a one-tap rating and offer "Talk to us about another product", which books a follow-up with the relationship manager.</w:t>
             </w:r>
           </w:p>
         </w:tc>
@@ -4224,6 +4408,76 @@
             <w:pPr/>
             <w:r>
               <w:t xml:space="preserve">Should</w:t>
+            </w:r>
+          </w:p>
+        </w:tc>
+      </w:tr>
+      <w:tr>
+        <w:tc>
+          <w:tcPr>
+            <w:tcW w:w="1192" w:type="dxa"/>
+          </w:tcPr>
+          <w:p>
+            <w:pPr/>
+            <w:r>
+              <w:t xml:space="preserve">FR-22</w:t>
+            </w:r>
+          </w:p>
+        </w:tc>
+        <w:tc>
+          <w:tcPr>
+            <w:tcW w:w="6757" w:type="dxa"/>
+          </w:tcPr>
+          <w:p>
+            <w:pPr/>
+            <w:r>
+              <w:t xml:space="preserve">A customer can book for a family member's need, such as a minor savings account or a joint account, with the family member's details captured at booking.</w:t>
+            </w:r>
+          </w:p>
+        </w:tc>
+        <w:tc>
+          <w:tcPr>
+            <w:tcW w:w="1410" w:type="dxa"/>
+          </w:tcPr>
+          <w:p>
+            <w:pPr/>
+            <w:r>
+              <w:t xml:space="preserve">Should</w:t>
+            </w:r>
+          </w:p>
+        </w:tc>
+      </w:tr>
+      <w:tr>
+        <w:tc>
+          <w:tcPr>
+            <w:tcW w:w="1192" w:type="dxa"/>
+          </w:tcPr>
+          <w:p>
+            <w:pPr/>
+            <w:r>
+              <w:t xml:space="preserve">FR-23</w:t>
+            </w:r>
+          </w:p>
+        </w:tc>
+        <w:tc>
+          <w:tcPr>
+            <w:tcW w:w="6757" w:type="dxa"/>
+          </w:tcPr>
+          <w:p>
+            <w:pPr/>
+            <w:r>
+              <w:t xml:space="preserve">Phase 2: EZY Apply applicants book Video KYC or a branch visit through the EZY Meet slot engine, with the application reference attached.</w:t>
+            </w:r>
+          </w:p>
+        </w:tc>
+        <w:tc>
+          <w:tcPr>
+            <w:tcW w:w="1410" w:type="dxa"/>
+          </w:tcPr>
+          <w:p>
+            <w:pPr/>
+            <w:r>
+              <w:t xml:space="preserve">Could</w:t>
             </w:r>
           </w:p>
         </w:tc>
@@ -4270,60 +4524,12 @@
         <w:drawing>
           <wp:inline distT="0" distB="0" distL="0" distR="0">
             <wp:extent cx="5486400" cy="3429000"/>
-            <wp:docPr id="5" name="image5" descr="Branch portal: Today"/>
+            <wp:docPr id="6" name="image6" descr="Branch portal: Today"/>
             <a:graphic xmlns:a="http://schemas.openxmlformats.org/drawingml/2006/main">
               <a:graphicData uri="http://schemas.openxmlformats.org/drawingml/2006/picture">
                 <pic:pic xmlns:pic="http://schemas.openxmlformats.org/drawingml/2006/picture">
                   <pic:nvPicPr>
-                    <pic:cNvPr id="5" name="image5" descr="Branch portal: Today"/>
-                    <pic:cNvPicPr/>
-                  </pic:nvPicPr>
-                  <pic:blipFill>
-                    <a:blip r:embed="rId9"/>
-                    <a:stretch>
-                      <a:fillRect/>
-                    </a:stretch>
-                  </pic:blipFill>
-                  <pic:spPr>
-                    <a:xfrm>
-                      <a:off x="0" y="0"/>
-                      <a:ext cx="5486400" cy="3429000"/>
-                    </a:xfrm>
-                    <a:prstGeom prst="rect">
-                      <a:avLst/>
-                    </a:prstGeom>
-                  </pic:spPr>
-                </pic:pic>
-              </a:graphicData>
-            </a:graphic>
-          </wp:inline>
-        </w:drawing>
-      </w:r>
-    </w:p>
-    <w:p>
-      <w:pPr/>
-      <w:r>
-        <w:rPr>
-          <w:b/>
-        </w:rPr>
-        <w:t xml:space="preserve">Check-in.</w:t>
-      </w:r>
-      <w:r>
-        <w:t xml:space="preserve"> Staff scan the customer's QR code with the device camera or type the reference. One button checks the customer in and issues a priority token.</w:t>
-      </w:r>
-    </w:p>
-    <w:p>
-      <w:pPr/>
-      <w:r>
-        <w:drawing>
-          <wp:inline distT="0" distB="0" distL="0" distR="0">
-            <wp:extent cx="5486400" cy="3429000"/>
-            <wp:docPr id="6" name="image6" descr="Branch portal: Check-in"/>
-            <a:graphic xmlns:a="http://schemas.openxmlformats.org/drawingml/2006/main">
-              <a:graphicData uri="http://schemas.openxmlformats.org/drawingml/2006/picture">
-                <pic:pic xmlns:pic="http://schemas.openxmlformats.org/drawingml/2006/picture">
-                  <pic:nvPicPr>
-                    <pic:cNvPr id="6" name="image6" descr="Branch portal: Check-in"/>
+                    <pic:cNvPr id="6" name="image6" descr="Branch portal: Today"/>
                     <pic:cNvPicPr/>
                   </pic:nvPicPr>
                   <pic:blipFill>
@@ -4354,10 +4560,10 @@
         <w:rPr>
           <w:b/>
         </w:rPr>
-        <w:t xml:space="preserve">Schedule.</w:t>
-      </w:r>
-      <w:r>
-        <w:t xml:space="preserve"> A 7-day by 30-minute view; darker cells hold more bookings, blocked slots are hatched. Clicking a cell lists its customers.</w:t>
+        <w:t xml:space="preserve">Check-in.</w:t>
+      </w:r>
+      <w:r>
+        <w:t xml:space="preserve"> Staff scan the customer's QR code with the device camera or type the reference. One button checks the customer in and issues a priority token.</w:t>
       </w:r>
     </w:p>
     <w:p>
@@ -4366,12 +4572,12 @@
         <w:drawing>
           <wp:inline distT="0" distB="0" distL="0" distR="0">
             <wp:extent cx="5486400" cy="3429000"/>
-            <wp:docPr id="7" name="image7" descr="Branch portal: Schedule"/>
+            <wp:docPr id="7" name="image7" descr="Branch portal: Check-in"/>
             <a:graphic xmlns:a="http://schemas.openxmlformats.org/drawingml/2006/main">
               <a:graphicData uri="http://schemas.openxmlformats.org/drawingml/2006/picture">
                 <pic:pic xmlns:pic="http://schemas.openxmlformats.org/drawingml/2006/picture">
                   <pic:nvPicPr>
-                    <pic:cNvPr id="7" name="image7" descr="Branch portal: Schedule"/>
+                    <pic:cNvPr id="7" name="image7" descr="Branch portal: Check-in"/>
                     <pic:cNvPicPr/>
                   </pic:nvPicPr>
                   <pic:blipFill>
@@ -4402,10 +4608,10 @@
         <w:rPr>
           <w:b/>
         </w:rPr>
-        <w:t xml:space="preserve">Video desk.</w:t>
-      </w:r>
-      <w:r>
-        <w:t xml:space="preserve"> Scheduled video calls with uploaded KYC documents, and the live queue from "talk to an advisor now".</w:t>
+        <w:t xml:space="preserve">Schedule.</w:t>
+      </w:r>
+      <w:r>
+        <w:t xml:space="preserve"> A 7-day by 30-minute view; darker cells hold more bookings, blocked slots are hatched. Clicking a cell lists its customers.</w:t>
       </w:r>
     </w:p>
     <w:p>
@@ -4414,12 +4620,12 @@
         <w:drawing>
           <wp:inline distT="0" distB="0" distL="0" distR="0">
             <wp:extent cx="5486400" cy="3429000"/>
-            <wp:docPr id="8" name="image8" descr="Branch portal: Video desk"/>
+            <wp:docPr id="8" name="image8" descr="Branch portal: Schedule"/>
             <a:graphic xmlns:a="http://schemas.openxmlformats.org/drawingml/2006/main">
               <a:graphicData uri="http://schemas.openxmlformats.org/drawingml/2006/picture">
                 <pic:pic xmlns:pic="http://schemas.openxmlformats.org/drawingml/2006/picture">
                   <pic:nvPicPr>
-                    <pic:cNvPr id="8" name="image8" descr="Branch portal: Video desk"/>
+                    <pic:cNvPr id="8" name="image8" descr="Branch portal: Schedule"/>
                     <pic:cNvPicPr/>
                   </pic:nvPicPr>
                   <pic:blipFill>
@@ -4450,10 +4656,10 @@
         <w:rPr>
           <w:b/>
         </w:rPr>
-        <w:t xml:space="preserve">Slots and capacity.</w:t>
-      </w:r>
-      <w:r>
-        <w:t xml:space="preserve"> The manager sets the number of EZY Meet counters and blocks slots; a blocked slot disappears from the app at once.</w:t>
+        <w:t xml:space="preserve">Video desk.</w:t>
+      </w:r>
+      <w:r>
+        <w:t xml:space="preserve"> Scheduled video calls and the live queue from "talk to an advisor now". In Phase 2, Video KYC sessions from EZY Apply arrive on this desk.</w:t>
       </w:r>
     </w:p>
     <w:p>
@@ -4462,12 +4668,12 @@
         <w:drawing>
           <wp:inline distT="0" distB="0" distL="0" distR="0">
             <wp:extent cx="5486400" cy="3429000"/>
-            <wp:docPr id="9" name="image9" descr="Branch portal: Slots and capacity"/>
+            <wp:docPr id="9" name="image9" descr="Branch portal: Video desk"/>
             <a:graphic xmlns:a="http://schemas.openxmlformats.org/drawingml/2006/main">
               <a:graphicData uri="http://schemas.openxmlformats.org/drawingml/2006/picture">
                 <pic:pic xmlns:pic="http://schemas.openxmlformats.org/drawingml/2006/picture">
                   <pic:nvPicPr>
-                    <pic:cNvPr id="9" name="image9" descr="Branch portal: Slots and capacity"/>
+                    <pic:cNvPr id="9" name="image9" descr="Branch portal: Video desk"/>
                     <pic:cNvPicPr/>
                   </pic:nvPicPr>
                   <pic:blipFill>
@@ -4492,6 +4698,54 @@
         </w:drawing>
       </w:r>
     </w:p>
+    <w:p>
+      <w:pPr/>
+      <w:r>
+        <w:rPr>
+          <w:b/>
+        </w:rPr>
+        <w:t xml:space="preserve">Slots and capacity.</w:t>
+      </w:r>
+      <w:r>
+        <w:t xml:space="preserve"> The manager sets the number of EZY Meet counters and blocks slots; a blocked slot disappears from the app at once.</w:t>
+      </w:r>
+    </w:p>
+    <w:p>
+      <w:pPr/>
+      <w:r>
+        <w:drawing>
+          <wp:inline distT="0" distB="0" distL="0" distR="0">
+            <wp:extent cx="5486400" cy="3429000"/>
+            <wp:docPr id="10" name="image10" descr="Branch portal: Slots and capacity"/>
+            <a:graphic xmlns:a="http://schemas.openxmlformats.org/drawingml/2006/main">
+              <a:graphicData uri="http://schemas.openxmlformats.org/drawingml/2006/picture">
+                <pic:pic xmlns:pic="http://schemas.openxmlformats.org/drawingml/2006/picture">
+                  <pic:nvPicPr>
+                    <pic:cNvPr id="10" name="image10" descr="Branch portal: Slots and capacity"/>
+                    <pic:cNvPicPr/>
+                  </pic:nvPicPr>
+                  <pic:blipFill>
+                    <a:blip r:embed="rId14"/>
+                    <a:stretch>
+                      <a:fillRect/>
+                    </a:stretch>
+                  </pic:blipFill>
+                  <pic:spPr>
+                    <a:xfrm>
+                      <a:off x="0" y="0"/>
+                      <a:ext cx="5486400" cy="3429000"/>
+                    </a:xfrm>
+                    <a:prstGeom prst="rect">
+                      <a:avLst/>
+                    </a:prstGeom>
+                  </pic:spPr>
+                </pic:pic>
+              </a:graphicData>
+            </a:graphic>
+          </wp:inline>
+        </w:drawing>
+      </w:r>
+    </w:p>
     <w:tbl>
       <w:tblPr>
         <w:tblStyle w:val="TableGrid"/>
@@ -4704,6 +4958,41 @@
           <w:p>
             <w:pPr/>
             <w:r>
+              <w:t xml:space="preserve">Customer detail also shows a relationship snapshot: products held and a suggested next product, so staff can prepare before the customer arrives.</w:t>
+            </w:r>
+          </w:p>
+        </w:tc>
+        <w:tc>
+          <w:tcPr>
+            <w:tcW w:w="1410" w:type="dxa"/>
+          </w:tcPr>
+          <w:p>
+            <w:pPr/>
+            <w:r>
+              <w:t xml:space="preserve">Should</w:t>
+            </w:r>
+          </w:p>
+        </w:tc>
+      </w:tr>
+      <w:tr>
+        <w:tc>
+          <w:tcPr>
+            <w:tcW w:w="1192" w:type="dxa"/>
+          </w:tcPr>
+          <w:p>
+            <w:pPr/>
+            <w:r>
+              <w:t xml:space="preserve">BP-06</w:t>
+            </w:r>
+          </w:p>
+        </w:tc>
+        <w:tc>
+          <w:tcPr>
+            <w:tcW w:w="6757" w:type="dxa"/>
+          </w:tcPr>
+          <w:p>
+            <w:pPr/>
+            <w:r>
               <w:t xml:space="preserve">Check-in by QR scan or reference; issue a priority token and send it to the branch queue system.</w:t>
             </w:r>
           </w:p>
@@ -4728,7 +5017,7 @@
           <w:p>
             <w:pPr/>
             <w:r>
-              <w:t xml:space="preserve">BP-06</w:t>
+              <w:t xml:space="preserve">BP-07</w:t>
             </w:r>
           </w:p>
         </w:tc>
@@ -4739,6 +5028,41 @@
           <w:p>
             <w:pPr/>
             <w:r>
+              <w:t xml:space="preserve">On Complete, staff can record products the customer showed interest in; each becomes a follow-up lead for the relationship manager or sales team.</w:t>
+            </w:r>
+          </w:p>
+        </w:tc>
+        <w:tc>
+          <w:tcPr>
+            <w:tcW w:w="1410" w:type="dxa"/>
+          </w:tcPr>
+          <w:p>
+            <w:pPr/>
+            <w:r>
+              <w:t xml:space="preserve">Must</w:t>
+            </w:r>
+          </w:p>
+        </w:tc>
+      </w:tr>
+      <w:tr>
+        <w:tc>
+          <w:tcPr>
+            <w:tcW w:w="1192" w:type="dxa"/>
+          </w:tcPr>
+          <w:p>
+            <w:pPr/>
+            <w:r>
+              <w:t xml:space="preserve">BP-08</w:t>
+            </w:r>
+          </w:p>
+        </w:tc>
+        <w:tc>
+          <w:tcPr>
+            <w:tcW w:w="6757" w:type="dxa"/>
+          </w:tcPr>
+          <w:p>
+            <w:pPr/>
+            <w:r>
               <w:t xml:space="preserve">Schedule view for the next 7 days with booking counts per slot and drill-down.</w:t>
             </w:r>
           </w:p>
@@ -4763,7 +5087,7 @@
           <w:p>
             <w:pPr/>
             <w:r>
-              <w:t xml:space="preserve">BP-07</w:t>
+              <w:t xml:space="preserve">BP-09</w:t>
             </w:r>
           </w:p>
         </w:tc>
@@ -4798,7 +5122,7 @@
           <w:p>
             <w:pPr/>
             <w:r>
-              <w:t xml:space="preserve">BP-08</w:t>
+              <w:t xml:space="preserve">BP-10</w:t>
             </w:r>
           </w:p>
         </w:tc>
@@ -4833,7 +5157,7 @@
           <w:p>
             <w:pPr/>
             <w:r>
-              <w:t xml:space="preserve">BP-09</w:t>
+              <w:t xml:space="preserve">BP-11</w:t>
             </w:r>
           </w:p>
         </w:tc>
@@ -4868,7 +5192,7 @@
           <w:p>
             <w:pPr/>
             <w:r>
-              <w:t xml:space="preserve">BP-10</w:t>
+              <w:t xml:space="preserve">BP-12</w:t>
             </w:r>
           </w:p>
         </w:tc>
@@ -4903,7 +5227,7 @@
           <w:p>
             <w:pPr/>
             <w:r>
-              <w:t xml:space="preserve">BP-11</w:t>
+              <w:t xml:space="preserve">BP-13</w:t>
             </w:r>
           </w:p>
         </w:tc>
@@ -4914,7 +5238,7 @@
           <w:p>
             <w:pPr/>
             <w:r>
-              <w:t xml:space="preserve">Every status change and slot change is logged with staff ID and time.</w:t>
+              <w:t xml:space="preserve">Every status change, lead and slot change is logged with staff ID and time.</w:t>
             </w:r>
           </w:p>
         </w:tc>
@@ -4938,7 +5262,7 @@
           <w:p>
             <w:pPr/>
             <w:r>
-              <w:t xml:space="preserve">BP-12</w:t>
+              <w:t xml:space="preserve">BP-14</w:t>
             </w:r>
           </w:p>
         </w:tc>
@@ -4949,7 +5273,42 @@
           <w:p>
             <w:pPr/>
             <w:r>
-              <w:t xml:space="preserve">Daily and weekly reports per branch: bookings, no-shows, wait time, top services.</w:t>
+              <w:t xml:space="preserve">Daily and weekly reports per branch: bookings, no-shows, wait time, top services, leads and accounts opened from visits.</w:t>
+            </w:r>
+          </w:p>
+        </w:tc>
+        <w:tc>
+          <w:tcPr>
+            <w:tcW w:w="1410" w:type="dxa"/>
+          </w:tcPr>
+          <w:p>
+            <w:pPr/>
+            <w:r>
+              <w:t xml:space="preserve">Could</w:t>
+            </w:r>
+          </w:p>
+        </w:tc>
+      </w:tr>
+      <w:tr>
+        <w:tc>
+          <w:tcPr>
+            <w:tcW w:w="1192" w:type="dxa"/>
+          </w:tcPr>
+          <w:p>
+            <w:pPr/>
+            <w:r>
+              <w:t xml:space="preserve">BP-15</w:t>
+            </w:r>
+          </w:p>
+        </w:tc>
+        <w:tc>
+          <w:tcPr>
+            <w:tcW w:w="6757" w:type="dxa"/>
+          </w:tcPr>
+          <w:p>
+            <w:pPr/>
+            <w:r>
+              <w:t xml:space="preserve">Phase 2: Video KYC sessions from EZY Apply appear on the video desk with the application and its documents.</w:t>
             </w:r>
           </w:p>
         </w:tc>
@@ -4987,63 +5346,6 @@
           <w:b/>
         </w:rPr>
         <w:t xml:space="preserve">Smart recommendation</w:t>
-      </w:r>
-    </w:p>
-    <w:p>
-      <w:pPr>
-        <w:pStyle w:val="ListParagraph"/>
-        <w:numPr>
-          <w:ilvl w:val="0"/>
-          <w:numId w:val="5"/>
-        </w:numPr>
-      </w:pPr>
-      <w:r>
-        <w:t xml:space="preserve">Candidates are branches within 15 km; if fewer than 3, the 5 nearest.</w:t>
-      </w:r>
-    </w:p>
-    <w:p>
-      <w:pPr>
-        <w:pStyle w:val="ListParagraph"/>
-        <w:numPr>
-          <w:ilvl w:val="0"/>
-          <w:numId w:val="5"/>
-        </w:numPr>
-      </w:pPr>
-      <w:r>
-        <w:t xml:space="preserve">Score = 1.2 × hours until the earliest free slot + 2.5 × distance in km + 0.6 × expected wait in minutes. Lowest score wins. (Prototype weights.)</w:t>
-      </w:r>
-    </w:p>
-    <w:p>
-      <w:pPr>
-        <w:pStyle w:val="ListParagraph"/>
-        <w:numPr>
-          <w:ilvl w:val="0"/>
-          <w:numId w:val="5"/>
-        </w:numPr>
-      </w:pPr>
-      <w:r>
-        <w:t xml:space="preserve">Expected wait comes from the branch's current load and the slot's bookings.</w:t>
-      </w:r>
-    </w:p>
-    <w:p>
-      <w:pPr>
-        <w:pStyle w:val="ListParagraph"/>
-        <w:numPr>
-          <w:ilvl w:val="0"/>
-          <w:numId w:val="5"/>
-        </w:numPr>
-      </w:pPr>
-      <w:r>
-        <w:t xml:space="preserve">Crowd level shown to customers: Quiet, Moderate or Busy.</w:t>
-      </w:r>
-    </w:p>
-    <w:p>
-      <w:pPr/>
-      <w:r>
-        <w:rPr>
-          <w:b/>
-        </w:rPr>
-        <w:t xml:space="preserve">Slots and capacity</w:t>
       </w:r>
     </w:p>
     <w:p>
@@ -5055,7 +5357,7 @@
         </w:numPr>
       </w:pPr>
       <w:r>
-        <w:t xml:space="preserve">Branch slots are 30 minutes: Monday to Friday 9:00 AM to 3:30 PM, Saturday 9:00 AM to 12:30 PM, closed Sunday and bank holidays.</w:t>
+        <w:t xml:space="preserve">Candidates are branches within 15 km; if fewer than 3, the 5 nearest.</w:t>
       </w:r>
     </w:p>
     <w:p>
@@ -5067,7 +5369,7 @@
         </w:numPr>
       </w:pPr>
       <w:r>
-        <w:t xml:space="preserve">Video slots are 30 minutes, Monday to Saturday 8:00 AM to 8:00 PM.</w:t>
+        <w:t xml:space="preserve">Score = 1.2 × hours until the earliest free slot + 2.5 × distance in km + 0.6 × expected wait in minutes. Lowest score wins. (Prototype weights.)</w:t>
       </w:r>
     </w:p>
     <w:p>
@@ -5079,7 +5381,7 @@
         </w:numPr>
       </w:pPr>
       <w:r>
-        <w:t xml:space="preserve">Capacity per slot = EZY Meet counters × 2. A full or blocked slot is not shown.</w:t>
+        <w:t xml:space="preserve">Expected wait comes from the branch's current load and the slot's bookings.</w:t>
       </w:r>
     </w:p>
     <w:p>
@@ -5091,31 +5393,7 @@
         </w:numPr>
       </w:pPr>
       <w:r>
-        <w:t xml:space="preserve">Booking opens 7 days ahead and closes 30 minutes before the slot.</w:t>
-      </w:r>
-    </w:p>
-    <w:p>
-      <w:pPr>
-        <w:pStyle w:val="ListParagraph"/>
-        <w:numPr>
-          <w:ilvl w:val="0"/>
-          <w:numId w:val="6"/>
-        </w:numPr>
-      </w:pPr>
-      <w:r>
-        <w:t xml:space="preserve">Priority service: a checked-in customer is served at the booked time ahead of walk-ins.</w:t>
-      </w:r>
-    </w:p>
-    <w:p>
-      <w:pPr>
-        <w:pStyle w:val="ListParagraph"/>
-        <w:numPr>
-          <w:ilvl w:val="0"/>
-          <w:numId w:val="6"/>
-        </w:numPr>
-      </w:pPr>
-      <w:r>
-        <w:t xml:space="preserve">A customer not checked in 30 minutes after the slot is a no-show and the slot is released.</w:t>
+        <w:t xml:space="preserve">Crowd level shown to customers: Quiet, Moderate or Busy.</w:t>
       </w:r>
     </w:p>
     <w:p>
@@ -5124,7 +5402,7 @@
         <w:rPr>
           <w:b/>
         </w:rPr>
-        <w:t xml:space="preserve">Video KYC</w:t>
+        <w:t xml:space="preserve">Slots and capacity</w:t>
       </w:r>
     </w:p>
     <w:p>
@@ -5136,7 +5414,7 @@
         </w:numPr>
       </w:pPr>
       <w:r>
-        <w:t xml:space="preserve">Open to customers new to Pan Asia, and to existing customers for identity-based requests (personal details, dormant release, EZY activation, foreign currency accounts).</w:t>
+        <w:t xml:space="preserve">Branch slots are 30 minutes: Monday to Friday 9:00 AM to 3:30 PM, Saturday 9:00 AM to 12:30 PM, closed Sunday and bank holidays.</w:t>
       </w:r>
     </w:p>
     <w:p>
@@ -5148,7 +5426,7 @@
         </w:numPr>
       </w:pPr>
       <w:r>
-        <w:t xml:space="preserve">Uploads before the call are optional; the advisor can capture documents during the call.</w:t>
+        <w:t xml:space="preserve">Video slots are 30 minutes, Monday to Saturday 8:00 AM to 8:00 PM.</w:t>
       </w:r>
     </w:p>
     <w:p>
@@ -5160,7 +5438,7 @@
         </w:numPr>
       </w:pPr>
       <w:r>
-        <w:t xml:space="preserve">The advisor matches the live face to the NIC and selfie, and the session is recorded for audit, per CBSL KYC/CDD rules.</w:t>
+        <w:t xml:space="preserve">Capacity per slot = EZY Meet counters × 2. A full or blocked slot is not shown.</w:t>
       </w:r>
     </w:p>
     <w:p>
@@ -5172,7 +5450,133 @@
         </w:numPr>
       </w:pPr>
       <w:r>
-        <w:t xml:space="preserve">If verification fails, the customer is offered a branch visit for the same service.</w:t>
+        <w:t xml:space="preserve">Booking opens 7 days ahead and closes 30 minutes before the slot.</w:t>
+      </w:r>
+    </w:p>
+    <w:p>
+      <w:pPr>
+        <w:pStyle w:val="ListParagraph"/>
+        <w:numPr>
+          <w:ilvl w:val="0"/>
+          <w:numId w:val="7"/>
+        </w:numPr>
+      </w:pPr>
+      <w:r>
+        <w:t xml:space="preserve">Priority service: a checked-in customer is served at the booked time ahead of walk-ins.</w:t>
+      </w:r>
+    </w:p>
+    <w:p>
+      <w:pPr>
+        <w:pStyle w:val="ListParagraph"/>
+        <w:numPr>
+          <w:ilvl w:val="0"/>
+          <w:numId w:val="7"/>
+        </w:numPr>
+      </w:pPr>
+      <w:r>
+        <w:t xml:space="preserve">A customer not checked in 30 minutes after the slot is a no-show and the slot is released.</w:t>
+      </w:r>
+    </w:p>
+    <w:p>
+      <w:pPr/>
+      <w:r>
+        <w:rPr>
+          <w:b/>
+        </w:rPr>
+        <w:t xml:space="preserve">Follow-up after a visit</w:t>
+      </w:r>
+    </w:p>
+    <w:p>
+      <w:pPr>
+        <w:pStyle w:val="ListParagraph"/>
+        <w:numPr>
+          <w:ilvl w:val="0"/>
+          <w:numId w:val="8"/>
+        </w:numPr>
+      </w:pPr>
+      <w:r>
+        <w:t xml:space="preserve">A lead recorded at Complete names the product, the customer and the branch; it is assigned to the customer's relationship manager, or the branch sales officer if none.</w:t>
+      </w:r>
+    </w:p>
+    <w:p>
+      <w:pPr>
+        <w:pStyle w:val="ListParagraph"/>
+        <w:numPr>
+          <w:ilvl w:val="0"/>
+          <w:numId w:val="8"/>
+        </w:numPr>
+      </w:pPr>
+      <w:r>
+        <w:t xml:space="preserve">The customer is contacted only with their consent, captured at booking or after the visit.</w:t>
+      </w:r>
+    </w:p>
+    <w:p>
+      <w:pPr/>
+      <w:r>
+        <w:rPr>
+          <w:b/>
+        </w:rPr>
+        <w:t xml:space="preserve">Video KYC (Phase 2, with EZY Apply)</w:t>
+      </w:r>
+    </w:p>
+    <w:p>
+      <w:pPr>
+        <w:pStyle w:val="ListParagraph"/>
+        <w:numPr>
+          <w:ilvl w:val="0"/>
+          <w:numId w:val="9"/>
+        </w:numPr>
+      </w:pPr>
+      <w:r>
+        <w:t xml:space="preserve">Entry is from EZY Apply at its identity step, not from the EZY Meet service list.</w:t>
+      </w:r>
+    </w:p>
+    <w:p>
+      <w:pPr>
+        <w:pStyle w:val="ListParagraph"/>
+        <w:numPr>
+          <w:ilvl w:val="0"/>
+          <w:numId w:val="9"/>
+        </w:numPr>
+      </w:pPr>
+      <w:r>
+        <w:t xml:space="preserve">Documents captured in EZY Apply are passed to the advisor; nothing is uploaded twice.</w:t>
+      </w:r>
+    </w:p>
+    <w:p>
+      <w:pPr>
+        <w:pStyle w:val="ListParagraph"/>
+        <w:numPr>
+          <w:ilvl w:val="0"/>
+          <w:numId w:val="9"/>
+        </w:numPr>
+      </w:pPr>
+      <w:r>
+        <w:t xml:space="preserve">The advisor matches the live face to the NIC and selfie, and the session is recorded for audit, per CBSL KYC/CDD rules.</w:t>
+      </w:r>
+    </w:p>
+    <w:p>
+      <w:pPr>
+        <w:pStyle w:val="ListParagraph"/>
+        <w:numPr>
+          <w:ilvl w:val="0"/>
+          <w:numId w:val="9"/>
+        </w:numPr>
+      </w:pPr>
+      <w:r>
+        <w:t xml:space="preserve">On success, EZY Apply opens the account and invites the customer to the EZY app.</w:t>
+      </w:r>
+    </w:p>
+    <w:p>
+      <w:pPr>
+        <w:pStyle w:val="ListParagraph"/>
+        <w:numPr>
+          <w:ilvl w:val="0"/>
+          <w:numId w:val="9"/>
+        </w:numPr>
+      </w:pPr>
+      <w:r>
+        <w:t xml:space="preserve">If verification fails, the applicant is offered a branch visit through EZY Meet with the application reference attached.</w:t>
       </w:r>
     </w:p>
     <w:p>
@@ -5296,7 +5700,7 @@
           <w:p>
             <w:pPr/>
             <w:r>
-              <w:t xml:space="preserve">Video KYC follows CBSL KYC/CDD directions, with customer consent and session recording.</w:t>
+              <w:t xml:space="preserve">Phase 2 Video KYC follows CBSL KYC/CDD directions, with customer consent and session recording.</w:t>
             </w:r>
           </w:p>
         </w:tc>
@@ -5481,7 +5885,7 @@
     <w:p>
       <w:pPr/>
       <w:r>
-        <w:t xml:space="preserve">EZY Meet needs six integrations; the booking service is new, the rest exist today.</w:t>
+        <w:t xml:space="preserve">EZY Meet needs seven integrations at launch and one more in Phase 2; only the booking service is new.</w:t>
       </w:r>
     </w:p>
     <w:tbl>
@@ -5492,8 +5896,9 @@
         <w:tblLook w:val="04A0" w:firstRow="1" w:lastRow="0" w:firstColumn="0" w:lastColumn="0" w:noHBand="0" w:noVBand="1"/>
       </w:tblPr>
       <w:tblGrid>
-        <w:gridCol w:w="4012"/>
-        <w:gridCol w:w="5347"/>
+        <w:gridCol w:w="3571"/>
+        <w:gridCol w:w="4920"/>
+        <w:gridCol w:w="869"/>
       </w:tblGrid>
       <w:tr>
         <w:trPr>
@@ -5501,7 +5906,7 @@
         </w:trPr>
         <w:tc>
           <w:tcPr>
-            <w:tcW w:w="4012" w:type="dxa"/>
+            <w:tcW w:w="3571" w:type="dxa"/>
             <w:shd w:val="clear" w:color="auto" w:fill="F2F2F2"/>
           </w:tcPr>
           <w:p>
@@ -5513,7 +5918,7 @@
         </w:tc>
         <w:tc>
           <w:tcPr>
-            <w:tcW w:w="5347" w:type="dxa"/>
+            <w:tcW w:w="4920" w:type="dxa"/>
             <w:shd w:val="clear" w:color="auto" w:fill="F2F2F2"/>
           </w:tcPr>
           <w:p>
@@ -5523,11 +5928,23 @@
             </w:r>
           </w:p>
         </w:tc>
-      </w:tr>
-      <w:tr>
-        <w:tc>
-          <w:tcPr>
-            <w:tcW w:w="4012" w:type="dxa"/>
+        <w:tc>
+          <w:tcPr>
+            <w:tcW w:w="869" w:type="dxa"/>
+            <w:shd w:val="clear" w:color="auto" w:fill="F2F2F2"/>
+          </w:tcPr>
+          <w:p>
+            <w:pPr/>
+            <w:r>
+              <w:t xml:space="preserve">Phase</w:t>
+            </w:r>
+          </w:p>
+        </w:tc>
+      </w:tr>
+      <w:tr>
+        <w:tc>
+          <w:tcPr>
+            <w:tcW w:w="3571" w:type="dxa"/>
           </w:tcPr>
           <w:p>
             <w:pPr/>
@@ -5538,7 +5955,7 @@
         </w:tc>
         <w:tc>
           <w:tcPr>
-            <w:tcW w:w="5347" w:type="dxa"/>
+            <w:tcW w:w="4920" w:type="dxa"/>
           </w:tcPr>
           <w:p>
             <w:pPr/>
@@ -5547,11 +5964,22 @@
             </w:r>
           </w:p>
         </w:tc>
-      </w:tr>
-      <w:tr>
-        <w:tc>
-          <w:tcPr>
-            <w:tcW w:w="4012" w:type="dxa"/>
+        <w:tc>
+          <w:tcPr>
+            <w:tcW w:w="869" w:type="dxa"/>
+          </w:tcPr>
+          <w:p>
+            <w:pPr/>
+            <w:r>
+              <w:t xml:space="preserve">1</w:t>
+            </w:r>
+          </w:p>
+        </w:tc>
+      </w:tr>
+      <w:tr>
+        <w:tc>
+          <w:tcPr>
+            <w:tcW w:w="3571" w:type="dxa"/>
           </w:tcPr>
           <w:p>
             <w:pPr/>
@@ -5562,7 +5990,7 @@
         </w:tc>
         <w:tc>
           <w:tcPr>
-            <w:tcW w:w="5347" w:type="dxa"/>
+            <w:tcW w:w="4920" w:type="dxa"/>
           </w:tcPr>
           <w:p>
             <w:pPr/>
@@ -5571,11 +5999,22 @@
             </w:r>
           </w:p>
         </w:tc>
-      </w:tr>
-      <w:tr>
-        <w:tc>
-          <w:tcPr>
-            <w:tcW w:w="4012" w:type="dxa"/>
+        <w:tc>
+          <w:tcPr>
+            <w:tcW w:w="869" w:type="dxa"/>
+          </w:tcPr>
+          <w:p>
+            <w:pPr/>
+            <w:r>
+              <w:t xml:space="preserve">1</w:t>
+            </w:r>
+          </w:p>
+        </w:tc>
+      </w:tr>
+      <w:tr>
+        <w:tc>
+          <w:tcPr>
+            <w:tcW w:w="3571" w:type="dxa"/>
           </w:tcPr>
           <w:p>
             <w:pPr/>
@@ -5586,20 +6025,31 @@
         </w:tc>
         <w:tc>
           <w:tcPr>
-            <w:tcW w:w="5347" w:type="dxa"/>
-          </w:tcPr>
-          <w:p>
-            <w:pPr/>
-            <w:r>
-              <w:t xml:space="preserve">Customer name, home branch, account and KYC status</w:t>
-            </w:r>
-          </w:p>
-        </w:tc>
-      </w:tr>
-      <w:tr>
-        <w:tc>
-          <w:tcPr>
-            <w:tcW w:w="4012" w:type="dxa"/>
+            <w:tcW w:w="4920" w:type="dxa"/>
+          </w:tcPr>
+          <w:p>
+            <w:pPr/>
+            <w:r>
+              <w:t xml:space="preserve">Customer name, home branch, products held, KYC status</w:t>
+            </w:r>
+          </w:p>
+        </w:tc>
+        <w:tc>
+          <w:tcPr>
+            <w:tcW w:w="869" w:type="dxa"/>
+          </w:tcPr>
+          <w:p>
+            <w:pPr/>
+            <w:r>
+              <w:t xml:space="preserve">1</w:t>
+            </w:r>
+          </w:p>
+        </w:tc>
+      </w:tr>
+      <w:tr>
+        <w:tc>
+          <w:tcPr>
+            <w:tcW w:w="3571" w:type="dxa"/>
           </w:tcPr>
           <w:p>
             <w:pPr/>
@@ -5610,7 +6060,7 @@
         </w:tc>
         <w:tc>
           <w:tcPr>
-            <w:tcW w:w="5347" w:type="dxa"/>
+            <w:tcW w:w="4920" w:type="dxa"/>
           </w:tcPr>
           <w:p>
             <w:pPr/>
@@ -5619,11 +6069,22 @@
             </w:r>
           </w:p>
         </w:tc>
-      </w:tr>
-      <w:tr>
-        <w:tc>
-          <w:tcPr>
-            <w:tcW w:w="4012" w:type="dxa"/>
+        <w:tc>
+          <w:tcPr>
+            <w:tcW w:w="869" w:type="dxa"/>
+          </w:tcPr>
+          <w:p>
+            <w:pPr/>
+            <w:r>
+              <w:t xml:space="preserve">1</w:t>
+            </w:r>
+          </w:p>
+        </w:tc>
+      </w:tr>
+      <w:tr>
+        <w:tc>
+          <w:tcPr>
+            <w:tcW w:w="3571" w:type="dxa"/>
           </w:tcPr>
           <w:p>
             <w:pPr/>
@@ -5634,7 +6095,7 @@
         </w:tc>
         <w:tc>
           <w:tcPr>
-            <w:tcW w:w="5347" w:type="dxa"/>
+            <w:tcW w:w="4920" w:type="dxa"/>
           </w:tcPr>
           <w:p>
             <w:pPr/>
@@ -5643,11 +6104,57 @@
             </w:r>
           </w:p>
         </w:tc>
-      </w:tr>
-      <w:tr>
-        <w:tc>
-          <w:tcPr>
-            <w:tcW w:w="4012" w:type="dxa"/>
+        <w:tc>
+          <w:tcPr>
+            <w:tcW w:w="869" w:type="dxa"/>
+          </w:tcPr>
+          <w:p>
+            <w:pPr/>
+            <w:r>
+              <w:t xml:space="preserve">1</w:t>
+            </w:r>
+          </w:p>
+        </w:tc>
+      </w:tr>
+      <w:tr>
+        <w:tc>
+          <w:tcPr>
+            <w:tcW w:w="3571" w:type="dxa"/>
+          </w:tcPr>
+          <w:p>
+            <w:pPr/>
+            <w:r>
+              <w:t xml:space="preserve">CRM / sales pipeline</w:t>
+            </w:r>
+          </w:p>
+        </w:tc>
+        <w:tc>
+          <w:tcPr>
+            <w:tcW w:w="4920" w:type="dxa"/>
+          </w:tcPr>
+          <w:p>
+            <w:pPr/>
+            <w:r>
+              <w:t xml:space="preserve">Follow-up leads recorded after visits</w:t>
+            </w:r>
+          </w:p>
+        </w:tc>
+        <w:tc>
+          <w:tcPr>
+            <w:tcW w:w="869" w:type="dxa"/>
+          </w:tcPr>
+          <w:p>
+            <w:pPr/>
+            <w:r>
+              <w:t xml:space="preserve">1</w:t>
+            </w:r>
+          </w:p>
+        </w:tc>
+      </w:tr>
+      <w:tr>
+        <w:tc>
+          <w:tcPr>
+            <w:tcW w:w="3571" w:type="dxa"/>
           </w:tcPr>
           <w:p>
             <w:pPr/>
@@ -5658,20 +6165,31 @@
         </w:tc>
         <w:tc>
           <w:tcPr>
-            <w:tcW w:w="5347" w:type="dxa"/>
-          </w:tcPr>
-          <w:p>
-            <w:pPr/>
-            <w:r>
-              <w:t xml:space="preserve">Secure rooms, recording, document capture for Video KYC</w:t>
-            </w:r>
-          </w:p>
-        </w:tc>
-      </w:tr>
-      <w:tr>
-        <w:tc>
-          <w:tcPr>
-            <w:tcW w:w="4012" w:type="dxa"/>
+            <w:tcW w:w="4920" w:type="dxa"/>
+          </w:tcPr>
+          <w:p>
+            <w:pPr/>
+            <w:r>
+              <w:t xml:space="preserve">Secure rooms and recording for video calls</w:t>
+            </w:r>
+          </w:p>
+        </w:tc>
+        <w:tc>
+          <w:tcPr>
+            <w:tcW w:w="869" w:type="dxa"/>
+          </w:tcPr>
+          <w:p>
+            <w:pPr/>
+            <w:r>
+              <w:t xml:space="preserve">1</w:t>
+            </w:r>
+          </w:p>
+        </w:tc>
+      </w:tr>
+      <w:tr>
+        <w:tc>
+          <w:tcPr>
+            <w:tcW w:w="3571" w:type="dxa"/>
           </w:tcPr>
           <w:p>
             <w:pPr/>
@@ -5682,12 +6200,58 @@
         </w:tc>
         <w:tc>
           <w:tcPr>
-            <w:tcW w:w="5347" w:type="dxa"/>
+            <w:tcW w:w="4920" w:type="dxa"/>
           </w:tcPr>
           <w:p>
             <w:pPr/>
             <w:r>
               <w:t xml:space="preserve">Confirmation, reminders, changes and cancellations</w:t>
+            </w:r>
+          </w:p>
+        </w:tc>
+        <w:tc>
+          <w:tcPr>
+            <w:tcW w:w="869" w:type="dxa"/>
+          </w:tcPr>
+          <w:p>
+            <w:pPr/>
+            <w:r>
+              <w:t xml:space="preserve">1</w:t>
+            </w:r>
+          </w:p>
+        </w:tc>
+      </w:tr>
+      <w:tr>
+        <w:tc>
+          <w:tcPr>
+            <w:tcW w:w="3571" w:type="dxa"/>
+          </w:tcPr>
+          <w:p>
+            <w:pPr/>
+            <w:r>
+              <w:t xml:space="preserve">EZY Apply (digital onboarding)</w:t>
+            </w:r>
+          </w:p>
+        </w:tc>
+        <w:tc>
+          <w:tcPr>
+            <w:tcW w:w="4920" w:type="dxa"/>
+          </w:tcPr>
+          <w:p>
+            <w:pPr/>
+            <w:r>
+              <w:t xml:space="preserve">Hand applicants to Video KYC or a branch visit, with documents and application reference</w:t>
+            </w:r>
+          </w:p>
+        </w:tc>
+        <w:tc>
+          <w:tcPr>
+            <w:tcW w:w="869" w:type="dxa"/>
+          </w:tcPr>
+          <w:p>
+            <w:pPr/>
+            <w:r>
+              <w:t xml:space="preserve">2</w:t>
             </w:r>
           </w:p>
         </w:tc>
@@ -5897,7 +6461,7 @@
         <w:pStyle w:val="ListParagraph"/>
         <w:numPr>
           <w:ilvl w:val="0"/>
-          <w:numId w:val="8"/>
+          <w:numId w:val="10"/>
         </w:numPr>
       </w:pPr>
       <w:r>
@@ -5909,7 +6473,7 @@
         <w:pStyle w:val="ListParagraph"/>
         <w:numPr>
           <w:ilvl w:val="0"/>
-          <w:numId w:val="8"/>
+          <w:numId w:val="10"/>
         </w:numPr>
       </w:pPr>
       <w:r>
@@ -5921,11 +6485,35 @@
         <w:pStyle w:val="ListParagraph"/>
         <w:numPr>
           <w:ilvl w:val="0"/>
-          <w:numId w:val="8"/>
+          <w:numId w:val="10"/>
         </w:numPr>
       </w:pPr>
       <w:r>
         <w:t xml:space="preserve">A central virtual advisory team handles video calls for all branches.</w:t>
+      </w:r>
+    </w:p>
+    <w:p>
+      <w:pPr>
+        <w:pStyle w:val="ListParagraph"/>
+        <w:numPr>
+          <w:ilvl w:val="0"/>
+          <w:numId w:val="10"/>
+        </w:numPr>
+      </w:pPr>
+      <w:r>
+        <w:t xml:space="preserve">Relationship managers and branch sales officers follow up leads recorded in the portal.</w:t>
+      </w:r>
+    </w:p>
+    <w:p>
+      <w:pPr>
+        <w:pStyle w:val="ListParagraph"/>
+        <w:numPr>
+          <w:ilvl w:val="0"/>
+          <w:numId w:val="10"/>
+        </w:numPr>
+      </w:pPr>
+      <w:r>
+        <w:t xml:space="preserve">EZY Apply can hand an applicant, their documents and the application reference to EZY Meet in Phase 2.</w:t>
       </w:r>
     </w:p>
     <w:p>
@@ -6057,7 +6645,7 @@
           <w:p>
             <w:pPr/>
             <w:r>
-              <w:t xml:space="preserve">Video KYC rejected by audit</w:t>
+              <w:t xml:space="preserve">Phase 2 Video KYC rejected by audit</w:t>
             </w:r>
           </w:p>
         </w:tc>
@@ -6088,7 +6676,7 @@
         <w:pStyle w:val="ListParagraph"/>
         <w:numPr>
           <w:ilvl w:val="0"/>
-          <w:numId w:val="9"/>
+          <w:numId w:val="11"/>
         </w:numPr>
       </w:pPr>
       <w:r>
@@ -6100,7 +6688,7 @@
         <w:pStyle w:val="ListParagraph"/>
         <w:numPr>
           <w:ilvl w:val="0"/>
-          <w:numId w:val="9"/>
+          <w:numId w:val="11"/>
         </w:numPr>
       </w:pPr>
       <w:r>
@@ -6112,7 +6700,7 @@
         <w:pStyle w:val="ListParagraph"/>
         <w:numPr>
           <w:ilvl w:val="0"/>
-          <w:numId w:val="9"/>
+          <w:numId w:val="11"/>
         </w:numPr>
       </w:pPr>
       <w:r>
@@ -6124,7 +6712,7 @@
         <w:pStyle w:val="ListParagraph"/>
         <w:numPr>
           <w:ilvl w:val="0"/>
-          <w:numId w:val="9"/>
+          <w:numId w:val="11"/>
         </w:numPr>
       </w:pPr>
       <w:r>
@@ -6136,7 +6724,7 @@
         <w:pStyle w:val="ListParagraph"/>
         <w:numPr>
           <w:ilvl w:val="0"/>
-          <w:numId w:val="9"/>
+          <w:numId w:val="11"/>
         </w:numPr>
       </w:pPr>
       <w:r>
@@ -6148,11 +6736,35 @@
         <w:pStyle w:val="ListParagraph"/>
         <w:numPr>
           <w:ilvl w:val="0"/>
-          <w:numId w:val="9"/>
+          <w:numId w:val="11"/>
         </w:numPr>
       </w:pPr>
       <w:r>
         <w:t xml:space="preserve">☐ Does the queue system accept priority tokens from EZY Meet?</w:t>
+      </w:r>
+    </w:p>
+    <w:p>
+      <w:pPr>
+        <w:pStyle w:val="ListParagraph"/>
+        <w:numPr>
+          <w:ilvl w:val="0"/>
+          <w:numId w:val="11"/>
+        </w:numPr>
+      </w:pPr>
+      <w:r>
+        <w:t xml:space="preserve">☐ Which CRM receives follow-up leads, and who owns them?</w:t>
+      </w:r>
+    </w:p>
+    <w:p>
+      <w:pPr>
+        <w:pStyle w:val="ListParagraph"/>
+        <w:numPr>
+          <w:ilvl w:val="0"/>
+          <w:numId w:val="11"/>
+        </w:numPr>
+      </w:pPr>
+      <w:r>
+        <w:t xml:space="preserve">☐ Phase 2: how EZY Apply hands over applicants and documents (API or shared service), and its target date.</w:t>
       </w:r>
     </w:p>
     <w:p>
@@ -6169,7 +6781,7 @@
         <w:pStyle w:val="ListParagraph"/>
         <w:numPr>
           <w:ilvl w:val="0"/>
-          <w:numId w:val="10"/>
+          <w:numId w:val="12"/>
         </w:numPr>
       </w:pPr>
       <w:r>
@@ -6192,7 +6804,7 @@
         <w:pStyle w:val="ListParagraph"/>
         <w:numPr>
           <w:ilvl w:val="0"/>
-          <w:numId w:val="10"/>
+          <w:numId w:val="12"/>
         </w:numPr>
       </w:pPr>
       <w:r>
@@ -6212,7 +6824,7 @@
         <w:pStyle w:val="ListParagraph"/>
         <w:numPr>
           <w:ilvl w:val="0"/>
-          <w:numId w:val="10"/>
+          <w:numId w:val="12"/>
         </w:numPr>
       </w:pPr>
       <w:r>
@@ -6407,10 +7019,7 @@
     <w:abstractNumId w:val="0"/>
   </w:num>
   <w:num w:numId="4">
-    <w:abstractNumId w:val="1"/>
-    <w:lvlOverride w:ilvl="0">
-      <w:startOverride w:val="1"/>
-    </w:lvlOverride>
+    <w:abstractNumId w:val="0"/>
   </w:num>
   <w:num w:numId="5">
     <w:abstractNumId w:val="1"/>
@@ -6419,7 +7028,10 @@
     </w:lvlOverride>
   </w:num>
   <w:num w:numId="6">
-    <w:abstractNumId w:val="0"/>
+    <w:abstractNumId w:val="1"/>
+    <w:lvlOverride w:ilvl="0">
+      <w:startOverride w:val="1"/>
+    </w:lvlOverride>
   </w:num>
   <w:num w:numId="7">
     <w:abstractNumId w:val="0"/>
@@ -6431,6 +7043,12 @@
     <w:abstractNumId w:val="0"/>
   </w:num>
   <w:num w:numId="10">
+    <w:abstractNumId w:val="0"/>
+  </w:num>
+  <w:num w:numId="11">
+    <w:abstractNumId w:val="0"/>
+  </w:num>
+  <w:num w:numId="12">
     <w:abstractNumId w:val="0"/>
   </w:num>
 </w:numbering>

</xml_diff>

<commit_message>
Update BRD to three phases: branch visits, video path with EZY Apply, booking on behalf
Co-Authored-By: Claude Opus 5.5 <noreply@anthropic.com>
Claude-Session: https://claude.ai/code/session_01EfL1wo9mb9p9oy7CCemWVN
</commit_message>
<xml_diff>
--- a/docs/Pan-Asia-EZY-Meet-BRD.docx
+++ b/docs/Pan-Asia-EZY-Meet-BRD.docx
@@ -33,7 +33,7 @@
     <w:p>
       <w:pPr/>
       <w:r>
-        <w:t xml:space="preserve">EZY Meet adds appointment banking to the Pan Asia EZY app. Customers book a branch visit or a video call in four taps, and branch staff manage the bookings in a branch portal. Every visit arrives with its purpose known, so staff can prepare, serve on time and use the conversation to offer the next right product. Phase 2 connects EZY Meet to EZY Apply, the digital onboarding portal, through Video KYC.</w:t>
+        <w:t xml:space="preserve">EZY Meet adds appointment banking to the Pan Asia EZY app in three phases. Phase 1 rolls out branch-visit booking in the app with a branch portal for staff. Phase 2 adds the video-call path: advisory calls and Video KYC, connected to EZY Apply's Video KYC. Phase 3 lets branch staff book meetings on a customer's behalf. Every visit arrives with its purpose known, so staff can prepare, serve on time and use the conversation to offer the next right product.</w:t>
       </w:r>
     </w:p>
     <w:tbl>
@@ -698,7 +698,49 @@
     <w:p>
       <w:pPr/>
       <w:r>
-        <w:t xml:space="preserve">Release 1 covers booking in the EZY app, video calls, and the branch portal. Anything the EZY app already does on its own is out of scope, so customers are never sent to a branch for it.</w:t>
+        <w:t xml:space="preserve">EZY Meet is delivered in three phases, each usable on its own. Anything the EZY app already does on its own is out of scope, so customers are never sent to a branch for it.</w:t>
+      </w:r>
+    </w:p>
+    <w:p>
+      <w:pPr/>
+      <w:r>
+        <w:drawing>
+          <wp:inline distT="0" distB="0" distL="0" distR="0">
+            <wp:extent cx="5486400" cy="1869621"/>
+            <wp:docPr id="1" name="image1" descr="Roadmap · 3 phases"/>
+            <a:graphic xmlns:a="http://schemas.openxmlformats.org/drawingml/2006/main">
+              <a:graphicData uri="http://schemas.openxmlformats.org/drawingml/2006/picture">
+                <pic:pic xmlns:pic="http://schemas.openxmlformats.org/drawingml/2006/picture">
+                  <pic:nvPicPr>
+                    <pic:cNvPr id="1" name="image1" descr="Roadmap · 3 phases"/>
+                    <pic:cNvPicPr/>
+                  </pic:nvPicPr>
+                  <pic:blipFill>
+                    <a:blip r:embed="rId5"/>
+                    <a:stretch>
+                      <a:fillRect/>
+                    </a:stretch>
+                  </pic:blipFill>
+                  <pic:spPr>
+                    <a:xfrm>
+                      <a:off x="0" y="0"/>
+                      <a:ext cx="5486400" cy="1869621"/>
+                    </a:xfrm>
+                    <a:prstGeom prst="rect">
+                      <a:avLst/>
+                    </a:prstGeom>
+                  </pic:spPr>
+                </pic:pic>
+              </a:graphicData>
+            </a:graphic>
+          </wp:inline>
+        </w:drawing>
+      </w:r>
+    </w:p>
+    <w:p>
+      <w:pPr/>
+      <w:r>
+        <w:t xml:space="preserve">Roadmap · 3 phases</w:t>
       </w:r>
     </w:p>
     <w:p>
@@ -707,7 +749,7 @@
         <w:rPr>
           <w:b/>
         </w:rPr>
-        <w:t xml:space="preserve">In scope</w:t>
+        <w:t xml:space="preserve">Phase 1 — Branch visits with the EZY app</w:t>
       </w:r>
     </w:p>
     <w:p>
@@ -743,7 +785,7 @@
         </w:numPr>
       </w:pPr>
       <w:r>
-        <w:t xml:space="preserve">Video-call booking and instant "talk to an advisor now" for advisory services.</w:t>
+        <w:t xml:space="preserve">Confirmation with QR code and reference, Priority Service, calendar and directions.</w:t>
       </w:r>
     </w:p>
     <w:p>
@@ -755,7 +797,7 @@
         </w:numPr>
       </w:pPr>
       <w:r>
-        <w:t xml:space="preserve">Confirmation with QR code and reference, Priority Service, calendar and directions.</w:t>
+        <w:t xml:space="preserve">My Appointments: view, reschedule, cancel.</w:t>
       </w:r>
     </w:p>
     <w:p>
@@ -767,19 +809,7 @@
         </w:numPr>
       </w:pPr>
       <w:r>
-        <w:t xml:space="preserve">My Appointments: view, reschedule, cancel.</w:t>
-      </w:r>
-    </w:p>
-    <w:p>
-      <w:pPr>
-        <w:pStyle w:val="ListParagraph"/>
-        <w:numPr>
-          <w:ilvl w:val="0"/>
-          <w:numId w:val="2"/>
-        </w:numPr>
-      </w:pPr>
-      <w:r>
-        <w:t xml:space="preserve">Branch portal: today's queue, check-in, schedule, video desk, slots and capacity, and follow-up leads after each visit.</w:t>
+        <w:t xml:space="preserve">Branch portal: today's queue, check-in, schedule, slots and capacity, and follow-up leads after each visit.</w:t>
       </w:r>
     </w:p>
     <w:p>
@@ -788,7 +818,7 @@
         <w:rPr>
           <w:b/>
         </w:rPr>
-        <w:t xml:space="preserve">Out of scope</w:t>
+        <w:t xml:space="preserve">Phase 2 — Video calls and Video KYC, with EZY Apply</w:t>
       </w:r>
     </w:p>
     <w:p>
@@ -800,7 +830,7 @@
         </w:numPr>
       </w:pPr>
       <w:r>
-        <w:t xml:space="preserve">Services the EZY app already handles: savings and FD opening, FD upliftment, investment planner, cashback loan, cheque book request, stop cheque, LKR fund transfers, standing orders.</w:t>
+        <w:t xml:space="preserve">The Video Call tab opens in the EZY app: "talk to an advisor now" and scheduled video calls for every branch-or-video service.</w:t>
       </w:r>
     </w:p>
     <w:p>
@@ -812,7 +842,7 @@
         </w:numPr>
       </w:pPr>
       <w:r>
-        <w:t xml:space="preserve">Walk-in queue tokens for customers without a booking (existing branch queue system).</w:t>
+        <w:t xml:space="preserve">Video KYC connects to EZY Apply, the bank's digital onboarding portal. An applicant who reaches the identity step books a Video KYC slot, or joins a live advisor, through the EZY Meet slot engine and video desk.</w:t>
       </w:r>
     </w:p>
     <w:p>
@@ -824,16 +854,7 @@
         </w:numPr>
       </w:pPr>
       <w:r>
-        <w:t xml:space="preserve">Head-office analytics dashboards (later release).</w:t>
-      </w:r>
-    </w:p>
-    <w:p>
-      <w:pPr/>
-      <w:r>
-        <w:rPr>
-          <w:b/>
-        </w:rPr>
-        <w:t xml:space="preserve">Phase 2 — Video KYC with EZY Apply</w:t>
+        <w:t xml:space="preserve">If Video KYC cannot be completed, the applicant books a branch visit through EZY Meet with the application reference attached.</w:t>
       </w:r>
     </w:p>
     <w:p>
@@ -841,11 +862,11 @@
         <w:pStyle w:val="ListParagraph"/>
         <w:numPr>
           <w:ilvl w:val="0"/>
-          <w:numId w:val="4"/>
+          <w:numId w:val="3"/>
         </w:numPr>
       </w:pPr>
       <w:r>
-        <w:t xml:space="preserve">Video KYC is delivered with EZY Apply, the bank's digital onboarding portal, not as a stand-alone EZY Meet service.</w:t>
+        <w:t xml:space="preserve">Once the account is opened, the new customer is invited to the EZY app, where EZY Meet is ready for their next visit.</w:t>
       </w:r>
     </w:p>
     <w:p>
@@ -853,35 +874,11 @@
         <w:pStyle w:val="ListParagraph"/>
         <w:numPr>
           <w:ilvl w:val="0"/>
-          <w:numId w:val="4"/>
+          <w:numId w:val="3"/>
         </w:numPr>
       </w:pPr>
       <w:r>
-        <w:t xml:space="preserve">An EZY Apply applicant who reaches the identity step books a Video KYC slot, or joins a live advisor, using the EZY Meet slot engine and video desk.</w:t>
-      </w:r>
-    </w:p>
-    <w:p>
-      <w:pPr>
-        <w:pStyle w:val="ListParagraph"/>
-        <w:numPr>
-          <w:ilvl w:val="0"/>
-          <w:numId w:val="4"/>
-        </w:numPr>
-      </w:pPr>
-      <w:r>
-        <w:t xml:space="preserve">If Video KYC cannot be completed, the applicant books a branch visit through EZY Meet with the application reference attached.</w:t>
-      </w:r>
-    </w:p>
-    <w:p>
-      <w:pPr>
-        <w:pStyle w:val="ListParagraph"/>
-        <w:numPr>
-          <w:ilvl w:val="0"/>
-          <w:numId w:val="4"/>
-        </w:numPr>
-      </w:pPr>
-      <w:r>
-        <w:t xml:space="preserve">Once the account is opened, the new customer is invited to the EZY app, where EZY Meet is ready for their next visit.</w:t>
+        <w:t xml:space="preserve">The branch portal gains the video desk for advisors.</w:t>
       </w:r>
     </w:p>
     <w:p>
@@ -890,16 +887,16 @@
         <w:drawing>
           <wp:inline distT="0" distB="0" distL="0" distR="0">
             <wp:extent cx="5486400" cy="1983921"/>
-            <wp:docPr id="1" name="image1" descr="Phase 2 flow · EZY Apply to account, by video or at a branch"/>
+            <wp:docPr id="2" name="image2" descr="Phase 2 flow · EZY Apply to account, by video or at a branch"/>
             <a:graphic xmlns:a="http://schemas.openxmlformats.org/drawingml/2006/main">
               <a:graphicData uri="http://schemas.openxmlformats.org/drawingml/2006/picture">
                 <pic:pic xmlns:pic="http://schemas.openxmlformats.org/drawingml/2006/picture">
                   <pic:nvPicPr>
-                    <pic:cNvPr id="1" name="image1" descr="Phase 2 flow · EZY Apply to account, by video or at a branch"/>
+                    <pic:cNvPr id="2" name="image2" descr="Phase 2 flow · EZY Apply to account, by video or at a branch"/>
                     <pic:cNvPicPr/>
                   </pic:nvPicPr>
                   <pic:blipFill>
-                    <a:blip r:embed="rId5"/>
+                    <a:blip r:embed="rId6"/>
                     <a:stretch>
                       <a:fillRect/>
                     </a:stretch>
@@ -933,6 +930,96 @@
       </w:r>
     </w:p>
     <w:p>
+      <w:pPr/>
+      <w:r>
+        <w:rPr>
+          <w:b/>
+        </w:rPr>
+        <w:t xml:space="preserve">Phase 3 — Booking on a customer's behalf</w:t>
+      </w:r>
+    </w:p>
+    <w:p>
+      <w:pPr>
+        <w:pStyle w:val="ListParagraph"/>
+        <w:numPr>
+          <w:ilvl w:val="0"/>
+          <w:numId w:val="4"/>
+        </w:numPr>
+      </w:pPr>
+      <w:r>
+        <w:t xml:space="preserve">Branch staff and relationship managers book a branch visit or a video call for a customer from the branch portal, using the same slots customers see.</w:t>
+      </w:r>
+    </w:p>
+    <w:p>
+      <w:pPr>
+        <w:pStyle w:val="ListParagraph"/>
+        <w:numPr>
+          <w:ilvl w:val="0"/>
+          <w:numId w:val="4"/>
+        </w:numPr>
+      </w:pPr>
+      <w:r>
+        <w:t xml:space="preserve">Typical uses: a walk-in who should come back with documents, a follow-up from a lead, a customer who phones the branch, an RM review meeting.</w:t>
+      </w:r>
+    </w:p>
+    <w:p>
+      <w:pPr>
+        <w:pStyle w:val="ListParagraph"/>
+        <w:numPr>
+          <w:ilvl w:val="0"/>
+          <w:numId w:val="4"/>
+        </w:numPr>
+      </w:pPr>
+      <w:r>
+        <w:t xml:space="preserve">The customer gets the same confirmation by SMS and push, and the booking appears in their EZY app to reschedule or cancel.</w:t>
+      </w:r>
+    </w:p>
+    <w:p>
+      <w:pPr/>
+      <w:r>
+        <w:rPr>
+          <w:b/>
+        </w:rPr>
+        <w:t xml:space="preserve">Out of scope (all phases)</w:t>
+      </w:r>
+    </w:p>
+    <w:p>
+      <w:pPr>
+        <w:pStyle w:val="ListParagraph"/>
+        <w:numPr>
+          <w:ilvl w:val="0"/>
+          <w:numId w:val="5"/>
+        </w:numPr>
+      </w:pPr>
+      <w:r>
+        <w:t xml:space="preserve">Services the EZY app already handles: savings and FD opening, FD upliftment, investment planner, cashback loan, cheque book request, stop cheque, LKR fund transfers, standing orders.</w:t>
+      </w:r>
+    </w:p>
+    <w:p>
+      <w:pPr>
+        <w:pStyle w:val="ListParagraph"/>
+        <w:numPr>
+          <w:ilvl w:val="0"/>
+          <w:numId w:val="5"/>
+        </w:numPr>
+      </w:pPr>
+      <w:r>
+        <w:t xml:space="preserve">Walk-in queue tokens for customers without a booking (existing branch queue system).</w:t>
+      </w:r>
+    </w:p>
+    <w:p>
+      <w:pPr>
+        <w:pStyle w:val="ListParagraph"/>
+        <w:numPr>
+          <w:ilvl w:val="0"/>
+          <w:numId w:val="5"/>
+        </w:numPr>
+      </w:pPr>
+      <w:r>
+        <w:t xml:space="preserve">Head-office analytics dashboards (later release).</w:t>
+      </w:r>
+    </w:p>
+    <w:p>
       <w:pPr>
         <w:pStyle w:val="Heading2"/>
       </w:pPr>
@@ -1058,7 +1145,7 @@
           <w:p>
             <w:pPr/>
             <w:r>
-              <w:t xml:space="preserve">See who is coming, check them in, move them through</w:t>
+              <w:t xml:space="preserve">See who is coming, check them in, move them through; book for customers (Phase 3)</w:t>
             </w:r>
           </w:p>
         </w:tc>
@@ -1106,7 +1193,7 @@
           <w:p>
             <w:pPr/>
             <w:r>
-              <w:t xml:space="preserve">Virtual advisor</w:t>
+              <w:t xml:space="preserve">Virtual advisor (Phase 2)</w:t>
             </w:r>
           </w:p>
         </w:tc>
@@ -1293,7 +1380,7 @@
         <w:pStyle w:val="ListParagraph"/>
         <w:numPr>
           <w:ilvl w:val="0"/>
-          <w:numId w:val="5"/>
+          <w:numId w:val="6"/>
         </w:numPr>
       </w:pPr>
       <w:r>
@@ -1311,7 +1398,7 @@
         <w:pStyle w:val="ListParagraph"/>
         <w:numPr>
           <w:ilvl w:val="0"/>
-          <w:numId w:val="5"/>
+          <w:numId w:val="6"/>
         </w:numPr>
       </w:pPr>
       <w:r>
@@ -1329,7 +1416,7 @@
         <w:pStyle w:val="ListParagraph"/>
         <w:numPr>
           <w:ilvl w:val="0"/>
-          <w:numId w:val="5"/>
+          <w:numId w:val="6"/>
         </w:numPr>
       </w:pPr>
       <w:r>
@@ -1347,7 +1434,7 @@
         <w:pStyle w:val="ListParagraph"/>
         <w:numPr>
           <w:ilvl w:val="0"/>
-          <w:numId w:val="5"/>
+          <w:numId w:val="6"/>
         </w:numPr>
       </w:pPr>
       <w:r>
@@ -1365,7 +1452,7 @@
         <w:pStyle w:val="ListParagraph"/>
         <w:numPr>
           <w:ilvl w:val="0"/>
-          <w:numId w:val="5"/>
+          <w:numId w:val="6"/>
         </w:numPr>
       </w:pPr>
       <w:r>
@@ -1383,7 +1470,7 @@
         <w:pStyle w:val="ListParagraph"/>
         <w:numPr>
           <w:ilvl w:val="0"/>
-          <w:numId w:val="5"/>
+          <w:numId w:val="6"/>
         </w:numPr>
       </w:pPr>
       <w:r>
@@ -1402,57 +1489,12 @@
         <w:drawing>
           <wp:inline distT="0" distB="0" distL="0" distR="0">
             <wp:extent cx="5486400" cy="3866307"/>
-            <wp:docPr id="2" name="image2" descr="Home, service list, recommended branch"/>
+            <wp:docPr id="3" name="image3" descr="Home, service list, recommended branch"/>
             <a:graphic xmlns:a="http://schemas.openxmlformats.org/drawingml/2006/main">
               <a:graphicData uri="http://schemas.openxmlformats.org/drawingml/2006/picture">
                 <pic:pic xmlns:pic="http://schemas.openxmlformats.org/drawingml/2006/picture">
                   <pic:nvPicPr>
-                    <pic:cNvPr id="2" name="image2" descr="Home, service list, recommended branch"/>
-                    <pic:cNvPicPr/>
-                  </pic:nvPicPr>
-                  <pic:blipFill>
-                    <a:blip r:embed="rId6"/>
-                    <a:stretch>
-                      <a:fillRect/>
-                    </a:stretch>
-                  </pic:blipFill>
-                  <pic:spPr>
-                    <a:xfrm>
-                      <a:off x="0" y="0"/>
-                      <a:ext cx="5486400" cy="3866307"/>
-                    </a:xfrm>
-                    <a:prstGeom prst="rect">
-                      <a:avLst/>
-                    </a:prstGeom>
-                  </pic:spPr>
-                </pic:pic>
-              </a:graphicData>
-            </a:graphic>
-          </wp:inline>
-        </w:drawing>
-      </w:r>
-    </w:p>
-    <w:p>
-      <w:pPr/>
-      <w:r>
-        <w:rPr>
-          <w:i/>
-        </w:rPr>
-        <w:t xml:space="preserve">Home with the EZY Meet widget · service list · smart recommendation</w:t>
-      </w:r>
-    </w:p>
-    <w:p>
-      <w:pPr/>
-      <w:r>
-        <w:drawing>
-          <wp:inline distT="0" distB="0" distL="0" distR="0">
-            <wp:extent cx="5486400" cy="3866307"/>
-            <wp:docPr id="3" name="image3" descr="Time, confirm, confirmation"/>
-            <a:graphic xmlns:a="http://schemas.openxmlformats.org/drawingml/2006/main">
-              <a:graphicData uri="http://schemas.openxmlformats.org/drawingml/2006/picture">
-                <pic:pic xmlns:pic="http://schemas.openxmlformats.org/drawingml/2006/picture">
-                  <pic:nvPicPr>
-                    <pic:cNvPr id="3" name="image3" descr="Time, confirm, confirmation"/>
+                    <pic:cNvPr id="3" name="image3" descr="Home, service list, recommended branch"/>
                     <pic:cNvPicPr/>
                   </pic:nvPicPr>
                   <pic:blipFill>
@@ -1483,6 +1525,51 @@
         <w:rPr>
           <w:i/>
         </w:rPr>
+        <w:t xml:space="preserve">Home with the EZY Meet widget · service list · smart recommendation</w:t>
+      </w:r>
+    </w:p>
+    <w:p>
+      <w:pPr/>
+      <w:r>
+        <w:drawing>
+          <wp:inline distT="0" distB="0" distL="0" distR="0">
+            <wp:extent cx="5486400" cy="3866307"/>
+            <wp:docPr id="4" name="image4" descr="Time, confirm, confirmation"/>
+            <a:graphic xmlns:a="http://schemas.openxmlformats.org/drawingml/2006/main">
+              <a:graphicData uri="http://schemas.openxmlformats.org/drawingml/2006/picture">
+                <pic:pic xmlns:pic="http://schemas.openxmlformats.org/drawingml/2006/picture">
+                  <pic:nvPicPr>
+                    <pic:cNvPr id="4" name="image4" descr="Time, confirm, confirmation"/>
+                    <pic:cNvPicPr/>
+                  </pic:nvPicPr>
+                  <pic:blipFill>
+                    <a:blip r:embed="rId8"/>
+                    <a:stretch>
+                      <a:fillRect/>
+                    </a:stretch>
+                  </pic:blipFill>
+                  <pic:spPr>
+                    <a:xfrm>
+                      <a:off x="0" y="0"/>
+                      <a:ext cx="5486400" cy="3866307"/>
+                    </a:xfrm>
+                    <a:prstGeom prst="rect">
+                      <a:avLst/>
+                    </a:prstGeom>
+                  </pic:spPr>
+                </pic:pic>
+              </a:graphicData>
+            </a:graphic>
+          </wp:inline>
+        </w:drawing>
+      </w:r>
+    </w:p>
+    <w:p>
+      <w:pPr/>
+      <w:r>
+        <w:rPr>
+          <w:i/>
+        </w:rPr>
         <w:t xml:space="preserve">Optional time picker · confirm sheet · confirmation with QR code</w:t>
       </w:r>
     </w:p>
@@ -1504,16 +1591,16 @@
         <w:drawing>
           <wp:inline distT="0" distB="0" distL="0" distR="0">
             <wp:extent cx="5486400" cy="5742122"/>
-            <wp:docPr id="4" name="image4" descr="Upcoming appointment and its actions"/>
+            <wp:docPr id="5" name="image5" descr="Upcoming appointment and its actions"/>
             <a:graphic xmlns:a="http://schemas.openxmlformats.org/drawingml/2006/main">
               <a:graphicData uri="http://schemas.openxmlformats.org/drawingml/2006/picture">
                 <pic:pic xmlns:pic="http://schemas.openxmlformats.org/drawingml/2006/picture">
                   <pic:nvPicPr>
-                    <pic:cNvPr id="4" name="image4" descr="Upcoming appointment and its actions"/>
+                    <pic:cNvPr id="5" name="image5" descr="Upcoming appointment and its actions"/>
                     <pic:cNvPicPr/>
                   </pic:nvPicPr>
                   <pic:blipFill>
-                    <a:blip r:embed="rId8"/>
+                    <a:blip r:embed="rId9"/>
                     <a:stretch>
                       <a:fillRect/>
                     </a:stretch>
@@ -1540,10 +1627,10 @@
         <w:rPr>
           <w:b/>
         </w:rPr>
-        <w:t xml:space="preserve">Video calls.</w:t>
-      </w:r>
-      <w:r>
-        <w:t xml:space="preserve"> The Video Call tab offers "talk to an advisor now" and every service that can be done by video. A video booking is date, time and Confirm. The prototype also shows the Phase 2 Video KYC booking with document upload, which will be reached from EZY Apply.</w:t>
+        <w:t xml:space="preserve">Video calls (Phase 2).</w:t>
+      </w:r>
+      <w:r>
+        <w:t xml:space="preserve"> The Video Call tab offers "talk to an advisor now" and every service that can be done by video; a booking is date, time and Confirm. Video KYC is reached from EZY Apply and uses the same booking and video desk.</w:t>
       </w:r>
     </w:p>
     <w:p>
@@ -1552,16 +1639,16 @@
         <w:drawing>
           <wp:inline distT="0" distB="0" distL="0" distR="0">
             <wp:extent cx="5486400" cy="3866307"/>
-            <wp:docPr id="5" name="image5" descr="Video tab, Video KYC booking, video call"/>
+            <wp:docPr id="6" name="image6" descr="Video tab, Video KYC booking, video call"/>
             <a:graphic xmlns:a="http://schemas.openxmlformats.org/drawingml/2006/main">
               <a:graphicData uri="http://schemas.openxmlformats.org/drawingml/2006/picture">
                 <pic:pic xmlns:pic="http://schemas.openxmlformats.org/drawingml/2006/picture">
                   <pic:nvPicPr>
-                    <pic:cNvPr id="5" name="image5" descr="Video tab, Video KYC booking, video call"/>
+                    <pic:cNvPr id="6" name="image6" descr="Video tab, Video KYC booking, video call"/>
                     <pic:cNvPicPr/>
                   </pic:nvPicPr>
                   <pic:blipFill>
-                    <a:blip r:embed="rId9"/>
+                    <a:blip r:embed="rId10"/>
                     <a:stretch>
                       <a:fillRect/>
                     </a:stretch>
@@ -1588,7 +1675,7 @@
         <w:rPr>
           <w:i/>
         </w:rPr>
-        <w:t xml:space="preserve">Video Call tab · Video KYC booking (Phase 2, via EZY Apply) · video call</w:t>
+        <w:t xml:space="preserve">Phase 2: Video Call tab · Video KYC booking (from EZY Apply) · video call</w:t>
       </w:r>
     </w:p>
     <w:p>
@@ -1602,7 +1689,7 @@
     <w:p>
       <w:pPr/>
       <w:r>
-        <w:t xml:space="preserve">Each service is offered on the channel that suits it. Branch only: it needs cash, original documents, a wet signature, or a card or locker in person. Branch or video: advisory work, or requests the bank can verify on a video call. TAT is the estimated service time shown to customers.</w:t>
+        <w:t xml:space="preserve">Each service is offered on the channel that suits it. Branch only: it needs cash, original documents, a wet signature, or a card or locker in person. Branch or video: advisory work, or requests the bank can verify on a video call; in Phase 1 these are booked as branch visits, and video opens in Phase 2. TAT is the estimated service time shown to customers.</w:t>
       </w:r>
     </w:p>
     <w:tbl>
@@ -3621,7 +3708,7 @@
     <w:p>
       <w:pPr/>
       <w:r>
-        <w:t xml:space="preserve">Priority: Must = needed for launch, Should = launch if possible, Could = later.</w:t>
+        <w:t xml:space="preserve">Phase: when the requirement ships. Priority within its phase: Must = needed for that phase, Should = if possible, Could = later.</w:t>
       </w:r>
     </w:p>
     <w:tbl>
@@ -3632,9 +3719,10 @@
         <w:tblLook w:val="04A0" w:firstRow="1" w:lastRow="0" w:firstColumn="0" w:lastColumn="0" w:noHBand="0" w:noVBand="1"/>
       </w:tblPr>
       <w:tblGrid>
-        <w:gridCol w:w="1192"/>
-        <w:gridCol w:w="6757"/>
-        <w:gridCol w:w="1410"/>
+        <w:gridCol w:w="1057"/>
+        <w:gridCol w:w="5993"/>
+        <w:gridCol w:w="1058"/>
+        <w:gridCol w:w="1251"/>
       </w:tblGrid>
       <w:tr>
         <w:trPr>
@@ -3642,7 +3730,7 @@
         </w:trPr>
         <w:tc>
           <w:tcPr>
-            <w:tcW w:w="1192" w:type="dxa"/>
+            <w:tcW w:w="1057" w:type="dxa"/>
             <w:shd w:val="clear" w:color="auto" w:fill="F2F2F2"/>
           </w:tcPr>
           <w:p>
@@ -3654,7 +3742,7 @@
         </w:tc>
         <w:tc>
           <w:tcPr>
-            <w:tcW w:w="6757" w:type="dxa"/>
+            <w:tcW w:w="5993" w:type="dxa"/>
             <w:shd w:val="clear" w:color="auto" w:fill="F2F2F2"/>
           </w:tcPr>
           <w:p>
@@ -3666,12 +3754,24 @@
         </w:tc>
         <w:tc>
           <w:tcPr>
-            <w:tcW w:w="1410" w:type="dxa"/>
+            <w:tcW w:w="1058" w:type="dxa"/>
             <w:shd w:val="clear" w:color="auto" w:fill="F2F2F2"/>
           </w:tcPr>
           <w:p>
             <w:pPr/>
             <w:r>
+              <w:t xml:space="preserve">Phase</w:t>
+            </w:r>
+          </w:p>
+        </w:tc>
+        <w:tc>
+          <w:tcPr>
+            <w:tcW w:w="1251" w:type="dxa"/>
+            <w:shd w:val="clear" w:color="auto" w:fill="F2F2F2"/>
+          </w:tcPr>
+          <w:p>
+            <w:pPr/>
+            <w:r>
               <w:t xml:space="preserve">Priority</w:t>
             </w:r>
           </w:p>
@@ -3680,7 +3780,7 @@
       <w:tr>
         <w:tc>
           <w:tcPr>
-            <w:tcW w:w="1192" w:type="dxa"/>
+            <w:tcW w:w="1057" w:type="dxa"/>
           </w:tcPr>
           <w:p>
             <w:pPr/>
@@ -3691,7 +3791,7 @@
         </w:tc>
         <w:tc>
           <w:tcPr>
-            <w:tcW w:w="6757" w:type="dxa"/>
+            <w:tcW w:w="5993" w:type="dxa"/>
           </w:tcPr>
           <w:p>
             <w:pPr/>
@@ -3702,7 +3802,18 @@
         </w:tc>
         <w:tc>
           <w:tcPr>
-            <w:tcW w:w="1410" w:type="dxa"/>
+            <w:tcW w:w="1058" w:type="dxa"/>
+          </w:tcPr>
+          <w:p>
+            <w:pPr/>
+            <w:r>
+              <w:t xml:space="preserve">1</w:t>
+            </w:r>
+          </w:p>
+        </w:tc>
+        <w:tc>
+          <w:tcPr>
+            <w:tcW w:w="1251" w:type="dxa"/>
           </w:tcPr>
           <w:p>
             <w:pPr/>
@@ -3715,7 +3826,7 @@
       <w:tr>
         <w:tc>
           <w:tcPr>
-            <w:tcW w:w="1192" w:type="dxa"/>
+            <w:tcW w:w="1057" w:type="dxa"/>
           </w:tcPr>
           <w:p>
             <w:pPr/>
@@ -3726,7 +3837,7 @@
         </w:tc>
         <w:tc>
           <w:tcPr>
-            <w:tcW w:w="6757" w:type="dxa"/>
+            <w:tcW w:w="5993" w:type="dxa"/>
           </w:tcPr>
           <w:p>
             <w:pPr/>
@@ -3737,7 +3848,18 @@
         </w:tc>
         <w:tc>
           <w:tcPr>
-            <w:tcW w:w="1410" w:type="dxa"/>
+            <w:tcW w:w="1058" w:type="dxa"/>
+          </w:tcPr>
+          <w:p>
+            <w:pPr/>
+            <w:r>
+              <w:t xml:space="preserve">1</w:t>
+            </w:r>
+          </w:p>
+        </w:tc>
+        <w:tc>
+          <w:tcPr>
+            <w:tcW w:w="1251" w:type="dxa"/>
           </w:tcPr>
           <w:p>
             <w:pPr/>
@@ -3750,7 +3872,7 @@
       <w:tr>
         <w:tc>
           <w:tcPr>
-            <w:tcW w:w="1192" w:type="dxa"/>
+            <w:tcW w:w="1057" w:type="dxa"/>
           </w:tcPr>
           <w:p>
             <w:pPr/>
@@ -3761,18 +3883,29 @@
         </w:tc>
         <w:tc>
           <w:tcPr>
-            <w:tcW w:w="6757" w:type="dxa"/>
-          </w:tcPr>
-          <w:p>
-            <w:pPr/>
-            <w:r>
-              <w:t xml:space="preserve">EZY Meet has two tabs, Visit Branch and Video Call, and a link to My Appointments when bookings exist.</w:t>
-            </w:r>
-          </w:p>
-        </w:tc>
-        <w:tc>
-          <w:tcPr>
-            <w:tcW w:w="1410" w:type="dxa"/>
+            <w:tcW w:w="5993" w:type="dxa"/>
+          </w:tcPr>
+          <w:p>
+            <w:pPr/>
+            <w:r>
+              <w:t xml:space="preserve">EZY Meet opens on the branch-visit service list, with a link to My Appointments when bookings exist.</w:t>
+            </w:r>
+          </w:p>
+        </w:tc>
+        <w:tc>
+          <w:tcPr>
+            <w:tcW w:w="1058" w:type="dxa"/>
+          </w:tcPr>
+          <w:p>
+            <w:pPr/>
+            <w:r>
+              <w:t xml:space="preserve">1</w:t>
+            </w:r>
+          </w:p>
+        </w:tc>
+        <w:tc>
+          <w:tcPr>
+            <w:tcW w:w="1251" w:type="dxa"/>
           </w:tcPr>
           <w:p>
             <w:pPr/>
@@ -3785,7 +3918,7 @@
       <w:tr>
         <w:tc>
           <w:tcPr>
-            <w:tcW w:w="1192" w:type="dxa"/>
+            <w:tcW w:w="1057" w:type="dxa"/>
           </w:tcPr>
           <w:p>
             <w:pPr/>
@@ -3796,7 +3929,7 @@
         </w:tc>
         <w:tc>
           <w:tcPr>
-            <w:tcW w:w="6757" w:type="dxa"/>
+            <w:tcW w:w="5993" w:type="dxa"/>
           </w:tcPr>
           <w:p>
             <w:pPr/>
@@ -3807,7 +3940,18 @@
         </w:tc>
         <w:tc>
           <w:tcPr>
-            <w:tcW w:w="1410" w:type="dxa"/>
+            <w:tcW w:w="1058" w:type="dxa"/>
+          </w:tcPr>
+          <w:p>
+            <w:pPr/>
+            <w:r>
+              <w:t xml:space="preserve">1</w:t>
+            </w:r>
+          </w:p>
+        </w:tc>
+        <w:tc>
+          <w:tcPr>
+            <w:tcW w:w="1251" w:type="dxa"/>
           </w:tcPr>
           <w:p>
             <w:pPr/>
@@ -3820,7 +3964,7 @@
       <w:tr>
         <w:tc>
           <w:tcPr>
-            <w:tcW w:w="1192" w:type="dxa"/>
+            <w:tcW w:w="1057" w:type="dxa"/>
           </w:tcPr>
           <w:p>
             <w:pPr/>
@@ -3831,7 +3975,7 @@
         </w:tc>
         <w:tc>
           <w:tcPr>
-            <w:tcW w:w="6757" w:type="dxa"/>
+            <w:tcW w:w="5993" w:type="dxa"/>
           </w:tcPr>
           <w:p>
             <w:pPr/>
@@ -3842,7 +3986,18 @@
         </w:tc>
         <w:tc>
           <w:tcPr>
-            <w:tcW w:w="1410" w:type="dxa"/>
+            <w:tcW w:w="1058" w:type="dxa"/>
+          </w:tcPr>
+          <w:p>
+            <w:pPr/>
+            <w:r>
+              <w:t xml:space="preserve">1</w:t>
+            </w:r>
+          </w:p>
+        </w:tc>
+        <w:tc>
+          <w:tcPr>
+            <w:tcW w:w="1251" w:type="dxa"/>
           </w:tcPr>
           <w:p>
             <w:pPr/>
@@ -3855,7 +4010,7 @@
       <w:tr>
         <w:tc>
           <w:tcPr>
-            <w:tcW w:w="1192" w:type="dxa"/>
+            <w:tcW w:w="1057" w:type="dxa"/>
           </w:tcPr>
           <w:p>
             <w:pPr/>
@@ -3866,7 +4021,7 @@
         </w:tc>
         <w:tc>
           <w:tcPr>
-            <w:tcW w:w="6757" w:type="dxa"/>
+            <w:tcW w:w="5993" w:type="dxa"/>
           </w:tcPr>
           <w:p>
             <w:pPr/>
@@ -3877,7 +4032,18 @@
         </w:tc>
         <w:tc>
           <w:tcPr>
-            <w:tcW w:w="1410" w:type="dxa"/>
+            <w:tcW w:w="1058" w:type="dxa"/>
+          </w:tcPr>
+          <w:p>
+            <w:pPr/>
+            <w:r>
+              <w:t xml:space="preserve">1</w:t>
+            </w:r>
+          </w:p>
+        </w:tc>
+        <w:tc>
+          <w:tcPr>
+            <w:tcW w:w="1251" w:type="dxa"/>
           </w:tcPr>
           <w:p>
             <w:pPr/>
@@ -3890,7 +4056,7 @@
       <w:tr>
         <w:tc>
           <w:tcPr>
-            <w:tcW w:w="1192" w:type="dxa"/>
+            <w:tcW w:w="1057" w:type="dxa"/>
           </w:tcPr>
           <w:p>
             <w:pPr/>
@@ -3901,7 +4067,7 @@
         </w:tc>
         <w:tc>
           <w:tcPr>
-            <w:tcW w:w="6757" w:type="dxa"/>
+            <w:tcW w:w="5993" w:type="dxa"/>
           </w:tcPr>
           <w:p>
             <w:pPr/>
@@ -3912,7 +4078,18 @@
         </w:tc>
         <w:tc>
           <w:tcPr>
-            <w:tcW w:w="1410" w:type="dxa"/>
+            <w:tcW w:w="1058" w:type="dxa"/>
+          </w:tcPr>
+          <w:p>
+            <w:pPr/>
+            <w:r>
+              <w:t xml:space="preserve">1</w:t>
+            </w:r>
+          </w:p>
+        </w:tc>
+        <w:tc>
+          <w:tcPr>
+            <w:tcW w:w="1251" w:type="dxa"/>
           </w:tcPr>
           <w:p>
             <w:pPr/>
@@ -3925,7 +4102,7 @@
       <w:tr>
         <w:tc>
           <w:tcPr>
-            <w:tcW w:w="1192" w:type="dxa"/>
+            <w:tcW w:w="1057" w:type="dxa"/>
           </w:tcPr>
           <w:p>
             <w:pPr/>
@@ -3936,7 +4113,7 @@
         </w:tc>
         <w:tc>
           <w:tcPr>
-            <w:tcW w:w="6757" w:type="dxa"/>
+            <w:tcW w:w="5993" w:type="dxa"/>
           </w:tcPr>
           <w:p>
             <w:pPr/>
@@ -3947,7 +4124,18 @@
         </w:tc>
         <w:tc>
           <w:tcPr>
-            <w:tcW w:w="1410" w:type="dxa"/>
+            <w:tcW w:w="1058" w:type="dxa"/>
+          </w:tcPr>
+          <w:p>
+            <w:pPr/>
+            <w:r>
+              <w:t xml:space="preserve">1</w:t>
+            </w:r>
+          </w:p>
+        </w:tc>
+        <w:tc>
+          <w:tcPr>
+            <w:tcW w:w="1251" w:type="dxa"/>
           </w:tcPr>
           <w:p>
             <w:pPr/>
@@ -3960,7 +4148,7 @@
       <w:tr>
         <w:tc>
           <w:tcPr>
-            <w:tcW w:w="1192" w:type="dxa"/>
+            <w:tcW w:w="1057" w:type="dxa"/>
           </w:tcPr>
           <w:p>
             <w:pPr/>
@@ -3971,7 +4159,7 @@
         </w:tc>
         <w:tc>
           <w:tcPr>
-            <w:tcW w:w="6757" w:type="dxa"/>
+            <w:tcW w:w="5993" w:type="dxa"/>
           </w:tcPr>
           <w:p>
             <w:pPr/>
@@ -3982,7 +4170,18 @@
         </w:tc>
         <w:tc>
           <w:tcPr>
-            <w:tcW w:w="1410" w:type="dxa"/>
+            <w:tcW w:w="1058" w:type="dxa"/>
+          </w:tcPr>
+          <w:p>
+            <w:pPr/>
+            <w:r>
+              <w:t xml:space="preserve">1</w:t>
+            </w:r>
+          </w:p>
+        </w:tc>
+        <w:tc>
+          <w:tcPr>
+            <w:tcW w:w="1251" w:type="dxa"/>
           </w:tcPr>
           <w:p>
             <w:pPr/>
@@ -3995,7 +4194,7 @@
       <w:tr>
         <w:tc>
           <w:tcPr>
-            <w:tcW w:w="1192" w:type="dxa"/>
+            <w:tcW w:w="1057" w:type="dxa"/>
           </w:tcPr>
           <w:p>
             <w:pPr/>
@@ -4006,7 +4205,7 @@
         </w:tc>
         <w:tc>
           <w:tcPr>
-            <w:tcW w:w="6757" w:type="dxa"/>
+            <w:tcW w:w="5993" w:type="dxa"/>
           </w:tcPr>
           <w:p>
             <w:pPr/>
@@ -4017,7 +4216,18 @@
         </w:tc>
         <w:tc>
           <w:tcPr>
-            <w:tcW w:w="1410" w:type="dxa"/>
+            <w:tcW w:w="1058" w:type="dxa"/>
+          </w:tcPr>
+          <w:p>
+            <w:pPr/>
+            <w:r>
+              <w:t xml:space="preserve">1</w:t>
+            </w:r>
+          </w:p>
+        </w:tc>
+        <w:tc>
+          <w:tcPr>
+            <w:tcW w:w="1251" w:type="dxa"/>
           </w:tcPr>
           <w:p>
             <w:pPr/>
@@ -4030,7 +4240,7 @@
       <w:tr>
         <w:tc>
           <w:tcPr>
-            <w:tcW w:w="1192" w:type="dxa"/>
+            <w:tcW w:w="1057" w:type="dxa"/>
           </w:tcPr>
           <w:p>
             <w:pPr/>
@@ -4041,7 +4251,7 @@
         </w:tc>
         <w:tc>
           <w:tcPr>
-            <w:tcW w:w="6757" w:type="dxa"/>
+            <w:tcW w:w="5993" w:type="dxa"/>
           </w:tcPr>
           <w:p>
             <w:pPr/>
@@ -4052,7 +4262,18 @@
         </w:tc>
         <w:tc>
           <w:tcPr>
-            <w:tcW w:w="1410" w:type="dxa"/>
+            <w:tcW w:w="1058" w:type="dxa"/>
+          </w:tcPr>
+          <w:p>
+            <w:pPr/>
+            <w:r>
+              <w:t xml:space="preserve">1</w:t>
+            </w:r>
+          </w:p>
+        </w:tc>
+        <w:tc>
+          <w:tcPr>
+            <w:tcW w:w="1251" w:type="dxa"/>
           </w:tcPr>
           <w:p>
             <w:pPr/>
@@ -4065,7 +4286,7 @@
       <w:tr>
         <w:tc>
           <w:tcPr>
-            <w:tcW w:w="1192" w:type="dxa"/>
+            <w:tcW w:w="1057" w:type="dxa"/>
           </w:tcPr>
           <w:p>
             <w:pPr/>
@@ -4076,18 +4297,29 @@
         </w:tc>
         <w:tc>
           <w:tcPr>
-            <w:tcW w:w="6757" w:type="dxa"/>
-          </w:tcPr>
-          <w:p>
-            <w:pPr/>
-            <w:r>
-              <w:t xml:space="preserve">Confirm in a sheet showing service, branch or mode, time, expected wait or duration, documents to bring, and the terms.</w:t>
-            </w:r>
-          </w:p>
-        </w:tc>
-        <w:tc>
-          <w:tcPr>
-            <w:tcW w:w="1410" w:type="dxa"/>
+            <w:tcW w:w="5993" w:type="dxa"/>
+          </w:tcPr>
+          <w:p>
+            <w:pPr/>
+            <w:r>
+              <w:t xml:space="preserve">Confirm in a sheet showing service, branch, time, expected wait, documents to bring, and the terms.</w:t>
+            </w:r>
+          </w:p>
+        </w:tc>
+        <w:tc>
+          <w:tcPr>
+            <w:tcW w:w="1058" w:type="dxa"/>
+          </w:tcPr>
+          <w:p>
+            <w:pPr/>
+            <w:r>
+              <w:t xml:space="preserve">1</w:t>
+            </w:r>
+          </w:p>
+        </w:tc>
+        <w:tc>
+          <w:tcPr>
+            <w:tcW w:w="1251" w:type="dxa"/>
           </w:tcPr>
           <w:p>
             <w:pPr/>
@@ -4100,7 +4332,7 @@
       <w:tr>
         <w:tc>
           <w:tcPr>
-            <w:tcW w:w="1192" w:type="dxa"/>
+            <w:tcW w:w="1057" w:type="dxa"/>
           </w:tcPr>
           <w:p>
             <w:pPr/>
@@ -4111,7 +4343,7 @@
         </w:tc>
         <w:tc>
           <w:tcPr>
-            <w:tcW w:w="6757" w:type="dxa"/>
+            <w:tcW w:w="5993" w:type="dxa"/>
           </w:tcPr>
           <w:p>
             <w:pPr/>
@@ -4122,7 +4354,18 @@
         </w:tc>
         <w:tc>
           <w:tcPr>
-            <w:tcW w:w="1410" w:type="dxa"/>
+            <w:tcW w:w="1058" w:type="dxa"/>
+          </w:tcPr>
+          <w:p>
+            <w:pPr/>
+            <w:r>
+              <w:t xml:space="preserve">1</w:t>
+            </w:r>
+          </w:p>
+        </w:tc>
+        <w:tc>
+          <w:tcPr>
+            <w:tcW w:w="1251" w:type="dxa"/>
           </w:tcPr>
           <w:p>
             <w:pPr/>
@@ -4135,7 +4378,7 @@
       <w:tr>
         <w:tc>
           <w:tcPr>
-            <w:tcW w:w="1192" w:type="dxa"/>
+            <w:tcW w:w="1057" w:type="dxa"/>
           </w:tcPr>
           <w:p>
             <w:pPr/>
@@ -4146,7 +4389,7 @@
         </w:tc>
         <w:tc>
           <w:tcPr>
-            <w:tcW w:w="6757" w:type="dxa"/>
+            <w:tcW w:w="5993" w:type="dxa"/>
           </w:tcPr>
           <w:p>
             <w:pPr/>
@@ -4157,7 +4400,18 @@
         </w:tc>
         <w:tc>
           <w:tcPr>
-            <w:tcW w:w="1410" w:type="dxa"/>
+            <w:tcW w:w="1058" w:type="dxa"/>
+          </w:tcPr>
+          <w:p>
+            <w:pPr/>
+            <w:r>
+              <w:t xml:space="preserve">1</w:t>
+            </w:r>
+          </w:p>
+        </w:tc>
+        <w:tc>
+          <w:tcPr>
+            <w:tcW w:w="1251" w:type="dxa"/>
           </w:tcPr>
           <w:p>
             <w:pPr/>
@@ -4170,7 +4424,7 @@
       <w:tr>
         <w:tc>
           <w:tcPr>
-            <w:tcW w:w="1192" w:type="dxa"/>
+            <w:tcW w:w="1057" w:type="dxa"/>
           </w:tcPr>
           <w:p>
             <w:pPr/>
@@ -4181,7 +4435,7 @@
         </w:tc>
         <w:tc>
           <w:tcPr>
-            <w:tcW w:w="6757" w:type="dxa"/>
+            <w:tcW w:w="5993" w:type="dxa"/>
           </w:tcPr>
           <w:p>
             <w:pPr/>
@@ -4192,7 +4446,18 @@
         </w:tc>
         <w:tc>
           <w:tcPr>
-            <w:tcW w:w="1410" w:type="dxa"/>
+            <w:tcW w:w="1058" w:type="dxa"/>
+          </w:tcPr>
+          <w:p>
+            <w:pPr/>
+            <w:r>
+              <w:t xml:space="preserve">1</w:t>
+            </w:r>
+          </w:p>
+        </w:tc>
+        <w:tc>
+          <w:tcPr>
+            <w:tcW w:w="1251" w:type="dxa"/>
           </w:tcPr>
           <w:p>
             <w:pPr/>
@@ -4205,7 +4470,7 @@
       <w:tr>
         <w:tc>
           <w:tcPr>
-            <w:tcW w:w="1192" w:type="dxa"/>
+            <w:tcW w:w="1057" w:type="dxa"/>
           </w:tcPr>
           <w:p>
             <w:pPr/>
@@ -4216,18 +4481,213 @@
         </w:tc>
         <w:tc>
           <w:tcPr>
-            <w:tcW w:w="6757" w:type="dxa"/>
-          </w:tcPr>
-          <w:p>
-            <w:pPr/>
-            <w:r>
-              <w:t xml:space="preserve">Video Call tab: "talk to an advisor now" with live availability, and scheduling for every video-capable service.</w:t>
-            </w:r>
-          </w:p>
-        </w:tc>
-        <w:tc>
-          <w:tcPr>
-            <w:tcW w:w="1410" w:type="dxa"/>
+            <w:tcW w:w="5993" w:type="dxa"/>
+          </w:tcPr>
+          <w:p>
+            <w:pPr/>
+            <w:r>
+              <w:t xml:space="preserve">Remind the customer the day before (SMS) and 30 minutes before (push).</w:t>
+            </w:r>
+          </w:p>
+        </w:tc>
+        <w:tc>
+          <w:tcPr>
+            <w:tcW w:w="1058" w:type="dxa"/>
+          </w:tcPr>
+          <w:p>
+            <w:pPr/>
+            <w:r>
+              <w:t xml:space="preserve">1</w:t>
+            </w:r>
+          </w:p>
+        </w:tc>
+        <w:tc>
+          <w:tcPr>
+            <w:tcW w:w="1251" w:type="dxa"/>
+          </w:tcPr>
+          <w:p>
+            <w:pPr/>
+            <w:r>
+              <w:t xml:space="preserve">Should</w:t>
+            </w:r>
+          </w:p>
+        </w:tc>
+      </w:tr>
+      <w:tr>
+        <w:tc>
+          <w:tcPr>
+            <w:tcW w:w="1057" w:type="dxa"/>
+          </w:tcPr>
+          <w:p>
+            <w:pPr/>
+            <w:r>
+              <w:t xml:space="preserve">FR-17</w:t>
+            </w:r>
+          </w:p>
+        </w:tc>
+        <w:tc>
+          <w:tcPr>
+            <w:tcW w:w="5993" w:type="dxa"/>
+          </w:tcPr>
+          <w:p>
+            <w:pPr/>
+            <w:r>
+              <w:t xml:space="preserve">Limit each customer to a set number of open bookings, to stop slot hoarding.</w:t>
+            </w:r>
+          </w:p>
+        </w:tc>
+        <w:tc>
+          <w:tcPr>
+            <w:tcW w:w="1058" w:type="dxa"/>
+          </w:tcPr>
+          <w:p>
+            <w:pPr/>
+            <w:r>
+              <w:t xml:space="preserve">1</w:t>
+            </w:r>
+          </w:p>
+        </w:tc>
+        <w:tc>
+          <w:tcPr>
+            <w:tcW w:w="1251" w:type="dxa"/>
+          </w:tcPr>
+          <w:p>
+            <w:pPr/>
+            <w:r>
+              <w:t xml:space="preserve">Should</w:t>
+            </w:r>
+          </w:p>
+        </w:tc>
+      </w:tr>
+      <w:tr>
+        <w:tc>
+          <w:tcPr>
+            <w:tcW w:w="1057" w:type="dxa"/>
+          </w:tcPr>
+          <w:p>
+            <w:pPr/>
+            <w:r>
+              <w:t xml:space="preserve">FR-18</w:t>
+            </w:r>
+          </w:p>
+        </w:tc>
+        <w:tc>
+          <w:tcPr>
+            <w:tcW w:w="5993" w:type="dxa"/>
+          </w:tcPr>
+          <w:p>
+            <w:pPr/>
+            <w:r>
+              <w:t xml:space="preserve">After a visit, ask for a one-tap rating and offer "Talk to us about another product", which books a follow-up with the relationship manager.</w:t>
+            </w:r>
+          </w:p>
+        </w:tc>
+        <w:tc>
+          <w:tcPr>
+            <w:tcW w:w="1058" w:type="dxa"/>
+          </w:tcPr>
+          <w:p>
+            <w:pPr/>
+            <w:r>
+              <w:t xml:space="preserve">1</w:t>
+            </w:r>
+          </w:p>
+        </w:tc>
+        <w:tc>
+          <w:tcPr>
+            <w:tcW w:w="1251" w:type="dxa"/>
+          </w:tcPr>
+          <w:p>
+            <w:pPr/>
+            <w:r>
+              <w:t xml:space="preserve">Should</w:t>
+            </w:r>
+          </w:p>
+        </w:tc>
+      </w:tr>
+      <w:tr>
+        <w:tc>
+          <w:tcPr>
+            <w:tcW w:w="1057" w:type="dxa"/>
+          </w:tcPr>
+          <w:p>
+            <w:pPr/>
+            <w:r>
+              <w:t xml:space="preserve">FR-19</w:t>
+            </w:r>
+          </w:p>
+        </w:tc>
+        <w:tc>
+          <w:tcPr>
+            <w:tcW w:w="5993" w:type="dxa"/>
+          </w:tcPr>
+          <w:p>
+            <w:pPr/>
+            <w:r>
+              <w:t xml:space="preserve">A customer can book for a family member's need, such as a minor savings account or a joint account, with the family member's details captured at booking.</w:t>
+            </w:r>
+          </w:p>
+        </w:tc>
+        <w:tc>
+          <w:tcPr>
+            <w:tcW w:w="1058" w:type="dxa"/>
+          </w:tcPr>
+          <w:p>
+            <w:pPr/>
+            <w:r>
+              <w:t xml:space="preserve">1</w:t>
+            </w:r>
+          </w:p>
+        </w:tc>
+        <w:tc>
+          <w:tcPr>
+            <w:tcW w:w="1251" w:type="dxa"/>
+          </w:tcPr>
+          <w:p>
+            <w:pPr/>
+            <w:r>
+              <w:t xml:space="preserve">Should</w:t>
+            </w:r>
+          </w:p>
+        </w:tc>
+      </w:tr>
+      <w:tr>
+        <w:tc>
+          <w:tcPr>
+            <w:tcW w:w="1057" w:type="dxa"/>
+          </w:tcPr>
+          <w:p>
+            <w:pPr/>
+            <w:r>
+              <w:t xml:space="preserve">FR-20</w:t>
+            </w:r>
+          </w:p>
+        </w:tc>
+        <w:tc>
+          <w:tcPr>
+            <w:tcW w:w="5993" w:type="dxa"/>
+          </w:tcPr>
+          <w:p>
+            <w:pPr/>
+            <w:r>
+              <w:t xml:space="preserve">Add a Video Call tab: "talk to an advisor now" with live availability, and scheduling for every branch-or-video service.</w:t>
+            </w:r>
+          </w:p>
+        </w:tc>
+        <w:tc>
+          <w:tcPr>
+            <w:tcW w:w="1058" w:type="dxa"/>
+          </w:tcPr>
+          <w:p>
+            <w:pPr/>
+            <w:r>
+              <w:t xml:space="preserve">2</w:t>
+            </w:r>
+          </w:p>
+        </w:tc>
+        <w:tc>
+          <w:tcPr>
+            <w:tcW w:w="1251" w:type="dxa"/>
           </w:tcPr>
           <w:p>
             <w:pPr/>
@@ -4240,18 +4700,64 @@
       <w:tr>
         <w:tc>
           <w:tcPr>
-            <w:tcW w:w="1192" w:type="dxa"/>
-          </w:tcPr>
-          <w:p>
-            <w:pPr/>
-            <w:r>
-              <w:t xml:space="preserve">FR-17</w:t>
-            </w:r>
-          </w:p>
-        </w:tc>
-        <w:tc>
-          <w:tcPr>
-            <w:tcW w:w="6757" w:type="dxa"/>
+            <w:tcW w:w="1057" w:type="dxa"/>
+          </w:tcPr>
+          <w:p>
+            <w:pPr/>
+            <w:r>
+              <w:t xml:space="preserve">FR-21</w:t>
+            </w:r>
+          </w:p>
+        </w:tc>
+        <w:tc>
+          <w:tcPr>
+            <w:tcW w:w="5993" w:type="dxa"/>
+          </w:tcPr>
+          <w:p>
+            <w:pPr/>
+            <w:r>
+              <w:t xml:space="preserve">Join a scheduled call from the app at the booked time over a secure video room; remind 30 minutes before.</w:t>
+            </w:r>
+          </w:p>
+        </w:tc>
+        <w:tc>
+          <w:tcPr>
+            <w:tcW w:w="1058" w:type="dxa"/>
+          </w:tcPr>
+          <w:p>
+            <w:pPr/>
+            <w:r>
+              <w:t xml:space="preserve">2</w:t>
+            </w:r>
+          </w:p>
+        </w:tc>
+        <w:tc>
+          <w:tcPr>
+            <w:tcW w:w="1251" w:type="dxa"/>
+          </w:tcPr>
+          <w:p>
+            <w:pPr/>
+            <w:r>
+              <w:t xml:space="preserve">Must</w:t>
+            </w:r>
+          </w:p>
+        </w:tc>
+      </w:tr>
+      <w:tr>
+        <w:tc>
+          <w:tcPr>
+            <w:tcW w:w="1057" w:type="dxa"/>
+          </w:tcPr>
+          <w:p>
+            <w:pPr/>
+            <w:r>
+              <w:t xml:space="preserve">FR-22</w:t>
+            </w:r>
+          </w:p>
+        </w:tc>
+        <w:tc>
+          <w:tcPr>
+            <w:tcW w:w="5993" w:type="dxa"/>
           </w:tcPr>
           <w:p>
             <w:pPr/>
@@ -4262,7 +4768,18 @@
         </w:tc>
         <w:tc>
           <w:tcPr>
-            <w:tcW w:w="1410" w:type="dxa"/>
+            <w:tcW w:w="1058" w:type="dxa"/>
+          </w:tcPr>
+          <w:p>
+            <w:pPr/>
+            <w:r>
+              <w:t xml:space="preserve">2</w:t>
+            </w:r>
+          </w:p>
+        </w:tc>
+        <w:tc>
+          <w:tcPr>
+            <w:tcW w:w="1251" w:type="dxa"/>
           </w:tcPr>
           <w:p>
             <w:pPr/>
@@ -4275,29 +4792,40 @@
       <w:tr>
         <w:tc>
           <w:tcPr>
-            <w:tcW w:w="1192" w:type="dxa"/>
-          </w:tcPr>
-          <w:p>
-            <w:pPr/>
-            <w:r>
-              <w:t xml:space="preserve">FR-18</w:t>
-            </w:r>
-          </w:p>
-        </w:tc>
-        <w:tc>
-          <w:tcPr>
-            <w:tcW w:w="6757" w:type="dxa"/>
-          </w:tcPr>
-          <w:p>
-            <w:pPr/>
-            <w:r>
-              <w:t xml:space="preserve">Join a scheduled call from the app at the booked time over a secure video room.</w:t>
-            </w:r>
-          </w:p>
-        </w:tc>
-        <w:tc>
-          <w:tcPr>
-            <w:tcW w:w="1410" w:type="dxa"/>
+            <w:tcW w:w="1057" w:type="dxa"/>
+          </w:tcPr>
+          <w:p>
+            <w:pPr/>
+            <w:r>
+              <w:t xml:space="preserve">FR-23</w:t>
+            </w:r>
+          </w:p>
+        </w:tc>
+        <w:tc>
+          <w:tcPr>
+            <w:tcW w:w="5993" w:type="dxa"/>
+          </w:tcPr>
+          <w:p>
+            <w:pPr/>
+            <w:r>
+              <w:t xml:space="preserve">EZY Apply applicants book Video KYC, or a branch visit if it fails, through the EZY Meet slot engine with the application reference attached.</w:t>
+            </w:r>
+          </w:p>
+        </w:tc>
+        <w:tc>
+          <w:tcPr>
+            <w:tcW w:w="1058" w:type="dxa"/>
+          </w:tcPr>
+          <w:p>
+            <w:pPr/>
+            <w:r>
+              <w:t xml:space="preserve">2</w:t>
+            </w:r>
+          </w:p>
+        </w:tc>
+        <w:tc>
+          <w:tcPr>
+            <w:tcW w:w="1251" w:type="dxa"/>
           </w:tcPr>
           <w:p>
             <w:pPr/>
@@ -4310,174 +4838,91 @@
       <w:tr>
         <w:tc>
           <w:tcPr>
-            <w:tcW w:w="1192" w:type="dxa"/>
-          </w:tcPr>
-          <w:p>
-            <w:pPr/>
-            <w:r>
-              <w:t xml:space="preserve">FR-19</w:t>
-            </w:r>
-          </w:p>
-        </w:tc>
-        <w:tc>
-          <w:tcPr>
-            <w:tcW w:w="6757" w:type="dxa"/>
-          </w:tcPr>
-          <w:p>
-            <w:pPr/>
-            <w:r>
-              <w:t xml:space="preserve">Remind the customer 30 minutes before (push), and the day before for branch visits (SMS).</w:t>
-            </w:r>
-          </w:p>
-        </w:tc>
-        <w:tc>
-          <w:tcPr>
-            <w:tcW w:w="1410" w:type="dxa"/>
-          </w:tcPr>
-          <w:p>
-            <w:pPr/>
-            <w:r>
-              <w:t xml:space="preserve">Should</w:t>
-            </w:r>
-          </w:p>
-        </w:tc>
-      </w:tr>
-      <w:tr>
-        <w:tc>
-          <w:tcPr>
-            <w:tcW w:w="1192" w:type="dxa"/>
-          </w:tcPr>
-          <w:p>
-            <w:pPr/>
-            <w:r>
-              <w:t xml:space="preserve">FR-20</w:t>
-            </w:r>
-          </w:p>
-        </w:tc>
-        <w:tc>
-          <w:tcPr>
-            <w:tcW w:w="6757" w:type="dxa"/>
-          </w:tcPr>
-          <w:p>
-            <w:pPr/>
-            <w:r>
-              <w:t xml:space="preserve">Limit each customer to a set number of open bookings, to stop slot hoarding.</w:t>
-            </w:r>
-          </w:p>
-        </w:tc>
-        <w:tc>
-          <w:tcPr>
-            <w:tcW w:w="1410" w:type="dxa"/>
-          </w:tcPr>
-          <w:p>
-            <w:pPr/>
-            <w:r>
-              <w:t xml:space="preserve">Should</w:t>
-            </w:r>
-          </w:p>
-        </w:tc>
-      </w:tr>
-      <w:tr>
-        <w:tc>
-          <w:tcPr>
-            <w:tcW w:w="1192" w:type="dxa"/>
-          </w:tcPr>
-          <w:p>
-            <w:pPr/>
-            <w:r>
-              <w:t xml:space="preserve">FR-21</w:t>
-            </w:r>
-          </w:p>
-        </w:tc>
-        <w:tc>
-          <w:tcPr>
-            <w:tcW w:w="6757" w:type="dxa"/>
-          </w:tcPr>
-          <w:p>
-            <w:pPr/>
-            <w:r>
-              <w:t xml:space="preserve">After a visit, ask for a one-tap rating and offer "Talk to us about another product", which books a follow-up with the relationship manager.</w:t>
-            </w:r>
-          </w:p>
-        </w:tc>
-        <w:tc>
-          <w:tcPr>
-            <w:tcW w:w="1410" w:type="dxa"/>
-          </w:tcPr>
-          <w:p>
-            <w:pPr/>
-            <w:r>
-              <w:t xml:space="preserve">Should</w:t>
-            </w:r>
-          </w:p>
-        </w:tc>
-      </w:tr>
-      <w:tr>
-        <w:tc>
-          <w:tcPr>
-            <w:tcW w:w="1192" w:type="dxa"/>
-          </w:tcPr>
-          <w:p>
-            <w:pPr/>
-            <w:r>
-              <w:t xml:space="preserve">FR-22</w:t>
-            </w:r>
-          </w:p>
-        </w:tc>
-        <w:tc>
-          <w:tcPr>
-            <w:tcW w:w="6757" w:type="dxa"/>
-          </w:tcPr>
-          <w:p>
-            <w:pPr/>
-            <w:r>
-              <w:t xml:space="preserve">A customer can book for a family member's need, such as a minor savings account or a joint account, with the family member's details captured at booking.</w:t>
-            </w:r>
-          </w:p>
-        </w:tc>
-        <w:tc>
-          <w:tcPr>
-            <w:tcW w:w="1410" w:type="dxa"/>
-          </w:tcPr>
-          <w:p>
-            <w:pPr/>
-            <w:r>
-              <w:t xml:space="preserve">Should</w:t>
-            </w:r>
-          </w:p>
-        </w:tc>
-      </w:tr>
-      <w:tr>
-        <w:tc>
-          <w:tcPr>
-            <w:tcW w:w="1192" w:type="dxa"/>
-          </w:tcPr>
-          <w:p>
-            <w:pPr/>
-            <w:r>
-              <w:t xml:space="preserve">FR-23</w:t>
-            </w:r>
-          </w:p>
-        </w:tc>
-        <w:tc>
-          <w:tcPr>
-            <w:tcW w:w="6757" w:type="dxa"/>
-          </w:tcPr>
-          <w:p>
-            <w:pPr/>
-            <w:r>
-              <w:t xml:space="preserve">Phase 2: EZY Apply applicants book Video KYC or a branch visit through the EZY Meet slot engine, with the application reference attached.</w:t>
-            </w:r>
-          </w:p>
-        </w:tc>
-        <w:tc>
-          <w:tcPr>
-            <w:tcW w:w="1410" w:type="dxa"/>
-          </w:tcPr>
-          <w:p>
-            <w:pPr/>
-            <w:r>
-              <w:t xml:space="preserve">Could</w:t>
+            <w:tcW w:w="1057" w:type="dxa"/>
+          </w:tcPr>
+          <w:p>
+            <w:pPr/>
+            <w:r>
+              <w:t xml:space="preserve">FR-24</w:t>
+            </w:r>
+          </w:p>
+        </w:tc>
+        <w:tc>
+          <w:tcPr>
+            <w:tcW w:w="5993" w:type="dxa"/>
+          </w:tcPr>
+          <w:p>
+            <w:pPr/>
+            <w:r>
+              <w:t xml:space="preserve">Bookings made by branch staff for the customer appear in My Appointments with "Booked by &lt;branch&gt;", and can be rescheduled or cancelled like any other.</w:t>
+            </w:r>
+          </w:p>
+        </w:tc>
+        <w:tc>
+          <w:tcPr>
+            <w:tcW w:w="1058" w:type="dxa"/>
+          </w:tcPr>
+          <w:p>
+            <w:pPr/>
+            <w:r>
+              <w:t xml:space="preserve">3</w:t>
+            </w:r>
+          </w:p>
+        </w:tc>
+        <w:tc>
+          <w:tcPr>
+            <w:tcW w:w="1251" w:type="dxa"/>
+          </w:tcPr>
+          <w:p>
+            <w:pPr/>
+            <w:r>
+              <w:t xml:space="preserve">Must</w:t>
+            </w:r>
+          </w:p>
+        </w:tc>
+      </w:tr>
+      <w:tr>
+        <w:tc>
+          <w:tcPr>
+            <w:tcW w:w="1057" w:type="dxa"/>
+          </w:tcPr>
+          <w:p>
+            <w:pPr/>
+            <w:r>
+              <w:t xml:space="preserve">FR-25</w:t>
+            </w:r>
+          </w:p>
+        </w:tc>
+        <w:tc>
+          <w:tcPr>
+            <w:tcW w:w="5993" w:type="dxa"/>
+          </w:tcPr>
+          <w:p>
+            <w:pPr/>
+            <w:r>
+              <w:t xml:space="preserve">The customer is told by SMS and push when staff book for them, with a one-tap confirm or decline.</w:t>
+            </w:r>
+          </w:p>
+        </w:tc>
+        <w:tc>
+          <w:tcPr>
+            <w:tcW w:w="1058" w:type="dxa"/>
+          </w:tcPr>
+          <w:p>
+            <w:pPr/>
+            <w:r>
+              <w:t xml:space="preserve">3</w:t>
+            </w:r>
+          </w:p>
+        </w:tc>
+        <w:tc>
+          <w:tcPr>
+            <w:tcW w:w="1251" w:type="dxa"/>
+          </w:tcPr>
+          <w:p>
+            <w:pPr/>
+            <w:r>
+              <w:t xml:space="preserve">Must</w:t>
             </w:r>
           </w:p>
         </w:tc>
@@ -4524,60 +4969,12 @@
         <w:drawing>
           <wp:inline distT="0" distB="0" distL="0" distR="0">
             <wp:extent cx="5486400" cy="3429000"/>
-            <wp:docPr id="6" name="image6" descr="Branch portal: Today"/>
+            <wp:docPr id="7" name="image7" descr="Branch portal: Today"/>
             <a:graphic xmlns:a="http://schemas.openxmlformats.org/drawingml/2006/main">
               <a:graphicData uri="http://schemas.openxmlformats.org/drawingml/2006/picture">
                 <pic:pic xmlns:pic="http://schemas.openxmlformats.org/drawingml/2006/picture">
                   <pic:nvPicPr>
-                    <pic:cNvPr id="6" name="image6" descr="Branch portal: Today"/>
-                    <pic:cNvPicPr/>
-                  </pic:nvPicPr>
-                  <pic:blipFill>
-                    <a:blip r:embed="rId10"/>
-                    <a:stretch>
-                      <a:fillRect/>
-                    </a:stretch>
-                  </pic:blipFill>
-                  <pic:spPr>
-                    <a:xfrm>
-                      <a:off x="0" y="0"/>
-                      <a:ext cx="5486400" cy="3429000"/>
-                    </a:xfrm>
-                    <a:prstGeom prst="rect">
-                      <a:avLst/>
-                    </a:prstGeom>
-                  </pic:spPr>
-                </pic:pic>
-              </a:graphicData>
-            </a:graphic>
-          </wp:inline>
-        </w:drawing>
-      </w:r>
-    </w:p>
-    <w:p>
-      <w:pPr/>
-      <w:r>
-        <w:rPr>
-          <w:b/>
-        </w:rPr>
-        <w:t xml:space="preserve">Check-in.</w:t>
-      </w:r>
-      <w:r>
-        <w:t xml:space="preserve"> Staff scan the customer's QR code with the device camera or type the reference. One button checks the customer in and issues a priority token.</w:t>
-      </w:r>
-    </w:p>
-    <w:p>
-      <w:pPr/>
-      <w:r>
-        <w:drawing>
-          <wp:inline distT="0" distB="0" distL="0" distR="0">
-            <wp:extent cx="5486400" cy="3429000"/>
-            <wp:docPr id="7" name="image7" descr="Branch portal: Check-in"/>
-            <a:graphic xmlns:a="http://schemas.openxmlformats.org/drawingml/2006/main">
-              <a:graphicData uri="http://schemas.openxmlformats.org/drawingml/2006/picture">
-                <pic:pic xmlns:pic="http://schemas.openxmlformats.org/drawingml/2006/picture">
-                  <pic:nvPicPr>
-                    <pic:cNvPr id="7" name="image7" descr="Branch portal: Check-in"/>
+                    <pic:cNvPr id="7" name="image7" descr="Branch portal: Today"/>
                     <pic:cNvPicPr/>
                   </pic:nvPicPr>
                   <pic:blipFill>
@@ -4608,10 +5005,10 @@
         <w:rPr>
           <w:b/>
         </w:rPr>
-        <w:t xml:space="preserve">Schedule.</w:t>
-      </w:r>
-      <w:r>
-        <w:t xml:space="preserve"> A 7-day by 30-minute view; darker cells hold more bookings, blocked slots are hatched. Clicking a cell lists its customers.</w:t>
+        <w:t xml:space="preserve">Check-in.</w:t>
+      </w:r>
+      <w:r>
+        <w:t xml:space="preserve"> Staff scan the customer's QR code with the device camera or type the reference. One button checks the customer in and issues a priority token.</w:t>
       </w:r>
     </w:p>
     <w:p>
@@ -4620,12 +5017,12 @@
         <w:drawing>
           <wp:inline distT="0" distB="0" distL="0" distR="0">
             <wp:extent cx="5486400" cy="3429000"/>
-            <wp:docPr id="8" name="image8" descr="Branch portal: Schedule"/>
+            <wp:docPr id="8" name="image8" descr="Branch portal: Check-in"/>
             <a:graphic xmlns:a="http://schemas.openxmlformats.org/drawingml/2006/main">
               <a:graphicData uri="http://schemas.openxmlformats.org/drawingml/2006/picture">
                 <pic:pic xmlns:pic="http://schemas.openxmlformats.org/drawingml/2006/picture">
                   <pic:nvPicPr>
-                    <pic:cNvPr id="8" name="image8" descr="Branch portal: Schedule"/>
+                    <pic:cNvPr id="8" name="image8" descr="Branch portal: Check-in"/>
                     <pic:cNvPicPr/>
                   </pic:nvPicPr>
                   <pic:blipFill>
@@ -4656,10 +5053,10 @@
         <w:rPr>
           <w:b/>
         </w:rPr>
-        <w:t xml:space="preserve">Video desk.</w:t>
-      </w:r>
-      <w:r>
-        <w:t xml:space="preserve"> Scheduled video calls and the live queue from "talk to an advisor now". In Phase 2, Video KYC sessions from EZY Apply arrive on this desk.</w:t>
+        <w:t xml:space="preserve">Schedule.</w:t>
+      </w:r>
+      <w:r>
+        <w:t xml:space="preserve"> A 7-day by 30-minute view; darker cells hold more bookings, blocked slots are hatched. Clicking a cell lists its customers.</w:t>
       </w:r>
     </w:p>
     <w:p>
@@ -4668,12 +5065,12 @@
         <w:drawing>
           <wp:inline distT="0" distB="0" distL="0" distR="0">
             <wp:extent cx="5486400" cy="3429000"/>
-            <wp:docPr id="9" name="image9" descr="Branch portal: Video desk"/>
+            <wp:docPr id="9" name="image9" descr="Branch portal: Schedule"/>
             <a:graphic xmlns:a="http://schemas.openxmlformats.org/drawingml/2006/main">
               <a:graphicData uri="http://schemas.openxmlformats.org/drawingml/2006/picture">
                 <pic:pic xmlns:pic="http://schemas.openxmlformats.org/drawingml/2006/picture">
                   <pic:nvPicPr>
-                    <pic:cNvPr id="9" name="image9" descr="Branch portal: Video desk"/>
+                    <pic:cNvPr id="9" name="image9" descr="Branch portal: Schedule"/>
                     <pic:cNvPicPr/>
                   </pic:nvPicPr>
                   <pic:blipFill>
@@ -4704,10 +5101,10 @@
         <w:rPr>
           <w:b/>
         </w:rPr>
-        <w:t xml:space="preserve">Slots and capacity.</w:t>
-      </w:r>
-      <w:r>
-        <w:t xml:space="preserve"> The manager sets the number of EZY Meet counters and blocks slots; a blocked slot disappears from the app at once.</w:t>
+        <w:t xml:space="preserve">Video desk (Phase 2).</w:t>
+      </w:r>
+      <w:r>
+        <w:t xml:space="preserve"> Scheduled video calls and the live queue from "talk to an advisor now", plus Video KYC sessions from EZY Apply.</w:t>
       </w:r>
     </w:p>
     <w:p>
@@ -4716,12 +5113,12 @@
         <w:drawing>
           <wp:inline distT="0" distB="0" distL="0" distR="0">
             <wp:extent cx="5486400" cy="3429000"/>
-            <wp:docPr id="10" name="image10" descr="Branch portal: Slots and capacity"/>
+            <wp:docPr id="10" name="image10" descr="Branch portal: Video desk"/>
             <a:graphic xmlns:a="http://schemas.openxmlformats.org/drawingml/2006/main">
               <a:graphicData uri="http://schemas.openxmlformats.org/drawingml/2006/picture">
                 <pic:pic xmlns:pic="http://schemas.openxmlformats.org/drawingml/2006/picture">
                   <pic:nvPicPr>
-                    <pic:cNvPr id="10" name="image10" descr="Branch portal: Slots and capacity"/>
+                    <pic:cNvPr id="10" name="image10" descr="Branch portal: Video desk"/>
                     <pic:cNvPicPr/>
                   </pic:nvPicPr>
                   <pic:blipFill>
@@ -4746,6 +5143,54 @@
         </w:drawing>
       </w:r>
     </w:p>
+    <w:p>
+      <w:pPr/>
+      <w:r>
+        <w:rPr>
+          <w:b/>
+        </w:rPr>
+        <w:t xml:space="preserve">Slots and capacity.</w:t>
+      </w:r>
+      <w:r>
+        <w:t xml:space="preserve"> The manager sets the number of EZY Meet counters and blocks slots; a blocked slot disappears from the app at once.</w:t>
+      </w:r>
+    </w:p>
+    <w:p>
+      <w:pPr/>
+      <w:r>
+        <w:drawing>
+          <wp:inline distT="0" distB="0" distL="0" distR="0">
+            <wp:extent cx="5486400" cy="3429000"/>
+            <wp:docPr id="11" name="image11" descr="Branch portal: Slots and capacity"/>
+            <a:graphic xmlns:a="http://schemas.openxmlformats.org/drawingml/2006/main">
+              <a:graphicData uri="http://schemas.openxmlformats.org/drawingml/2006/picture">
+                <pic:pic xmlns:pic="http://schemas.openxmlformats.org/drawingml/2006/picture">
+                  <pic:nvPicPr>
+                    <pic:cNvPr id="11" name="image11" descr="Branch portal: Slots and capacity"/>
+                    <pic:cNvPicPr/>
+                  </pic:nvPicPr>
+                  <pic:blipFill>
+                    <a:blip r:embed="rId15"/>
+                    <a:stretch>
+                      <a:fillRect/>
+                    </a:stretch>
+                  </pic:blipFill>
+                  <pic:spPr>
+                    <a:xfrm>
+                      <a:off x="0" y="0"/>
+                      <a:ext cx="5486400" cy="3429000"/>
+                    </a:xfrm>
+                    <a:prstGeom prst="rect">
+                      <a:avLst/>
+                    </a:prstGeom>
+                  </pic:spPr>
+                </pic:pic>
+              </a:graphicData>
+            </a:graphic>
+          </wp:inline>
+        </w:drawing>
+      </w:r>
+    </w:p>
     <w:tbl>
       <w:tblPr>
         <w:tblStyle w:val="TableGrid"/>
@@ -4754,9 +5199,10 @@
         <w:tblLook w:val="04A0" w:firstRow="1" w:lastRow="0" w:firstColumn="0" w:lastColumn="0" w:noHBand="0" w:noVBand="1"/>
       </w:tblPr>
       <w:tblGrid>
-        <w:gridCol w:w="1192"/>
-        <w:gridCol w:w="6757"/>
-        <w:gridCol w:w="1410"/>
+        <w:gridCol w:w="1057"/>
+        <w:gridCol w:w="5993"/>
+        <w:gridCol w:w="1058"/>
+        <w:gridCol w:w="1251"/>
       </w:tblGrid>
       <w:tr>
         <w:trPr>
@@ -4764,7 +5210,7 @@
         </w:trPr>
         <w:tc>
           <w:tcPr>
-            <w:tcW w:w="1192" w:type="dxa"/>
+            <w:tcW w:w="1057" w:type="dxa"/>
             <w:shd w:val="clear" w:color="auto" w:fill="F2F2F2"/>
           </w:tcPr>
           <w:p>
@@ -4776,7 +5222,7 @@
         </w:tc>
         <w:tc>
           <w:tcPr>
-            <w:tcW w:w="6757" w:type="dxa"/>
+            <w:tcW w:w="5993" w:type="dxa"/>
             <w:shd w:val="clear" w:color="auto" w:fill="F2F2F2"/>
           </w:tcPr>
           <w:p>
@@ -4788,12 +5234,24 @@
         </w:tc>
         <w:tc>
           <w:tcPr>
-            <w:tcW w:w="1410" w:type="dxa"/>
+            <w:tcW w:w="1058" w:type="dxa"/>
             <w:shd w:val="clear" w:color="auto" w:fill="F2F2F2"/>
           </w:tcPr>
           <w:p>
             <w:pPr/>
             <w:r>
+              <w:t xml:space="preserve">Phase</w:t>
+            </w:r>
+          </w:p>
+        </w:tc>
+        <w:tc>
+          <w:tcPr>
+            <w:tcW w:w="1251" w:type="dxa"/>
+            <w:shd w:val="clear" w:color="auto" w:fill="F2F2F2"/>
+          </w:tcPr>
+          <w:p>
+            <w:pPr/>
+            <w:r>
               <w:t xml:space="preserve">Priority</w:t>
             </w:r>
           </w:p>
@@ -4802,7 +5260,7 @@
       <w:tr>
         <w:tc>
           <w:tcPr>
-            <w:tcW w:w="1192" w:type="dxa"/>
+            <w:tcW w:w="1057" w:type="dxa"/>
           </w:tcPr>
           <w:p>
             <w:pPr/>
@@ -4813,18 +5271,29 @@
         </w:tc>
         <w:tc>
           <w:tcPr>
-            <w:tcW w:w="6757" w:type="dxa"/>
-          </w:tcPr>
-          <w:p>
-            <w:pPr/>
-            <w:r>
-              <w:t xml:space="preserve">Staff sign in with bank credentials (SSO); each user sees only their branch. Video advisors see the video desk.</w:t>
-            </w:r>
-          </w:p>
-        </w:tc>
-        <w:tc>
-          <w:tcPr>
-            <w:tcW w:w="1410" w:type="dxa"/>
+            <w:tcW w:w="5993" w:type="dxa"/>
+          </w:tcPr>
+          <w:p>
+            <w:pPr/>
+            <w:r>
+              <w:t xml:space="preserve">Staff sign in with bank credentials (SSO); each user sees only their branch.</w:t>
+            </w:r>
+          </w:p>
+        </w:tc>
+        <w:tc>
+          <w:tcPr>
+            <w:tcW w:w="1058" w:type="dxa"/>
+          </w:tcPr>
+          <w:p>
+            <w:pPr/>
+            <w:r>
+              <w:t xml:space="preserve">1</w:t>
+            </w:r>
+          </w:p>
+        </w:tc>
+        <w:tc>
+          <w:tcPr>
+            <w:tcW w:w="1251" w:type="dxa"/>
           </w:tcPr>
           <w:p>
             <w:pPr/>
@@ -4837,7 +5306,7 @@
       <w:tr>
         <w:tc>
           <w:tcPr>
-            <w:tcW w:w="1192" w:type="dxa"/>
+            <w:tcW w:w="1057" w:type="dxa"/>
           </w:tcPr>
           <w:p>
             <w:pPr/>
@@ -4848,7 +5317,7 @@
         </w:tc>
         <w:tc>
           <w:tcPr>
-            <w:tcW w:w="6757" w:type="dxa"/>
+            <w:tcW w:w="5993" w:type="dxa"/>
           </w:tcPr>
           <w:p>
             <w:pPr/>
@@ -4859,7 +5328,18 @@
         </w:tc>
         <w:tc>
           <w:tcPr>
-            <w:tcW w:w="1410" w:type="dxa"/>
+            <w:tcW w:w="1058" w:type="dxa"/>
+          </w:tcPr>
+          <w:p>
+            <w:pPr/>
+            <w:r>
+              <w:t xml:space="preserve">1</w:t>
+            </w:r>
+          </w:p>
+        </w:tc>
+        <w:tc>
+          <w:tcPr>
+            <w:tcW w:w="1251" w:type="dxa"/>
           </w:tcPr>
           <w:p>
             <w:pPr/>
@@ -4872,7 +5352,7 @@
       <w:tr>
         <w:tc>
           <w:tcPr>
-            <w:tcW w:w="1192" w:type="dxa"/>
+            <w:tcW w:w="1057" w:type="dxa"/>
           </w:tcPr>
           <w:p>
             <w:pPr/>
@@ -4883,7 +5363,7 @@
         </w:tc>
         <w:tc>
           <w:tcPr>
-            <w:tcW w:w="6757" w:type="dxa"/>
+            <w:tcW w:w="5993" w:type="dxa"/>
           </w:tcPr>
           <w:p>
             <w:pPr/>
@@ -4894,7 +5374,18 @@
         </w:tc>
         <w:tc>
           <w:tcPr>
-            <w:tcW w:w="1410" w:type="dxa"/>
+            <w:tcW w:w="1058" w:type="dxa"/>
+          </w:tcPr>
+          <w:p>
+            <w:pPr/>
+            <w:r>
+              <w:t xml:space="preserve">1</w:t>
+            </w:r>
+          </w:p>
+        </w:tc>
+        <w:tc>
+          <w:tcPr>
+            <w:tcW w:w="1251" w:type="dxa"/>
           </w:tcPr>
           <w:p>
             <w:pPr/>
@@ -4907,7 +5398,7 @@
       <w:tr>
         <w:tc>
           <w:tcPr>
-            <w:tcW w:w="1192" w:type="dxa"/>
+            <w:tcW w:w="1057" w:type="dxa"/>
           </w:tcPr>
           <w:p>
             <w:pPr/>
@@ -4918,7 +5409,7 @@
         </w:tc>
         <w:tc>
           <w:tcPr>
-            <w:tcW w:w="6757" w:type="dxa"/>
+            <w:tcW w:w="5993" w:type="dxa"/>
           </w:tcPr>
           <w:p>
             <w:pPr/>
@@ -4929,7 +5420,18 @@
         </w:tc>
         <w:tc>
           <w:tcPr>
-            <w:tcW w:w="1410" w:type="dxa"/>
+            <w:tcW w:w="1058" w:type="dxa"/>
+          </w:tcPr>
+          <w:p>
+            <w:pPr/>
+            <w:r>
+              <w:t xml:space="preserve">1</w:t>
+            </w:r>
+          </w:p>
+        </w:tc>
+        <w:tc>
+          <w:tcPr>
+            <w:tcW w:w="1251" w:type="dxa"/>
           </w:tcPr>
           <w:p>
             <w:pPr/>
@@ -4942,7 +5444,7 @@
       <w:tr>
         <w:tc>
           <w:tcPr>
-            <w:tcW w:w="1192" w:type="dxa"/>
+            <w:tcW w:w="1057" w:type="dxa"/>
           </w:tcPr>
           <w:p>
             <w:pPr/>
@@ -4953,7 +5455,7 @@
         </w:tc>
         <w:tc>
           <w:tcPr>
-            <w:tcW w:w="6757" w:type="dxa"/>
+            <w:tcW w:w="5993" w:type="dxa"/>
           </w:tcPr>
           <w:p>
             <w:pPr/>
@@ -4964,7 +5466,18 @@
         </w:tc>
         <w:tc>
           <w:tcPr>
-            <w:tcW w:w="1410" w:type="dxa"/>
+            <w:tcW w:w="1058" w:type="dxa"/>
+          </w:tcPr>
+          <w:p>
+            <w:pPr/>
+            <w:r>
+              <w:t xml:space="preserve">1</w:t>
+            </w:r>
+          </w:p>
+        </w:tc>
+        <w:tc>
+          <w:tcPr>
+            <w:tcW w:w="1251" w:type="dxa"/>
           </w:tcPr>
           <w:p>
             <w:pPr/>
@@ -4977,7 +5490,7 @@
       <w:tr>
         <w:tc>
           <w:tcPr>
-            <w:tcW w:w="1192" w:type="dxa"/>
+            <w:tcW w:w="1057" w:type="dxa"/>
           </w:tcPr>
           <w:p>
             <w:pPr/>
@@ -4988,7 +5501,7 @@
         </w:tc>
         <w:tc>
           <w:tcPr>
-            <w:tcW w:w="6757" w:type="dxa"/>
+            <w:tcW w:w="5993" w:type="dxa"/>
           </w:tcPr>
           <w:p>
             <w:pPr/>
@@ -4999,7 +5512,18 @@
         </w:tc>
         <w:tc>
           <w:tcPr>
-            <w:tcW w:w="1410" w:type="dxa"/>
+            <w:tcW w:w="1058" w:type="dxa"/>
+          </w:tcPr>
+          <w:p>
+            <w:pPr/>
+            <w:r>
+              <w:t xml:space="preserve">1</w:t>
+            </w:r>
+          </w:p>
+        </w:tc>
+        <w:tc>
+          <w:tcPr>
+            <w:tcW w:w="1251" w:type="dxa"/>
           </w:tcPr>
           <w:p>
             <w:pPr/>
@@ -5012,7 +5536,7 @@
       <w:tr>
         <w:tc>
           <w:tcPr>
-            <w:tcW w:w="1192" w:type="dxa"/>
+            <w:tcW w:w="1057" w:type="dxa"/>
           </w:tcPr>
           <w:p>
             <w:pPr/>
@@ -5023,7 +5547,7 @@
         </w:tc>
         <w:tc>
           <w:tcPr>
-            <w:tcW w:w="6757" w:type="dxa"/>
+            <w:tcW w:w="5993" w:type="dxa"/>
           </w:tcPr>
           <w:p>
             <w:pPr/>
@@ -5034,7 +5558,18 @@
         </w:tc>
         <w:tc>
           <w:tcPr>
-            <w:tcW w:w="1410" w:type="dxa"/>
+            <w:tcW w:w="1058" w:type="dxa"/>
+          </w:tcPr>
+          <w:p>
+            <w:pPr/>
+            <w:r>
+              <w:t xml:space="preserve">1</w:t>
+            </w:r>
+          </w:p>
+        </w:tc>
+        <w:tc>
+          <w:tcPr>
+            <w:tcW w:w="1251" w:type="dxa"/>
           </w:tcPr>
           <w:p>
             <w:pPr/>
@@ -5047,7 +5582,7 @@
       <w:tr>
         <w:tc>
           <w:tcPr>
-            <w:tcW w:w="1192" w:type="dxa"/>
+            <w:tcW w:w="1057" w:type="dxa"/>
           </w:tcPr>
           <w:p>
             <w:pPr/>
@@ -5058,7 +5593,7 @@
         </w:tc>
         <w:tc>
           <w:tcPr>
-            <w:tcW w:w="6757" w:type="dxa"/>
+            <w:tcW w:w="5993" w:type="dxa"/>
           </w:tcPr>
           <w:p>
             <w:pPr/>
@@ -5069,7 +5604,18 @@
         </w:tc>
         <w:tc>
           <w:tcPr>
-            <w:tcW w:w="1410" w:type="dxa"/>
+            <w:tcW w:w="1058" w:type="dxa"/>
+          </w:tcPr>
+          <w:p>
+            <w:pPr/>
+            <w:r>
+              <w:t xml:space="preserve">1</w:t>
+            </w:r>
+          </w:p>
+        </w:tc>
+        <w:tc>
+          <w:tcPr>
+            <w:tcW w:w="1251" w:type="dxa"/>
           </w:tcPr>
           <w:p>
             <w:pPr/>
@@ -5082,7 +5628,7 @@
       <w:tr>
         <w:tc>
           <w:tcPr>
-            <w:tcW w:w="1192" w:type="dxa"/>
+            <w:tcW w:w="1057" w:type="dxa"/>
           </w:tcPr>
           <w:p>
             <w:pPr/>
@@ -5093,7 +5639,7 @@
         </w:tc>
         <w:tc>
           <w:tcPr>
-            <w:tcW w:w="6757" w:type="dxa"/>
+            <w:tcW w:w="5993" w:type="dxa"/>
           </w:tcPr>
           <w:p>
             <w:pPr/>
@@ -5104,7 +5650,18 @@
         </w:tc>
         <w:tc>
           <w:tcPr>
-            <w:tcW w:w="1410" w:type="dxa"/>
+            <w:tcW w:w="1058" w:type="dxa"/>
+          </w:tcPr>
+          <w:p>
+            <w:pPr/>
+            <w:r>
+              <w:t xml:space="preserve">1</w:t>
+            </w:r>
+          </w:p>
+        </w:tc>
+        <w:tc>
+          <w:tcPr>
+            <w:tcW w:w="1251" w:type="dxa"/>
           </w:tcPr>
           <w:p>
             <w:pPr/>
@@ -5117,7 +5674,7 @@
       <w:tr>
         <w:tc>
           <w:tcPr>
-            <w:tcW w:w="1192" w:type="dxa"/>
+            <w:tcW w:w="1057" w:type="dxa"/>
           </w:tcPr>
           <w:p>
             <w:pPr/>
@@ -5128,7 +5685,7 @@
         </w:tc>
         <w:tc>
           <w:tcPr>
-            <w:tcW w:w="6757" w:type="dxa"/>
+            <w:tcW w:w="5993" w:type="dxa"/>
           </w:tcPr>
           <w:p>
             <w:pPr/>
@@ -5139,7 +5696,18 @@
         </w:tc>
         <w:tc>
           <w:tcPr>
-            <w:tcW w:w="1410" w:type="dxa"/>
+            <w:tcW w:w="1058" w:type="dxa"/>
+          </w:tcPr>
+          <w:p>
+            <w:pPr/>
+            <w:r>
+              <w:t xml:space="preserve">1</w:t>
+            </w:r>
+          </w:p>
+        </w:tc>
+        <w:tc>
+          <w:tcPr>
+            <w:tcW w:w="1251" w:type="dxa"/>
           </w:tcPr>
           <w:p>
             <w:pPr/>
@@ -5152,7 +5720,7 @@
       <w:tr>
         <w:tc>
           <w:tcPr>
-            <w:tcW w:w="1192" w:type="dxa"/>
+            <w:tcW w:w="1057" w:type="dxa"/>
           </w:tcPr>
           <w:p>
             <w:pPr/>
@@ -5163,18 +5731,75 @@
         </w:tc>
         <w:tc>
           <w:tcPr>
-            <w:tcW w:w="6757" w:type="dxa"/>
-          </w:tcPr>
-          <w:p>
-            <w:pPr/>
-            <w:r>
-              <w:t xml:space="preserve">Video desk: join scheduled calls, see uploaded documents, answer the live queue.</w:t>
-            </w:r>
-          </w:p>
-        </w:tc>
-        <w:tc>
-          <w:tcPr>
-            <w:tcW w:w="1410" w:type="dxa"/>
+            <w:tcW w:w="5993" w:type="dxa"/>
+          </w:tcPr>
+          <w:p>
+            <w:pPr/>
+            <w:r>
+              <w:t xml:space="preserve">Mark no-shows automatically 30 minutes after the slot if not checked in.</w:t>
+            </w:r>
+          </w:p>
+        </w:tc>
+        <w:tc>
+          <w:tcPr>
+            <w:tcW w:w="1058" w:type="dxa"/>
+          </w:tcPr>
+          <w:p>
+            <w:pPr/>
+            <w:r>
+              <w:t xml:space="preserve">1</w:t>
+            </w:r>
+          </w:p>
+        </w:tc>
+        <w:tc>
+          <w:tcPr>
+            <w:tcW w:w="1251" w:type="dxa"/>
+          </w:tcPr>
+          <w:p>
+            <w:pPr/>
+            <w:r>
+              <w:t xml:space="preserve">Should</w:t>
+            </w:r>
+          </w:p>
+        </w:tc>
+      </w:tr>
+      <w:tr>
+        <w:tc>
+          <w:tcPr>
+            <w:tcW w:w="1057" w:type="dxa"/>
+          </w:tcPr>
+          <w:p>
+            <w:pPr/>
+            <w:r>
+              <w:t xml:space="preserve">BP-12</w:t>
+            </w:r>
+          </w:p>
+        </w:tc>
+        <w:tc>
+          <w:tcPr>
+            <w:tcW w:w="5993" w:type="dxa"/>
+          </w:tcPr>
+          <w:p>
+            <w:pPr/>
+            <w:r>
+              <w:t xml:space="preserve">Every status change, lead and slot change is logged with staff ID and time.</w:t>
+            </w:r>
+          </w:p>
+        </w:tc>
+        <w:tc>
+          <w:tcPr>
+            <w:tcW w:w="1058" w:type="dxa"/>
+          </w:tcPr>
+          <w:p>
+            <w:pPr/>
+            <w:r>
+              <w:t xml:space="preserve">1</w:t>
+            </w:r>
+          </w:p>
+        </w:tc>
+        <w:tc>
+          <w:tcPr>
+            <w:tcW w:w="1251" w:type="dxa"/>
           </w:tcPr>
           <w:p>
             <w:pPr/>
@@ -5187,29 +5812,270 @@
       <w:tr>
         <w:tc>
           <w:tcPr>
-            <w:tcW w:w="1192" w:type="dxa"/>
-          </w:tcPr>
-          <w:p>
-            <w:pPr/>
-            <w:r>
-              <w:t xml:space="preserve">BP-12</w:t>
-            </w:r>
-          </w:p>
-        </w:tc>
-        <w:tc>
-          <w:tcPr>
-            <w:tcW w:w="6757" w:type="dxa"/>
-          </w:tcPr>
-          <w:p>
-            <w:pPr/>
-            <w:r>
-              <w:t xml:space="preserve">Mark no-shows automatically 30 minutes after the slot if not checked in.</w:t>
-            </w:r>
-          </w:p>
-        </w:tc>
-        <w:tc>
-          <w:tcPr>
-            <w:tcW w:w="1410" w:type="dxa"/>
+            <w:tcW w:w="1057" w:type="dxa"/>
+          </w:tcPr>
+          <w:p>
+            <w:pPr/>
+            <w:r>
+              <w:t xml:space="preserve">BP-13</w:t>
+            </w:r>
+          </w:p>
+        </w:tc>
+        <w:tc>
+          <w:tcPr>
+            <w:tcW w:w="5993" w:type="dxa"/>
+          </w:tcPr>
+          <w:p>
+            <w:pPr/>
+            <w:r>
+              <w:t xml:space="preserve">Daily and weekly reports per branch: bookings, no-shows, wait time, top services, leads and accounts opened from visits.</w:t>
+            </w:r>
+          </w:p>
+        </w:tc>
+        <w:tc>
+          <w:tcPr>
+            <w:tcW w:w="1058" w:type="dxa"/>
+          </w:tcPr>
+          <w:p>
+            <w:pPr/>
+            <w:r>
+              <w:t xml:space="preserve">1</w:t>
+            </w:r>
+          </w:p>
+        </w:tc>
+        <w:tc>
+          <w:tcPr>
+            <w:tcW w:w="1251" w:type="dxa"/>
+          </w:tcPr>
+          <w:p>
+            <w:pPr/>
+            <w:r>
+              <w:t xml:space="preserve">Could</w:t>
+            </w:r>
+          </w:p>
+        </w:tc>
+      </w:tr>
+      <w:tr>
+        <w:tc>
+          <w:tcPr>
+            <w:tcW w:w="1057" w:type="dxa"/>
+          </w:tcPr>
+          <w:p>
+            <w:pPr/>
+            <w:r>
+              <w:t xml:space="preserve">BP-14</w:t>
+            </w:r>
+          </w:p>
+        </w:tc>
+        <w:tc>
+          <w:tcPr>
+            <w:tcW w:w="5993" w:type="dxa"/>
+          </w:tcPr>
+          <w:p>
+            <w:pPr/>
+            <w:r>
+              <w:t xml:space="preserve">Video desk for advisors: join scheduled calls, see uploaded documents, answer the live queue.</w:t>
+            </w:r>
+          </w:p>
+        </w:tc>
+        <w:tc>
+          <w:tcPr>
+            <w:tcW w:w="1058" w:type="dxa"/>
+          </w:tcPr>
+          <w:p>
+            <w:pPr/>
+            <w:r>
+              <w:t xml:space="preserve">2</w:t>
+            </w:r>
+          </w:p>
+        </w:tc>
+        <w:tc>
+          <w:tcPr>
+            <w:tcW w:w="1251" w:type="dxa"/>
+          </w:tcPr>
+          <w:p>
+            <w:pPr/>
+            <w:r>
+              <w:t xml:space="preserve">Must</w:t>
+            </w:r>
+          </w:p>
+        </w:tc>
+      </w:tr>
+      <w:tr>
+        <w:tc>
+          <w:tcPr>
+            <w:tcW w:w="1057" w:type="dxa"/>
+          </w:tcPr>
+          <w:p>
+            <w:pPr/>
+            <w:r>
+              <w:t xml:space="preserve">BP-15</w:t>
+            </w:r>
+          </w:p>
+        </w:tc>
+        <w:tc>
+          <w:tcPr>
+            <w:tcW w:w="5993" w:type="dxa"/>
+          </w:tcPr>
+          <w:p>
+            <w:pPr/>
+            <w:r>
+              <w:t xml:space="preserve">Video KYC sessions from EZY Apply appear on the video desk with the application and its documents.</w:t>
+            </w:r>
+          </w:p>
+        </w:tc>
+        <w:tc>
+          <w:tcPr>
+            <w:tcW w:w="1058" w:type="dxa"/>
+          </w:tcPr>
+          <w:p>
+            <w:pPr/>
+            <w:r>
+              <w:t xml:space="preserve">2</w:t>
+            </w:r>
+          </w:p>
+        </w:tc>
+        <w:tc>
+          <w:tcPr>
+            <w:tcW w:w="1251" w:type="dxa"/>
+          </w:tcPr>
+          <w:p>
+            <w:pPr/>
+            <w:r>
+              <w:t xml:space="preserve">Must</w:t>
+            </w:r>
+          </w:p>
+        </w:tc>
+      </w:tr>
+      <w:tr>
+        <w:tc>
+          <w:tcPr>
+            <w:tcW w:w="1057" w:type="dxa"/>
+          </w:tcPr>
+          <w:p>
+            <w:pPr/>
+            <w:r>
+              <w:t xml:space="preserve">BP-16</w:t>
+            </w:r>
+          </w:p>
+        </w:tc>
+        <w:tc>
+          <w:tcPr>
+            <w:tcW w:w="5993" w:type="dxa"/>
+          </w:tcPr>
+          <w:p>
+            <w:pPr/>
+            <w:r>
+              <w:t xml:space="preserve">Book on behalf: find the customer by NIC, CIF or mobile, pick the service and a free slot (branch or video), and book in one screen.</w:t>
+            </w:r>
+          </w:p>
+        </w:tc>
+        <w:tc>
+          <w:tcPr>
+            <w:tcW w:w="1058" w:type="dxa"/>
+          </w:tcPr>
+          <w:p>
+            <w:pPr/>
+            <w:r>
+              <w:t xml:space="preserve">3</w:t>
+            </w:r>
+          </w:p>
+        </w:tc>
+        <w:tc>
+          <w:tcPr>
+            <w:tcW w:w="1251" w:type="dxa"/>
+          </w:tcPr>
+          <w:p>
+            <w:pPr/>
+            <w:r>
+              <w:t xml:space="preserve">Must</w:t>
+            </w:r>
+          </w:p>
+        </w:tc>
+      </w:tr>
+      <w:tr>
+        <w:tc>
+          <w:tcPr>
+            <w:tcW w:w="1057" w:type="dxa"/>
+          </w:tcPr>
+          <w:p>
+            <w:pPr/>
+            <w:r>
+              <w:t xml:space="preserve">BP-17</w:t>
+            </w:r>
+          </w:p>
+        </w:tc>
+        <w:tc>
+          <w:tcPr>
+            <w:tcW w:w="5993" w:type="dxa"/>
+          </w:tcPr>
+          <w:p>
+            <w:pPr/>
+            <w:r>
+              <w:t xml:space="preserve">From a completed visit or a lead, book the follow-up meeting in one click with the service and customer prefilled.</w:t>
+            </w:r>
+          </w:p>
+        </w:tc>
+        <w:tc>
+          <w:tcPr>
+            <w:tcW w:w="1058" w:type="dxa"/>
+          </w:tcPr>
+          <w:p>
+            <w:pPr/>
+            <w:r>
+              <w:t xml:space="preserve">3</w:t>
+            </w:r>
+          </w:p>
+        </w:tc>
+        <w:tc>
+          <w:tcPr>
+            <w:tcW w:w="1251" w:type="dxa"/>
+          </w:tcPr>
+          <w:p>
+            <w:pPr/>
+            <w:r>
+              <w:t xml:space="preserve">Must</w:t>
+            </w:r>
+          </w:p>
+        </w:tc>
+      </w:tr>
+      <w:tr>
+        <w:tc>
+          <w:tcPr>
+            <w:tcW w:w="1057" w:type="dxa"/>
+          </w:tcPr>
+          <w:p>
+            <w:pPr/>
+            <w:r>
+              <w:t xml:space="preserve">BP-18</w:t>
+            </w:r>
+          </w:p>
+        </w:tc>
+        <w:tc>
+          <w:tcPr>
+            <w:tcW w:w="5993" w:type="dxa"/>
+          </w:tcPr>
+          <w:p>
+            <w:pPr/>
+            <w:r>
+              <w:t xml:space="preserve">Relationship managers book review meetings for their own customers at any branch, or by video.</w:t>
+            </w:r>
+          </w:p>
+        </w:tc>
+        <w:tc>
+          <w:tcPr>
+            <w:tcW w:w="1058" w:type="dxa"/>
+          </w:tcPr>
+          <w:p>
+            <w:pPr/>
+            <w:r>
+              <w:t xml:space="preserve">3</w:t>
+            </w:r>
+          </w:p>
+        </w:tc>
+        <w:tc>
+          <w:tcPr>
+            <w:tcW w:w="1251" w:type="dxa"/>
           </w:tcPr>
           <w:p>
             <w:pPr/>
@@ -5222,104 +6088,45 @@
       <w:tr>
         <w:tc>
           <w:tcPr>
-            <w:tcW w:w="1192" w:type="dxa"/>
-          </w:tcPr>
-          <w:p>
-            <w:pPr/>
-            <w:r>
-              <w:t xml:space="preserve">BP-13</w:t>
-            </w:r>
-          </w:p>
-        </w:tc>
-        <w:tc>
-          <w:tcPr>
-            <w:tcW w:w="6757" w:type="dxa"/>
-          </w:tcPr>
-          <w:p>
-            <w:pPr/>
-            <w:r>
-              <w:t xml:space="preserve">Every status change, lead and slot change is logged with staff ID and time.</w:t>
-            </w:r>
-          </w:p>
-        </w:tc>
-        <w:tc>
-          <w:tcPr>
-            <w:tcW w:w="1410" w:type="dxa"/>
+            <w:tcW w:w="1057" w:type="dxa"/>
+          </w:tcPr>
+          <w:p>
+            <w:pPr/>
+            <w:r>
+              <w:t xml:space="preserve">BP-19</w:t>
+            </w:r>
+          </w:p>
+        </w:tc>
+        <w:tc>
+          <w:tcPr>
+            <w:tcW w:w="5993" w:type="dxa"/>
+          </w:tcPr>
+          <w:p>
+            <w:pPr/>
+            <w:r>
+              <w:t xml:space="preserve">Bookings made on behalf show who booked them; the customer's consent is captured (in branch, by phone, or by the confirm in FR-25).</w:t>
+            </w:r>
+          </w:p>
+        </w:tc>
+        <w:tc>
+          <w:tcPr>
+            <w:tcW w:w="1058" w:type="dxa"/>
+          </w:tcPr>
+          <w:p>
+            <w:pPr/>
+            <w:r>
+              <w:t xml:space="preserve">3</w:t>
+            </w:r>
+          </w:p>
+        </w:tc>
+        <w:tc>
+          <w:tcPr>
+            <w:tcW w:w="1251" w:type="dxa"/>
           </w:tcPr>
           <w:p>
             <w:pPr/>
             <w:r>
               <w:t xml:space="preserve">Must</w:t>
-            </w:r>
-          </w:p>
-        </w:tc>
-      </w:tr>
-      <w:tr>
-        <w:tc>
-          <w:tcPr>
-            <w:tcW w:w="1192" w:type="dxa"/>
-          </w:tcPr>
-          <w:p>
-            <w:pPr/>
-            <w:r>
-              <w:t xml:space="preserve">BP-14</w:t>
-            </w:r>
-          </w:p>
-        </w:tc>
-        <w:tc>
-          <w:tcPr>
-            <w:tcW w:w="6757" w:type="dxa"/>
-          </w:tcPr>
-          <w:p>
-            <w:pPr/>
-            <w:r>
-              <w:t xml:space="preserve">Daily and weekly reports per branch: bookings, no-shows, wait time, top services, leads and accounts opened from visits.</w:t>
-            </w:r>
-          </w:p>
-        </w:tc>
-        <w:tc>
-          <w:tcPr>
-            <w:tcW w:w="1410" w:type="dxa"/>
-          </w:tcPr>
-          <w:p>
-            <w:pPr/>
-            <w:r>
-              <w:t xml:space="preserve">Could</w:t>
-            </w:r>
-          </w:p>
-        </w:tc>
-      </w:tr>
-      <w:tr>
-        <w:tc>
-          <w:tcPr>
-            <w:tcW w:w="1192" w:type="dxa"/>
-          </w:tcPr>
-          <w:p>
-            <w:pPr/>
-            <w:r>
-              <w:t xml:space="preserve">BP-15</w:t>
-            </w:r>
-          </w:p>
-        </w:tc>
-        <w:tc>
-          <w:tcPr>
-            <w:tcW w:w="6757" w:type="dxa"/>
-          </w:tcPr>
-          <w:p>
-            <w:pPr/>
-            <w:r>
-              <w:t xml:space="preserve">Phase 2: Video KYC sessions from EZY Apply appear on the video desk with the application and its documents.</w:t>
-            </w:r>
-          </w:p>
-        </w:tc>
-        <w:tc>
-          <w:tcPr>
-            <w:tcW w:w="1410" w:type="dxa"/>
-          </w:tcPr>
-          <w:p>
-            <w:pPr/>
-            <w:r>
-              <w:t xml:space="preserve">Could</w:t>
             </w:r>
           </w:p>
         </w:tc>
@@ -5346,63 +6153,6 @@
           <w:b/>
         </w:rPr>
         <w:t xml:space="preserve">Smart recommendation</w:t>
-      </w:r>
-    </w:p>
-    <w:p>
-      <w:pPr>
-        <w:pStyle w:val="ListParagraph"/>
-        <w:numPr>
-          <w:ilvl w:val="0"/>
-          <w:numId w:val="6"/>
-        </w:numPr>
-      </w:pPr>
-      <w:r>
-        <w:t xml:space="preserve">Candidates are branches within 15 km; if fewer than 3, the 5 nearest.</w:t>
-      </w:r>
-    </w:p>
-    <w:p>
-      <w:pPr>
-        <w:pStyle w:val="ListParagraph"/>
-        <w:numPr>
-          <w:ilvl w:val="0"/>
-          <w:numId w:val="6"/>
-        </w:numPr>
-      </w:pPr>
-      <w:r>
-        <w:t xml:space="preserve">Score = 1.2 × hours until the earliest free slot + 2.5 × distance in km + 0.6 × expected wait in minutes. Lowest score wins. (Prototype weights.)</w:t>
-      </w:r>
-    </w:p>
-    <w:p>
-      <w:pPr>
-        <w:pStyle w:val="ListParagraph"/>
-        <w:numPr>
-          <w:ilvl w:val="0"/>
-          <w:numId w:val="6"/>
-        </w:numPr>
-      </w:pPr>
-      <w:r>
-        <w:t xml:space="preserve">Expected wait comes from the branch's current load and the slot's bookings.</w:t>
-      </w:r>
-    </w:p>
-    <w:p>
-      <w:pPr>
-        <w:pStyle w:val="ListParagraph"/>
-        <w:numPr>
-          <w:ilvl w:val="0"/>
-          <w:numId w:val="6"/>
-        </w:numPr>
-      </w:pPr>
-      <w:r>
-        <w:t xml:space="preserve">Crowd level shown to customers: Quiet, Moderate or Busy.</w:t>
-      </w:r>
-    </w:p>
-    <w:p>
-      <w:pPr/>
-      <w:r>
-        <w:rPr>
-          <w:b/>
-        </w:rPr>
-        <w:t xml:space="preserve">Slots and capacity</w:t>
       </w:r>
     </w:p>
     <w:p>
@@ -5414,7 +6164,7 @@
         </w:numPr>
       </w:pPr>
       <w:r>
-        <w:t xml:space="preserve">Branch slots are 30 minutes: Monday to Friday 9:00 AM to 3:30 PM, Saturday 9:00 AM to 12:30 PM, closed Sunday and bank holidays.</w:t>
+        <w:t xml:space="preserve">Candidates are branches within 15 km; if fewer than 3, the 5 nearest.</w:t>
       </w:r>
     </w:p>
     <w:p>
@@ -5426,7 +6176,7 @@
         </w:numPr>
       </w:pPr>
       <w:r>
-        <w:t xml:space="preserve">Video slots are 30 minutes, Monday to Saturday 8:00 AM to 8:00 PM.</w:t>
+        <w:t xml:space="preserve">Score = 1.2 × hours until the earliest free slot + 2.5 × distance in km + 0.6 × expected wait in minutes. Lowest score wins. (Prototype weights.)</w:t>
       </w:r>
     </w:p>
     <w:p>
@@ -5438,7 +6188,7 @@
         </w:numPr>
       </w:pPr>
       <w:r>
-        <w:t xml:space="preserve">Capacity per slot = EZY Meet counters × 2. A full or blocked slot is not shown.</w:t>
+        <w:t xml:space="preserve">Expected wait comes from the branch's current load and the slot's bookings.</w:t>
       </w:r>
     </w:p>
     <w:p>
@@ -5450,31 +6200,7 @@
         </w:numPr>
       </w:pPr>
       <w:r>
-        <w:t xml:space="preserve">Booking opens 7 days ahead and closes 30 minutes before the slot.</w:t>
-      </w:r>
-    </w:p>
-    <w:p>
-      <w:pPr>
-        <w:pStyle w:val="ListParagraph"/>
-        <w:numPr>
-          <w:ilvl w:val="0"/>
-          <w:numId w:val="7"/>
-        </w:numPr>
-      </w:pPr>
-      <w:r>
-        <w:t xml:space="preserve">Priority service: a checked-in customer is served at the booked time ahead of walk-ins.</w:t>
-      </w:r>
-    </w:p>
-    <w:p>
-      <w:pPr>
-        <w:pStyle w:val="ListParagraph"/>
-        <w:numPr>
-          <w:ilvl w:val="0"/>
-          <w:numId w:val="7"/>
-        </w:numPr>
-      </w:pPr>
-      <w:r>
-        <w:t xml:space="preserve">A customer not checked in 30 minutes after the slot is a no-show and the slot is released.</w:t>
+        <w:t xml:space="preserve">Crowd level shown to customers: Quiet, Moderate or Busy.</w:t>
       </w:r>
     </w:p>
     <w:p>
@@ -5483,7 +6209,7 @@
         <w:rPr>
           <w:b/>
         </w:rPr>
-        <w:t xml:space="preserve">Follow-up after a visit</w:t>
+        <w:t xml:space="preserve">Slots and capacity</w:t>
       </w:r>
     </w:p>
     <w:p>
@@ -5495,7 +6221,7 @@
         </w:numPr>
       </w:pPr>
       <w:r>
-        <w:t xml:space="preserve">A lead recorded at Complete names the product, the customer and the branch; it is assigned to the customer's relationship manager, or the branch sales officer if none.</w:t>
+        <w:t xml:space="preserve">Branch slots are 30 minutes: Monday to Friday 9:00 AM to 3:30 PM, Saturday 9:00 AM to 12:30 PM, closed Sunday and bank holidays.</w:t>
       </w:r>
     </w:p>
     <w:p>
@@ -5507,7 +6233,55 @@
         </w:numPr>
       </w:pPr>
       <w:r>
-        <w:t xml:space="preserve">The customer is contacted only with their consent, captured at booking or after the visit.</w:t>
+        <w:t xml:space="preserve">Phase 2 video slots are 30 minutes, Monday to Saturday 8:00 AM to 8:00 PM.</w:t>
+      </w:r>
+    </w:p>
+    <w:p>
+      <w:pPr>
+        <w:pStyle w:val="ListParagraph"/>
+        <w:numPr>
+          <w:ilvl w:val="0"/>
+          <w:numId w:val="8"/>
+        </w:numPr>
+      </w:pPr>
+      <w:r>
+        <w:t xml:space="preserve">Capacity per slot = EZY Meet counters × 2. A full or blocked slot is not shown.</w:t>
+      </w:r>
+    </w:p>
+    <w:p>
+      <w:pPr>
+        <w:pStyle w:val="ListParagraph"/>
+        <w:numPr>
+          <w:ilvl w:val="0"/>
+          <w:numId w:val="8"/>
+        </w:numPr>
+      </w:pPr>
+      <w:r>
+        <w:t xml:space="preserve">Booking opens 7 days ahead and closes 30 minutes before the slot.</w:t>
+      </w:r>
+    </w:p>
+    <w:p>
+      <w:pPr>
+        <w:pStyle w:val="ListParagraph"/>
+        <w:numPr>
+          <w:ilvl w:val="0"/>
+          <w:numId w:val="8"/>
+        </w:numPr>
+      </w:pPr>
+      <w:r>
+        <w:t xml:space="preserve">Priority service: a checked-in customer is served at the booked time ahead of walk-ins.</w:t>
+      </w:r>
+    </w:p>
+    <w:p>
+      <w:pPr>
+        <w:pStyle w:val="ListParagraph"/>
+        <w:numPr>
+          <w:ilvl w:val="0"/>
+          <w:numId w:val="8"/>
+        </w:numPr>
+      </w:pPr>
+      <w:r>
+        <w:t xml:space="preserve">A customer not checked in 30 minutes after the slot is a no-show and the slot is released.</w:t>
       </w:r>
     </w:p>
     <w:p>
@@ -5516,7 +6290,7 @@
         <w:rPr>
           <w:b/>
         </w:rPr>
-        <w:t xml:space="preserve">Video KYC (Phase 2, with EZY Apply)</w:t>
+        <w:t xml:space="preserve">Follow-up after a visit</w:t>
       </w:r>
     </w:p>
     <w:p>
@@ -5528,7 +6302,7 @@
         </w:numPr>
       </w:pPr>
       <w:r>
-        <w:t xml:space="preserve">Entry is from EZY Apply at its identity step, not from the EZY Meet service list.</w:t>
+        <w:t xml:space="preserve">A lead recorded at Complete names the product, the customer and the branch; it is assigned to the customer's relationship manager, or the branch sales officer if none.</w:t>
       </w:r>
     </w:p>
     <w:p>
@@ -5540,7 +6314,16 @@
         </w:numPr>
       </w:pPr>
       <w:r>
-        <w:t xml:space="preserve">Documents captured in EZY Apply are passed to the advisor; nothing is uploaded twice.</w:t>
+        <w:t xml:space="preserve">The customer is contacted only with their consent, captured at booking or after the visit.</w:t>
+      </w:r>
+    </w:p>
+    <w:p>
+      <w:pPr/>
+      <w:r>
+        <w:rPr>
+          <w:b/>
+        </w:rPr>
+        <w:t xml:space="preserve">Video KYC (Phase 2, via EZY Apply's Video KYC)</w:t>
       </w:r>
     </w:p>
     <w:p>
@@ -5548,11 +6331,11 @@
         <w:pStyle w:val="ListParagraph"/>
         <w:numPr>
           <w:ilvl w:val="0"/>
-          <w:numId w:val="9"/>
+          <w:numId w:val="10"/>
         </w:numPr>
       </w:pPr>
       <w:r>
-        <w:t xml:space="preserve">The advisor matches the live face to the NIC and selfie, and the session is recorded for audit, per CBSL KYC/CDD rules.</w:t>
+        <w:t xml:space="preserve">Entry is from EZY Apply at its identity step, not from the EZY Meet service list.</w:t>
       </w:r>
     </w:p>
     <w:p>
@@ -5560,11 +6343,11 @@
         <w:pStyle w:val="ListParagraph"/>
         <w:numPr>
           <w:ilvl w:val="0"/>
-          <w:numId w:val="9"/>
+          <w:numId w:val="10"/>
         </w:numPr>
       </w:pPr>
       <w:r>
-        <w:t xml:space="preserve">On success, EZY Apply opens the account and invites the customer to the EZY app.</w:t>
+        <w:t xml:space="preserve">Documents captured in EZY Apply are passed to the advisor; nothing is uploaded twice.</w:t>
       </w:r>
     </w:p>
     <w:p>
@@ -5572,11 +6355,92 @@
         <w:pStyle w:val="ListParagraph"/>
         <w:numPr>
           <w:ilvl w:val="0"/>
-          <w:numId w:val="9"/>
+          <w:numId w:val="10"/>
         </w:numPr>
       </w:pPr>
       <w:r>
+        <w:t xml:space="preserve">The advisor matches the live face to the NIC and selfie, and the session is recorded for audit, per CBSL KYC/CDD rules.</w:t>
+      </w:r>
+    </w:p>
+    <w:p>
+      <w:pPr>
+        <w:pStyle w:val="ListParagraph"/>
+        <w:numPr>
+          <w:ilvl w:val="0"/>
+          <w:numId w:val="10"/>
+        </w:numPr>
+      </w:pPr>
+      <w:r>
+        <w:t xml:space="preserve">On success, EZY Apply opens the account and invites the customer to the EZY app.</w:t>
+      </w:r>
+    </w:p>
+    <w:p>
+      <w:pPr>
+        <w:pStyle w:val="ListParagraph"/>
+        <w:numPr>
+          <w:ilvl w:val="0"/>
+          <w:numId w:val="10"/>
+        </w:numPr>
+      </w:pPr>
+      <w:r>
         <w:t xml:space="preserve">If verification fails, the applicant is offered a branch visit through EZY Meet with the application reference attached.</w:t>
+      </w:r>
+    </w:p>
+    <w:p>
+      <w:pPr/>
+      <w:r>
+        <w:rPr>
+          <w:b/>
+        </w:rPr>
+        <w:t xml:space="preserve">Booking on behalf (Phase 3)</w:t>
+      </w:r>
+    </w:p>
+    <w:p>
+      <w:pPr>
+        <w:pStyle w:val="ListParagraph"/>
+        <w:numPr>
+          <w:ilvl w:val="0"/>
+          <w:numId w:val="11"/>
+        </w:numPr>
+      </w:pPr>
+      <w:r>
+        <w:t xml:space="preserve">Staff book from the same slots customers see, so a booking on behalf never jumps the queue.</w:t>
+      </w:r>
+    </w:p>
+    <w:p>
+      <w:pPr>
+        <w:pStyle w:val="ListParagraph"/>
+        <w:numPr>
+          <w:ilvl w:val="0"/>
+          <w:numId w:val="11"/>
+        </w:numPr>
+      </w:pPr>
+      <w:r>
+        <w:t xml:space="preserve">The booking carries the staff ID, the branch and how the customer agreed (in branch, by phone, or in the app).</w:t>
+      </w:r>
+    </w:p>
+    <w:p>
+      <w:pPr>
+        <w:pStyle w:val="ListParagraph"/>
+        <w:numPr>
+          <w:ilvl w:val="0"/>
+          <w:numId w:val="11"/>
+        </w:numPr>
+      </w:pPr>
+      <w:r>
+        <w:t xml:space="preserve">An unconfirmed booking on behalf is held for 24 hours, then released if the customer does not confirm.</w:t>
+      </w:r>
+    </w:p>
+    <w:p>
+      <w:pPr>
+        <w:pStyle w:val="ListParagraph"/>
+        <w:numPr>
+          <w:ilvl w:val="0"/>
+          <w:numId w:val="11"/>
+        </w:numPr>
+      </w:pPr>
+      <w:r>
+        <w:t xml:space="preserve">The customer can always reschedule or cancel it in the EZY app.</w:t>
       </w:r>
     </w:p>
     <w:p>
@@ -5885,7 +6749,7 @@
     <w:p>
       <w:pPr/>
       <w:r>
-        <w:t xml:space="preserve">EZY Meet needs seven integrations at launch and one more in Phase 2; only the booking service is new.</w:t>
+        <w:t xml:space="preserve">Phase 1 needs the new booking service and six existing systems; the video platform and EZY Apply join in Phase 2.</w:t>
       </w:r>
     </w:p>
     <w:tbl>
@@ -6030,7 +6894,7 @@
           <w:p>
             <w:pPr/>
             <w:r>
-              <w:t xml:space="preserve">Customer name, home branch, products held, KYC status</w:t>
+              <w:t xml:space="preserve">Customer name, home branch, products held, KYC status; customer search for booking on behalf</w:t>
             </w:r>
           </w:p>
         </w:tc>
@@ -6159,6 +7023,41 @@
           <w:p>
             <w:pPr/>
             <w:r>
+              <w:t xml:space="preserve">SMS and push gateway</w:t>
+            </w:r>
+          </w:p>
+        </w:tc>
+        <w:tc>
+          <w:tcPr>
+            <w:tcW w:w="4920" w:type="dxa"/>
+          </w:tcPr>
+          <w:p>
+            <w:pPr/>
+            <w:r>
+              <w:t xml:space="preserve">Confirmation, reminders, changes and cancellations</w:t>
+            </w:r>
+          </w:p>
+        </w:tc>
+        <w:tc>
+          <w:tcPr>
+            <w:tcW w:w="869" w:type="dxa"/>
+          </w:tcPr>
+          <w:p>
+            <w:pPr/>
+            <w:r>
+              <w:t xml:space="preserve">1</w:t>
+            </w:r>
+          </w:p>
+        </w:tc>
+      </w:tr>
+      <w:tr>
+        <w:tc>
+          <w:tcPr>
+            <w:tcW w:w="3571" w:type="dxa"/>
+          </w:tcPr>
+          <w:p>
+            <w:pPr/>
+            <w:r>
               <w:t xml:space="preserve">Video platform</w:t>
             </w:r>
           </w:p>
@@ -6170,7 +7069,7 @@
           <w:p>
             <w:pPr/>
             <w:r>
-              <w:t xml:space="preserve">Secure rooms and recording for video calls</w:t>
+              <w:t xml:space="preserve">Secure rooms and recording for video calls and Video KYC</w:t>
             </w:r>
           </w:p>
         </w:tc>
@@ -6181,7 +7080,7 @@
           <w:p>
             <w:pPr/>
             <w:r>
-              <w:t xml:space="preserve">1</w:t>
+              <w:t xml:space="preserve">2</w:t>
             </w:r>
           </w:p>
         </w:tc>
@@ -6194,7 +7093,7 @@
           <w:p>
             <w:pPr/>
             <w:r>
-              <w:t xml:space="preserve">SMS and push gateway</w:t>
+              <w:t xml:space="preserve">EZY Apply (digital onboarding)</w:t>
             </w:r>
           </w:p>
         </w:tc>
@@ -6205,42 +7104,7 @@
           <w:p>
             <w:pPr/>
             <w:r>
-              <w:t xml:space="preserve">Confirmation, reminders, changes and cancellations</w:t>
-            </w:r>
-          </w:p>
-        </w:tc>
-        <w:tc>
-          <w:tcPr>
-            <w:tcW w:w="869" w:type="dxa"/>
-          </w:tcPr>
-          <w:p>
-            <w:pPr/>
-            <w:r>
-              <w:t xml:space="preserve">1</w:t>
-            </w:r>
-          </w:p>
-        </w:tc>
-      </w:tr>
-      <w:tr>
-        <w:tc>
-          <w:tcPr>
-            <w:tcW w:w="3571" w:type="dxa"/>
-          </w:tcPr>
-          <w:p>
-            <w:pPr/>
-            <w:r>
-              <w:t xml:space="preserve">EZY Apply (digital onboarding)</w:t>
-            </w:r>
-          </w:p>
-        </w:tc>
-        <w:tc>
-          <w:tcPr>
-            <w:tcW w:w="4920" w:type="dxa"/>
-          </w:tcPr>
-          <w:p>
-            <w:pPr/>
-            <w:r>
-              <w:t xml:space="preserve">Hand applicants to Video KYC or a branch visit, with documents and application reference</w:t>
+              <w:t xml:space="preserve">Its Video KYC step hands applicants, documents and the application reference to EZY Meet</w:t>
             </w:r>
           </w:p>
         </w:tc>
@@ -6266,7 +7130,7 @@
         <w:t xml:space="preserve">Booking record:</w:t>
       </w:r>
       <w:r>
-        <w:t xml:space="preserve"> reference, customer ID, service, channel (branch or video), branch, date and time, status, uploaded documents, created and changed by, timestamps.</w:t>
+        <w:t xml:space="preserve"> reference, customer ID, service, channel (branch or video), branch, date and time, status, uploaded documents, booked by (customer or staff ID, Phase 3), consent, created and changed by, timestamps.</w:t>
       </w:r>
     </w:p>
     <w:p>
@@ -6286,8 +7150,8 @@
         <w:tblLook w:val="04A0" w:firstRow="1" w:lastRow="0" w:firstColumn="0" w:lastColumn="0" w:noHBand="0" w:noVBand="1"/>
       </w:tblPr>
       <w:tblGrid>
-        <w:gridCol w:w="4740"/>
-        <w:gridCol w:w="4619"/>
+        <w:gridCol w:w="4604"/>
+        <w:gridCol w:w="4755"/>
       </w:tblGrid>
       <w:tr>
         <w:trPr>
@@ -6295,7 +7159,7 @@
         </w:trPr>
         <w:tc>
           <w:tcPr>
-            <w:tcW w:w="4740" w:type="dxa"/>
+            <w:tcW w:w="4604" w:type="dxa"/>
             <w:shd w:val="clear" w:color="auto" w:fill="F2F2F2"/>
           </w:tcPr>
           <w:p>
@@ -6307,7 +7171,7 @@
         </w:tc>
         <w:tc>
           <w:tcPr>
-            <w:tcW w:w="4619" w:type="dxa"/>
+            <w:tcW w:w="4755" w:type="dxa"/>
             <w:shd w:val="clear" w:color="auto" w:fill="F2F2F2"/>
           </w:tcPr>
           <w:p>
@@ -6321,7 +7185,7 @@
       <w:tr>
         <w:tc>
           <w:tcPr>
-            <w:tcW w:w="4740" w:type="dxa"/>
+            <w:tcW w:w="4604" w:type="dxa"/>
           </w:tcPr>
           <w:p>
             <w:pPr/>
@@ -6332,7 +7196,7 @@
         </w:tc>
         <w:tc>
           <w:tcPr>
-            <w:tcW w:w="4619" w:type="dxa"/>
+            <w:tcW w:w="4755" w:type="dxa"/>
           </w:tcPr>
           <w:p>
             <w:pPr/>
@@ -6345,7 +7209,7 @@
       <w:tr>
         <w:tc>
           <w:tcPr>
-            <w:tcW w:w="4740" w:type="dxa"/>
+            <w:tcW w:w="4604" w:type="dxa"/>
           </w:tcPr>
           <w:p>
             <w:pPr/>
@@ -6356,7 +7220,7 @@
         </w:tc>
         <w:tc>
           <w:tcPr>
-            <w:tcW w:w="4619" w:type="dxa"/>
+            <w:tcW w:w="4755" w:type="dxa"/>
           </w:tcPr>
           <w:p>
             <w:pPr/>
@@ -6369,7 +7233,7 @@
       <w:tr>
         <w:tc>
           <w:tcPr>
-            <w:tcW w:w="4740" w:type="dxa"/>
+            <w:tcW w:w="4604" w:type="dxa"/>
           </w:tcPr>
           <w:p>
             <w:pPr/>
@@ -6380,7 +7244,7 @@
         </w:tc>
         <w:tc>
           <w:tcPr>
-            <w:tcW w:w="4619" w:type="dxa"/>
+            <w:tcW w:w="4755" w:type="dxa"/>
           </w:tcPr>
           <w:p>
             <w:pPr/>
@@ -6393,7 +7257,7 @@
       <w:tr>
         <w:tc>
           <w:tcPr>
-            <w:tcW w:w="4740" w:type="dxa"/>
+            <w:tcW w:w="4604" w:type="dxa"/>
           </w:tcPr>
           <w:p>
             <w:pPr/>
@@ -6404,7 +7268,7 @@
         </w:tc>
         <w:tc>
           <w:tcPr>
-            <w:tcW w:w="4619" w:type="dxa"/>
+            <w:tcW w:w="4755" w:type="dxa"/>
           </w:tcPr>
           <w:p>
             <w:pPr/>
@@ -6417,7 +7281,7 @@
       <w:tr>
         <w:tc>
           <w:tcPr>
-            <w:tcW w:w="4740" w:type="dxa"/>
+            <w:tcW w:w="4604" w:type="dxa"/>
           </w:tcPr>
           <w:p>
             <w:pPr/>
@@ -6428,12 +7292,36 @@
         </w:tc>
         <w:tc>
           <w:tcPr>
-            <w:tcW w:w="4619" w:type="dxa"/>
+            <w:tcW w:w="4755" w:type="dxa"/>
           </w:tcPr>
           <w:p>
             <w:pPr/>
             <w:r>
               <w:t xml:space="preserve">Push + SMS with a new-time link</w:t>
+            </w:r>
+          </w:p>
+        </w:tc>
+      </w:tr>
+      <w:tr>
+        <w:tc>
+          <w:tcPr>
+            <w:tcW w:w="4604" w:type="dxa"/>
+          </w:tcPr>
+          <w:p>
+            <w:pPr/>
+            <w:r>
+              <w:t xml:space="preserve">Booked on your behalf (Phase 3)</w:t>
+            </w:r>
+          </w:p>
+        </w:tc>
+        <w:tc>
+          <w:tcPr>
+            <w:tcW w:w="4755" w:type="dxa"/>
+          </w:tcPr>
+          <w:p>
+            <w:pPr/>
+            <w:r>
+              <w:t xml:space="preserve">Push + SMS with confirm or decline</w:t>
             </w:r>
           </w:p>
         </w:tc>
@@ -6461,7 +7349,7 @@
         <w:pStyle w:val="ListParagraph"/>
         <w:numPr>
           <w:ilvl w:val="0"/>
-          <w:numId w:val="10"/>
+          <w:numId w:val="12"/>
         </w:numPr>
       </w:pPr>
       <w:r>
@@ -6473,7 +7361,7 @@
         <w:pStyle w:val="ListParagraph"/>
         <w:numPr>
           <w:ilvl w:val="0"/>
-          <w:numId w:val="10"/>
+          <w:numId w:val="12"/>
         </w:numPr>
       </w:pPr>
       <w:r>
@@ -6485,7 +7373,7 @@
         <w:pStyle w:val="ListParagraph"/>
         <w:numPr>
           <w:ilvl w:val="0"/>
-          <w:numId w:val="10"/>
+          <w:numId w:val="12"/>
         </w:numPr>
       </w:pPr>
       <w:r>
@@ -6497,7 +7385,7 @@
         <w:pStyle w:val="ListParagraph"/>
         <w:numPr>
           <w:ilvl w:val="0"/>
-          <w:numId w:val="10"/>
+          <w:numId w:val="12"/>
         </w:numPr>
       </w:pPr>
       <w:r>
@@ -6509,7 +7397,7 @@
         <w:pStyle w:val="ListParagraph"/>
         <w:numPr>
           <w:ilvl w:val="0"/>
-          <w:numId w:val="10"/>
+          <w:numId w:val="12"/>
         </w:numPr>
       </w:pPr>
       <w:r>
@@ -6676,7 +7564,7 @@
         <w:pStyle w:val="ListParagraph"/>
         <w:numPr>
           <w:ilvl w:val="0"/>
-          <w:numId w:val="11"/>
+          <w:numId w:val="13"/>
         </w:numPr>
       </w:pPr>
       <w:r>
@@ -6688,11 +7576,11 @@
         <w:pStyle w:val="ListParagraph"/>
         <w:numPr>
           <w:ilvl w:val="0"/>
-          <w:numId w:val="11"/>
+          <w:numId w:val="13"/>
         </w:numPr>
       </w:pPr>
       <w:r>
-        <w:t xml:space="preserve">☐ Which branches pilot first, and for how long?</w:t>
+        <w:t xml:space="preserve">☐ Which branches pilot Phase 1 first, and for how long?</w:t>
       </w:r>
     </w:p>
     <w:p>
@@ -6700,7 +7588,7 @@
         <w:pStyle w:val="ListParagraph"/>
         <w:numPr>
           <w:ilvl w:val="0"/>
-          <w:numId w:val="11"/>
+          <w:numId w:val="13"/>
         </w:numPr>
       </w:pPr>
       <w:r>
@@ -6712,7 +7600,7 @@
         <w:pStyle w:val="ListParagraph"/>
         <w:numPr>
           <w:ilvl w:val="0"/>
-          <w:numId w:val="11"/>
+          <w:numId w:val="13"/>
         </w:numPr>
       </w:pPr>
       <w:r>
@@ -6724,11 +7612,11 @@
         <w:pStyle w:val="ListParagraph"/>
         <w:numPr>
           <w:ilvl w:val="0"/>
-          <w:numId w:val="11"/>
+          <w:numId w:val="13"/>
         </w:numPr>
       </w:pPr>
       <w:r>
-        <w:t xml:space="preserve">☐ Which video platform, and where recordings are kept?</w:t>
+        <w:t xml:space="preserve">☐ Does the queue system accept priority tokens from EZY Meet?</w:t>
       </w:r>
     </w:p>
     <w:p>
@@ -6736,11 +7624,11 @@
         <w:pStyle w:val="ListParagraph"/>
         <w:numPr>
           <w:ilvl w:val="0"/>
-          <w:numId w:val="11"/>
+          <w:numId w:val="13"/>
         </w:numPr>
       </w:pPr>
       <w:r>
-        <w:t xml:space="preserve">☐ Does the queue system accept priority tokens from EZY Meet?</w:t>
+        <w:t xml:space="preserve">☐ Which CRM receives follow-up leads, and who owns them?</w:t>
       </w:r>
     </w:p>
     <w:p>
@@ -6748,11 +7636,11 @@
         <w:pStyle w:val="ListParagraph"/>
         <w:numPr>
           <w:ilvl w:val="0"/>
-          <w:numId w:val="11"/>
+          <w:numId w:val="13"/>
         </w:numPr>
       </w:pPr>
       <w:r>
-        <w:t xml:space="preserve">☐ Which CRM receives follow-up leads, and who owns them?</w:t>
+        <w:t xml:space="preserve">☐ Phase 2: how EZY Apply's Video KYC hands over applicants and documents (API or shared service); which video platform, and where recordings are kept.</w:t>
       </w:r>
     </w:p>
     <w:p>
@@ -6760,11 +7648,23 @@
         <w:pStyle w:val="ListParagraph"/>
         <w:numPr>
           <w:ilvl w:val="0"/>
-          <w:numId w:val="11"/>
+          <w:numId w:val="13"/>
         </w:numPr>
       </w:pPr>
       <w:r>
-        <w:t xml:space="preserve">☐ Phase 2: how EZY Apply hands over applicants and documents (API or shared service), and its target date.</w:t>
+        <w:t xml:space="preserve">☐ Phase 3: which staff roles may book on behalf, and is a phone agreement enough consent?</w:t>
+      </w:r>
+    </w:p>
+    <w:p>
+      <w:pPr>
+        <w:pStyle w:val="ListParagraph"/>
+        <w:numPr>
+          <w:ilvl w:val="0"/>
+          <w:numId w:val="13"/>
+        </w:numPr>
+      </w:pPr>
+      <w:r>
+        <w:t xml:space="preserve">☐ Target dates for Phases 2 and 3.</w:t>
       </w:r>
     </w:p>
     <w:p>
@@ -6781,7 +7681,7 @@
         <w:pStyle w:val="ListParagraph"/>
         <w:numPr>
           <w:ilvl w:val="0"/>
-          <w:numId w:val="12"/>
+          <w:numId w:val="14"/>
         </w:numPr>
       </w:pPr>
       <w:r>
@@ -6804,7 +7704,7 @@
         <w:pStyle w:val="ListParagraph"/>
         <w:numPr>
           <w:ilvl w:val="0"/>
-          <w:numId w:val="12"/>
+          <w:numId w:val="14"/>
         </w:numPr>
       </w:pPr>
       <w:r>
@@ -6824,7 +7724,7 @@
         <w:pStyle w:val="ListParagraph"/>
         <w:numPr>
           <w:ilvl w:val="0"/>
-          <w:numId w:val="12"/>
+          <w:numId w:val="14"/>
         </w:numPr>
       </w:pPr>
       <w:r>
@@ -7022,10 +7922,7 @@
     <w:abstractNumId w:val="0"/>
   </w:num>
   <w:num w:numId="5">
-    <w:abstractNumId w:val="1"/>
-    <w:lvlOverride w:ilvl="0">
-      <w:startOverride w:val="1"/>
-    </w:lvlOverride>
+    <w:abstractNumId w:val="0"/>
   </w:num>
   <w:num w:numId="6">
     <w:abstractNumId w:val="1"/>
@@ -7034,7 +7931,10 @@
     </w:lvlOverride>
   </w:num>
   <w:num w:numId="7">
-    <w:abstractNumId w:val="0"/>
+    <w:abstractNumId w:val="1"/>
+    <w:lvlOverride w:ilvl="0">
+      <w:startOverride w:val="1"/>
+    </w:lvlOverride>
   </w:num>
   <w:num w:numId="8">
     <w:abstractNumId w:val="0"/>
@@ -7049,6 +7949,12 @@
     <w:abstractNumId w:val="0"/>
   </w:num>
   <w:num w:numId="12">
+    <w:abstractNumId w:val="0"/>
+  </w:num>
+  <w:num w:numId="13">
+    <w:abstractNumId w:val="0"/>
+  </w:num>
+  <w:num w:numId="14">
     <w:abstractNumId w:val="0"/>
   </w:num>
 </w:numbering>

</xml_diff>